<commit_message>
TCC I: versão 25 — apud do Réti e do Frisch na Seção 2.2
- Réti citado via Peyerl e Barros (2017) e Almada (2008)
- crítica de Frisch (1984, p. 22-23) via Almada (2008); "crítica
  recorrente" substituída pela crítica documentada
- referências ALMADA (2008) e PEYERL; BARROS (2017)

Co-Authored-By: Claude Opus 5.5 <noreply@anthropic.com>
Claude-Session: https://claude.ai/code/session_01Kohu9wzEiwkMfwNCWvySGw
</commit_message>
<xml_diff>
--- a/docs/tcc/TCC-I.docx
+++ b/docs/tcc/TCC-I.docx
@@ -3389,7 +3389,7 @@
         <w:t>developing variation</w:t>
       </w:r>
       <w:r>
-        <w:t xml:space="preserve"> (SCHOENBERG, 1967), segundo a qual uma célula temática básica se desdobra e se transforma ao longo da obra sem perder sua identidade — processo que Réti (1951) já caracterizava como subjacente à construção temática de obras do repertório tonal, e que Frisch (1984) demonstrou de forma sistemática ao analisar dezoito obras de Brahms.</w:t>
+        <w:t xml:space="preserve"> (SCHOENBERG, 1967), segundo a qual uma célula temática básica se desdobra e se transforma ao longo da obra sem perder sua identidade — processo que Réti (1951 apud PEYERL; BARROS, 2017) já caracterizava como subjacente à construção temática de obras do repertório tonal, e que Frisch (1984) examinou de forma sistemática em dezoito obras de Brahms.</w:t>
       </w:r>
     </w:p>
     <w:p>
@@ -4224,23 +4224,23 @@
       <w:r>
         <w:t xml:space="preserve"> (1951), leva a intuição de Schoenberg a um método analítico sistemático. Para Réti, a diversidade temática na superfície de uma obra — os diferentes temas de uma sinfonia, por exemplo — </w:t>
         <w:lastRenderedPageBreak/>
-        <w:t>esconde uma unidade motívica subjacente: os vários movimentos de uma obra derivariam, em sua leitura, de uma mesma ideia germinal, com o compositor preservando a substância dessa ideia por trás de uma aparência sempre renovada. O repertório de transformações que Réti reconhece entre essas formas já inclui inversão e retrogradação, além de uma operação própria que chama de interversão: o reagrupamento das notas de uma célula em outra ordem — transformação que este trabalho não se propõe a tratar.</w:t>
-      </w:r>
-    </w:p>
-    <w:p>
-      <w:pPr>
-        <w:pStyle w:val="TE-Normal"/>
-      </w:pPr>
-      <w:r>
-        <w:t>O método de Réti para demonstrar essa unidade, porém, tornou-se alvo de crítica recorrente na literatura teórico-musical: dependia fortemente da escolha do próprio analista sobre quais notas de um tema correspondiam à célula motívica básica e quais eram ornamentação dispensável — um julgamento sem critério objetivo declarado, e por isso pouco reprodutível. Frisch (1984) nomeia esse problema diretamente ao revisar a tradição analítica schoenberguiana: parte das análises de Réti isolaria alturas de seu contexto rítmico e harmônico, relegando a segundo plano tudo o que não se encaixasse na forma que o analista já pretendia demonstrar.</w:t>
-      </w:r>
-    </w:p>
-    <w:p>
-      <w:pPr>
-        <w:pStyle w:val="TE-Normal"/>
-      </w:pPr>
-      <w:r>
-        <w:t xml:space="preserve">É em resposta a essa fragilidade metodológica que Frisch (1984) propõe um uso mais disciplinado do conceito schoenberguiano de </w:t>
+        <w:t>esconde uma unidade motívica subjacente: os vários movimentos de uma obra derivariam, em sua leitura, de uma mesma ideia germinal, com o compositor preservando a substância dessa ideia por trás de uma aparência sempre renovada (RÉTI, 1951 apud ALMADA, 2008; PEYERL; BARROS, 2017). O repertório de transformações que Réti reconhece entre essas formas já inclui inversão e retrogradação, além de uma operação própria que chama de interversão: o reagrupamento das notas de uma célula em outra ordem (RÉTI, 1951, p. 68, 72 apud PEYERL; BARROS, 2017) — transformação que este trabalho não se propõe a tratar.</w:t>
+      </w:r>
+    </w:p>
+    <w:p>
+      <w:pPr>
+        <w:pStyle w:val="TE-Normal"/>
+      </w:pPr>
+      <w:r>
+        <w:t>O método de Réti para demonstrar essa unidade, porém, foi alvo de críticas. Frisch (1984, p. 22-23 apud ALMADA, 2008) considera superficiais parte de suas análises, por levarem em conta apenas as alturas e os contornos intervalares dos temas, desvinculados de seu contexto rítmico e harmônico. Essa fragilidade se liga a outra, que é a que mais interessa a este trabalho: a decisão sobre quais notas de um tema pertencem à célula motívica básica e quais são ornamentação cabe ao próprio analista, sem um critério declarado que permita reproduzi-la.</w:t>
+      </w:r>
+    </w:p>
+    <w:p>
+      <w:pPr>
+        <w:pStyle w:val="TE-Normal"/>
+      </w:pPr>
+      <w:r>
+        <w:t xml:space="preserve">Frisch (1984), por sua vez, aplica o conceito schoenberguiano de </w:t>
       </w:r>
       <w:r>
         <w:rPr>
@@ -4250,7 +4250,7 @@
         <w:t>developing variation</w:t>
       </w:r>
       <w:r>
-        <w:t>, aplicando-o a dezoito obras de Brahms com maior rigor analítico e atenção ao contexto harmônico e rítmico que Réti costumava deixar de lado. De Réti a Frisch, portanto, uma análise intuitiva dá lugar a uma análise mais disciplinada da transformação motívica — caminho que este trabalho continua, no sentido de que os critérios de pontuação e extensão da heurística proposta (Capítulo 5) substituem o julgamento subjetivo do analista por regras explícitas e reprodutíveis.</w:t>
+        <w:t xml:space="preserve"> a dezoito obras de Brahms, com a atenção ao contexto harmônico e rítmico que ele próprio cobra de Réti. De Réti a Frisch, portanto, uma análise intuitiva dá lugar a uma análise mais disciplinada da transformação motívica — caminho que este trabalho continua, no sentido de que os critérios de pontuação e extensão da heurística proposta (Capítulo 5) substituem o julgamento subjetivo do analista por regras explícitas e reprodutíveis.</w:t>
       </w:r>
     </w:p>
     <w:p>
@@ -4261,7 +4261,7 @@
         <w:rPr>
           <w:highlight w:val="yellow"/>
         </w:rPr>
-        <w:t>[CONFIRMAR COM COORIENTADOR: a caracterização de Réti (1951) acima se apoia em fontes secundárias — sem acesso direto ao texto primário —, assim como a crítica de Frisch a Réti resumida logo acima; e a decisão de excluir explicitamente a interversão do escopo (mencionada no parágrafo anterior) ainda não foi validada com a orientação]</w:t>
+        <w:t>[CONFIRMAR COM COORIENTADOR: a decisão de excluir explicitamente a interversão do escopo ainda não foi validada com a orientação. LER ANTES DA ENTREGA: Peyerl e Barros (2017, Seção 4) e Almada (2008, nota 7), que sustentam os apud desta seção; se houver acesso ao Frisch (1984, p. 22-23), trocar o apud por citação direta]</w:t>
       </w:r>
     </w:p>
     <w:p>
@@ -11377,6 +11377,24 @@
     <w:p>
       <w:pPr>
         <w:pStyle w:val="PT-Referencias"/>
+      </w:pPr>
+      <w:r>
+        <w:t xml:space="preserve">ALMADA, C. O conceito de variação em desenvolvimento no primeiro movimento da Sonata para Piano op. 2/1, de Beethoven. </w:t>
+      </w:r>
+      <w:r>
+        <w:rPr>
+          <w:b/>
+          <w:bCs/>
+        </w:rPr>
+        <w:t xml:space="preserve">Música Hodie</w:t>
+      </w:r>
+      <w:r>
+        <w:t xml:space="preserve">, v. 8, n. 2, p. 83-94, 2008.</w:t>
+      </w:r>
+    </w:p>
+    <w:p>
+      <w:pPr>
+        <w:pStyle w:val="PT-Referencias"/>
         <w:rPr>
           <w:lang w:val="en-US"/>
         </w:rPr>
@@ -11900,6 +11918,24 @@
           <w:lang w:val="en-US"/>
         </w:rPr>
         <w:t>, v. 48, n. 3, p. 443-453, 1970.</w:t>
+      </w:r>
+    </w:p>
+    <w:p>
+      <w:pPr>
+        <w:pStyle w:val="PT-Referencias"/>
+      </w:pPr>
+      <w:r>
+        <w:t xml:space="preserve">PEYERL, K.; BARROS, G. S. de. Sonata nº 1 para piano de Edino Krieger: análise formal e motívica do primeiro movimento. </w:t>
+      </w:r>
+      <w:r>
+        <w:rPr>
+          <w:b/>
+          <w:bCs/>
+        </w:rPr>
+        <w:t xml:space="preserve">Revista Vórtex</w:t>
+      </w:r>
+      <w:r>
+        <w:t xml:space="preserve">, Curitiba, v. 5, n. 2, p. 1-23, 2017.</w:t>
       </w:r>
     </w:p>
     <w:p>

</xml_diff>

<commit_message>
TCC I: versão 26 — estrutura do template novo (2026 v1)
- Cap. 1: 1.1 Contextualização; Delimitação do Escopo incorporada à 1.2;
  1.5 Procedimentos Metodológicos (classificação com abordagem, segundo
  Prodanov e Freitas, 2013, e etapas); 1.6 Estrutura reescrita
- antigo Cap. 6 (6.2 a 6.5) movido para 5.6 Planejamento da Avaliação
- notas de ADAPTAÇÃO removidas do Cap. 5
- novo Cap. 7 Orçamento; Cronograma passa a ser o Cap. 6
- remissões renumeradas; nota 3 com o caminho do script confirmado

Co-Authored-By: Claude Opus 5.5 <noreply@anthropic.com>
Claude-Session: https://claude.ai/code/session_01Kohu9wzEiwkMfwNCWvySGw
</commit_message>
<xml_diff>
--- a/docs/tcc/TCC-I.docx
+++ b/docs/tcc/TCC-I.docx
@@ -3348,6 +3348,14 @@
     </w:p>
     <w:p>
       <w:pPr>
+        <w:pStyle w:val="T2-TituloSecundario"/>
+      </w:pPr>
+      <w:r>
+        <w:t>Contextualização</w:t>
+      </w:r>
+    </w:p>
+    <w:p>
+      <w:pPr>
         <w:pStyle w:val="TE-Normal"/>
       </w:pPr>
       <w:r>
@@ -3525,316 +3533,8 @@
         <w:t>ad hoc</w:t>
       </w:r>
       <w:r>
-        <w:t xml:space="preserve"> pelo próprio autor. A ênfase do TCC I recai sobre a fundamentação teórica e o desenho do método de alinhamento; a implementação do protótipo e a aplicação preliminar dos critérios de avaliação estão previstas para o TCC II.</w:t>
-      </w:r>
-    </w:p>
-    <w:p>
-      <w:pPr>
-        <w:pStyle w:val="T2-TituloSecundario"/>
-      </w:pPr>
-      <w:bookmarkStart w:id="20" w:name="__RefHeading___Toc1050_1503872338"/>
-      <w:bookmarkStart w:id="21" w:name="_Toc238404364"/>
-      <w:bookmarkStart w:id="22" w:name="_Toc242031496"/>
-      <w:bookmarkEnd w:id="20"/>
-      <w:r>
-        <w:t>Objetivos</w:t>
-      </w:r>
-      <w:bookmarkEnd w:id="21"/>
-      <w:bookmarkEnd w:id="22"/>
-    </w:p>
-    <w:p>
-      <w:pPr>
-        <w:pStyle w:val="T3-TituloTerciario"/>
-        <w:ind w:left="0"/>
-      </w:pPr>
-      <w:bookmarkStart w:id="23" w:name="__RefHeading___Toc1056_1503872338"/>
-      <w:bookmarkStart w:id="24" w:name="_Toc238404365"/>
-      <w:bookmarkStart w:id="25" w:name="_Toc242031497"/>
-      <w:bookmarkEnd w:id="23"/>
-      <w:r>
-        <w:t>Objetivo geral</w:t>
-      </w:r>
-      <w:bookmarkEnd w:id="24"/>
-      <w:bookmarkEnd w:id="25"/>
-    </w:p>
-    <w:p>
-      <w:pPr>
-        <w:pStyle w:val="TE-Normal"/>
-      </w:pPr>
-      <w:r>
-        <w:t>Desenvolver e implementar, em um protótipo de software, um método para identificação de correspondências motívicas entre diferentes versões simbólicas de uma mesma composição musical, tolerante a transformações como transposição, inversão, retrogradação e variação rítmica, por meio de uma heurística de alinhamento de sequências inspirada no BLAST (</w:t>
-      </w:r>
-      <w:r>
-        <w:rPr>
-          <w:i/>
-          <w:iCs/>
-        </w:rPr>
-        <w:t>seed-and-extend</w:t>
-      </w:r>
-      <w:r>
-        <w:t>), tendo como corpus de estudo os corais a quatro vozes de J. S. Bach, com aplicação voltada à preparação de edições críticas e à curadoria de acervos digitais de partituras simbólicas.</w:t>
-      </w:r>
-    </w:p>
-    <w:p>
-      <w:pPr>
-        <w:pStyle w:val="T3-TituloTerciario"/>
-        <w:ind w:left="0"/>
-      </w:pPr>
-      <w:bookmarkStart w:id="26" w:name="__RefHeading___Toc1054_1503872338"/>
-      <w:bookmarkStart w:id="27" w:name="_Toc238404366"/>
-      <w:bookmarkStart w:id="28" w:name="_Toc242031498"/>
-      <w:bookmarkEnd w:id="26"/>
-      <w:commentRangeStart w:id="29"/>
-      <w:commentRangeStart w:id="30"/>
-      <w:r>
-        <w:t>Objetivos específicos</w:t>
-      </w:r>
-      <w:bookmarkEnd w:id="27"/>
-      <w:commentRangeEnd w:id="29"/>
-      <w:commentRangeEnd w:id="30"/>
-      <w:r>
-        <w:commentReference w:id="29"/>
-        <w:commentReference w:id="30"/>
-      </w:r>
-      <w:bookmarkEnd w:id="28"/>
-    </w:p>
-    <w:p>
-      <w:pPr>
-        <w:pStyle w:val="TE-Alnea"/>
-        <w:tabs>
-          <w:tab w:val="left" w:pos="1369"/>
-        </w:tabs>
-        <w:ind w:left="1369"/>
-      </w:pPr>
-      <w:r>
-        <w:t>revisar a fundamentação teórico-musical sobre transformação motívica (</w:t>
-      </w:r>
-      <w:r>
-        <w:rPr>
-          <w:i/>
-          <w:iCs/>
-        </w:rPr>
-        <w:t>Grundgestalt</w:t>
-      </w:r>
-      <w:r>
-        <w:t xml:space="preserve">, </w:t>
-      </w:r>
-      <w:r>
-        <w:rPr>
-          <w:i/>
-          <w:iCs/>
-        </w:rPr>
-        <w:t>developing variation</w:t>
-      </w:r>
-      <w:r>
-        <w:t>) e os métodos computacionais de alinhamento de sequências e de descoberta de padrões musicais, situando o método proposto em relação aos trabalhos existentes;</w:t>
-      </w:r>
-    </w:p>
-    <w:p>
-      <w:pPr>
-        <w:pStyle w:val="TE-Alnea"/>
-        <w:tabs>
-          <w:tab w:val="left" w:pos="1369"/>
-        </w:tabs>
-        <w:ind w:left="1369"/>
-      </w:pPr>
-      <w:r>
-        <w:t>especificar uma representação simbólica dos motivos musicais adequada à aplicação das transformações consideradas (transposição, inversão, retrogradação, variação rítmica) e à comparação entre versões;</w:t>
-      </w:r>
-    </w:p>
-    <w:p>
-      <w:pPr>
-        <w:pStyle w:val="TE-Alnea"/>
-        <w:tabs>
-          <w:tab w:val="left" w:pos="1369"/>
-        </w:tabs>
-        <w:ind w:left="1369"/>
-      </w:pPr>
-      <w:r>
-        <w:t xml:space="preserve">adaptar a heurística </w:t>
-      </w:r>
-      <w:r>
-        <w:rPr>
-          <w:i/>
-          <w:iCs/>
-        </w:rPr>
-        <w:t>seed-and-extend</w:t>
-      </w:r>
-      <w:r>
-        <w:t>, originária da bioinformática, ao domínio simbólico musical, definindo os critérios de pontuação e de extensão do alinhamento;</w:t>
-      </w:r>
-    </w:p>
-    <w:p>
-      <w:pPr>
-        <w:pStyle w:val="TE-Alnea"/>
-        <w:tabs>
-          <w:tab w:val="left" w:pos="1369"/>
-        </w:tabs>
-        <w:ind w:left="1369"/>
-      </w:pPr>
-      <w:r>
-        <w:t>modelar um protótipo de software que implemente o método — requisitos, casos de uso, componentes e parâmetros;</w:t>
-      </w:r>
-    </w:p>
-    <w:p>
-      <w:pPr>
-        <w:pStyle w:val="TE-Alnea"/>
-        <w:tabs>
-          <w:tab w:val="left" w:pos="1369"/>
-        </w:tabs>
-        <w:ind w:left="1369"/>
-      </w:pPr>
-      <w:r>
-        <w:lastRenderedPageBreak/>
-        <w:t>propor critérios objetivos para avaliação das correspondências motívicas identificadas pelo método;</w:t>
-      </w:r>
-    </w:p>
-    <w:p>
-      <w:pPr>
-        <w:pStyle w:val="TE-Alnea"/>
-        <w:tabs>
-          <w:tab w:val="left" w:pos="1369"/>
-        </w:tabs>
-        <w:ind w:left="1369"/>
-      </w:pPr>
-      <w:r>
-        <w:t>implementar o protótipo modelado, em linguagem Python, com a biblioteca music21 (CUTHBERT; ARIZA, 2010);</w:t>
-      </w:r>
-    </w:p>
-    <w:p>
-      <w:pPr>
-        <w:pStyle w:val="TE-Alnea"/>
-        <w:tabs>
-          <w:tab w:val="left" w:pos="1369"/>
-        </w:tabs>
-        <w:ind w:left="1369"/>
-      </w:pPr>
-      <w:r>
-        <w:t>aplicar preliminarmente os critérios de avaliação aos dois conjuntos de teste descritos no Capítulo 6, comparando o método com a referência de alinhamento exato de Smith-Waterman.</w:t>
-      </w:r>
-    </w:p>
-    <w:p>
-      <w:pPr>
-        <w:pStyle w:val="TE-Normal"/>
-      </w:pPr>
-      <w:r>
-        <w:t xml:space="preserve">Os objetivos específicos de </w:t>
-      </w:r>
-      <w:r>
-        <w:rPr>
-          <w:i/>
-          <w:iCs/>
-        </w:rPr>
-        <w:t>a</w:t>
-      </w:r>
-      <w:r>
-        <w:t xml:space="preserve"> a </w:t>
-      </w:r>
-      <w:r>
-        <w:rPr>
-          <w:i/>
-          <w:iCs/>
-        </w:rPr>
-        <w:t>e</w:t>
-      </w:r>
-      <w:r>
-        <w:t xml:space="preserve"> são desenvolvidos no TCC I, objeto deste documento; os objetivos </w:t>
-      </w:r>
-      <w:r>
-        <w:rPr>
-          <w:i/>
-          <w:iCs/>
-        </w:rPr>
-        <w:t>f</w:t>
-      </w:r>
-      <w:r>
-        <w:t xml:space="preserve"> e </w:t>
-      </w:r>
-      <w:r>
-        <w:rPr>
-          <w:i/>
-          <w:iCs/>
-        </w:rPr>
-        <w:t>g</w:t>
-      </w:r>
-      <w:r>
-        <w:t>, no TCC II, conforme o cronograma apresentado no Capítulo 7.</w:t>
-      </w:r>
-    </w:p>
-    <w:p>
-      <w:pPr>
-        <w:pStyle w:val="TE-Normal"/>
-        <w:ind w:firstLine="0"/>
-      </w:pPr>
-    </w:p>
-    <w:p>
-      <w:pPr>
-        <w:pStyle w:val="T2-TituloSecundario"/>
-      </w:pPr>
-      <w:bookmarkStart w:id="31" w:name="__RefHeading___Toc1048_1503872338"/>
-      <w:bookmarkStart w:id="32" w:name="_Toc238404367"/>
-      <w:bookmarkStart w:id="33" w:name="_Toc242031499"/>
-      <w:bookmarkEnd w:id="31"/>
-      <w:r>
-        <w:t>Justificativa</w:t>
-      </w:r>
-      <w:bookmarkEnd w:id="32"/>
-      <w:bookmarkEnd w:id="33"/>
-    </w:p>
-    <w:p>
-      <w:pPr>
-        <w:pStyle w:val="TE-Normal"/>
-      </w:pPr>
-      <w:r>
-        <w:t>Reconhecer quando um motivo reaparece, transformado, em outra versão de uma composição musical tem relevância tanto para a pesquisa em ciência da computação aplicada à música quanto para a prática da análise musical assistida por computador.</w:t>
-      </w:r>
-    </w:p>
-    <w:p>
-      <w:pPr>
-        <w:pStyle w:val="TE-Normal"/>
-      </w:pPr>
-      <w:r>
-        <w:t xml:space="preserve">Do ponto de vista da musicologia, comparar versões de uma mesma obra (diferentes edições, arranjos ou revisões autorais) é uma tarefa recorrente na crítica textual musical (a comparação sistemática de fontes de uma obra para reconstituir ou documentar sua transmissão), mas que, no nível da identidade motívica, ainda depende em grande parte do julgamento e da disponibilidade de tempo do analista, já que as ferramentas computacionais disponíveis operam sobretudo no nível notacional, como se discute no Capítulo 4. O próprio corpus utilizado neste trabalho ilustra essa relevância prática. Os corais a quatro vozes de Bach chegaram até nós por duas vias distintas — parte transmitida dentro de obras maiores, como cantatas e paixões, muitas vezes em autógrafos do compositor, e parte preservada apenas em coletâneas organizadas postumamente. Entre essas fontes, há casos documentados de uma mesma harmonização registrada em tonalidades diferentes: o coral que encerra a cantata BWV 30, por exemplo, está em lá maior na partitura da cantata e em sol maior na coleção organizada por C. P. E. Bach e publicada pela Breitkopf (DAHN, 2017). Sem apoio computacional, esse tipo de transposição entre fontes só se estabelece pela comparação manual de uma fonte com a outra</w:t>
-      </w:r>
-      <w:r>
-        <w:rPr>
-          <w:highlight w:val="yellow"/>
-        </w:rPr>
-        <w:t xml:space="preserve"> [PREFERIR FONTE ACADÊMICA: o levantamento de Dahn remete ao relatório crítico da Neue Bach-Ausgabe, NBA III/2.2 — perguntar ao coorientador]</w:t>
-      </w:r>
-      <w:r>
-        <w:t>. Um método automatizado de alinhamento tolerante a esse tipo de transformação teria aplicação direta para pesquisadores e editores envolvidos na preparação de edições críticas dos corais de Bach, bem como para curadores de acervos digitais que reúnem diferentes edições e fontes de uma mesma obra.</w:t>
-      </w:r>
-    </w:p>
-    <w:p>
-      <w:pPr>
-        <w:pStyle w:val="TE-Normal"/>
-      </w:pPr>
-      <w:r>
-        <w:t>Do ponto de vista computacional, o problema é relevante porque leva heurísticas de alinhamento consolidadas na bioinformática a uma tarefa não tratada nos trabalhos consultados. A analogia entre sequências biológicas e musicais não é nova: o BLAST (ALTSCHUL et al., 1990) já foi adaptado à busca de padrões e à classificação de melodias (KILIAN; HOOS, 2004; BOUNTOURIDIS et al., 2017). Essas adaptações, porém, respondem a perguntas de recuperação e classificação. Aplicar a mesma lógica, de busca por âncoras seguida de extensão tolerante a diferenças, à correspondência motívica entre versões de uma mesma obra, com as transformações explicitamente modeladas e avaliadas, estende essa analogia a um problema diferente e contribui especificamente para a musicologia computacional.</w:t>
-      </w:r>
-    </w:p>
-    <w:p>
-      <w:pPr>
-        <w:pStyle w:val="TE-Normal"/>
-      </w:pPr>
-      <w:r>
-        <w:t>Por fim, a tolerância a transformações aproxima o método da forma como a correspondência motívica é reconhecida na prática, embora com uma distinção importante entre o ouvinte e o analista. A percepção melódica opera sobre relações entre notas, e não sobre a identidade exata de cada nota (NARMOUR, 1990), e por isso um trecho transposto, que preserva essas relações, tende a ser reconhecido como o mesmo trecho. Para as demais transformações, a evidência é mais restrita. Em experimentos com melodias curtas, Dowling (1972) observou que ouvintes reconhecem inversões, retrógrados e retrógrados da inversão acima do acaso, mas com dificuldade crescente nessa ordem. O método proposto não pretende, portanto, modelar o que um ouvinte percebe. Pretende apoiar o analista, que reconhece essas relações pela leitura da partitura, tornando explícitas e verificáveis correspondências que um método restrito a repetições literais deixaria de fora.</w:t>
-      </w:r>
-    </w:p>
-    <w:p>
-      <w:pPr>
-        <w:pStyle w:val="T2-TituloSecundario"/>
-      </w:pPr>
-      <w:bookmarkStart w:id="34" w:name="__RefHeading___Toc1046_1503872338"/>
-      <w:bookmarkStart w:id="35" w:name="_Toc238404368"/>
-      <w:bookmarkStart w:id="36" w:name="_Toc242031500"/>
-      <w:bookmarkEnd w:id="34"/>
-      <w:r>
-        <w:t>Delimitação do Escopo</w:t>
-      </w:r>
-      <w:bookmarkEnd w:id="35"/>
-      <w:bookmarkEnd w:id="36"/>
+        <w:t xml:space="preserve"> pelo próprio autor.</w:t>
+      </w:r>
     </w:p>
     <w:p>
       <w:pPr>
@@ -3939,7 +3639,7 @@
       <w:r>
         <w:t xml:space="preserve">O método deve tolerar, no nível motívico, as diferenças mais prováveis entre versões de uma mesma obra: transposição, variação rítmica e inserção ou remoção de notas. Como generalidade, deve tolerar também inversão e retrogradação, transformações relevantes quando uma versão é um arranjo ou uma reelaboração da </w:t>
         <w:lastRenderedPageBreak/>
-        <w:t xml:space="preserve">outra, e não uma edição. Nesta etapa do trabalho, prioriza-se a fundamentação teórica, a especificação da representação simbólica dos motivos e o desenho da heurística de alinhamento; a estratégia concreta de construção dos pares de versões utilizados nos testes — seja a partir de variantes documentadas na tradição de fontes dos corais, de transformações geradas programaticamente sobre o corpus, de harmonizações diferentes de uma mesma melodia presentes no próprio corpus, ou de uma combinação dessas fontes — é detalhada no capítulo de Procedimentos Metodológicos. Para os fins deste trabalho, o termo </w:t>
+        <w:t xml:space="preserve">outra, e não uma edição. Nesta etapa do trabalho, prioriza-se a fundamentação teórica, a especificação da representação simbólica dos motivos e o desenho da heurística de alinhamento; a estratégia concreta de construção dos pares de versões utilizados nos testes — seja a partir de variantes documentadas na tradição de fontes dos corais, de transformações geradas programaticamente sobre o corpus, de harmonizações diferentes de uma mesma melodia presentes no próprio corpus, ou de uma combinação dessas fontes — é detalhada na Seção 5.6.2. Para os fins deste trabalho, o termo </w:t>
       </w:r>
       <w:r>
         <w:rPr>
@@ -3960,25 +3660,44 @@
         </w:rPr>
       </w:pPr>
       <w:r>
-        <w:t>A implementação do protótipo e a aplicação preliminar dos critérios de avaliação sobre o corpus não fazem parte do TCC I, estando previstas para o TCC II, conforme o Capítulo 7. Não estão previstos neste escopo: o processamento de áudio ou de imagens de partitura sem codificação simbólica prévia; e a aplicação do método a repertórios distintos dos corais de Bach. </w:t>
+        <w:t>A implementação do protótipo e a aplicação preliminar dos critérios de avaliação sobre o corpus não fazem parte do TCC I, estando previstas para o TCC II, conforme o Capítulo 6. Não estão previstos neste escopo: o processamento de áudio ou de imagens de partitura sem codificação simbólica prévia; e a aplicação do método a repertórios distintos dos corais de Bach. </w:t>
       </w:r>
     </w:p>
     <w:p>
       <w:pPr>
         <w:pStyle w:val="T2-TituloSecundario"/>
       </w:pPr>
-      <w:bookmarkStart w:id="38" w:name="_Toc242031501"/>
-      <w:r>
-        <w:t>Estrutura do Trabalho</w:t>
-      </w:r>
-      <w:bookmarkEnd w:id="38"/>
-    </w:p>
-    <w:p>
-      <w:pPr>
-        <w:pStyle w:val="TE-Normal"/>
-      </w:pPr>
-      <w:r>
-        <w:t xml:space="preserve">Além desta introdução, o trabalho está organizado em seis capítulos. O Capítulo 2 revisa a fundamentação teórico-musical da transformação motívica, de Schoenberg a Narmour. O Capítulo 3 apresenta os fundamentos computacionais do alinhamento de sequências, do algoritmo de Needleman-Wunsch à heurística do BLAST. O Capítulo 4 examina os trabalhos relacionados em música simbólica e posiciona a contribuição deste trabalho em relação a eles. O Capítulo 5 descreve a modelagem do protótipo que adapta a heurística </w:t>
+      <w:bookmarkStart w:id="20" w:name="__RefHeading___Toc1050_1503872338"/>
+      <w:bookmarkStart w:id="21" w:name="_Toc238404364"/>
+      <w:bookmarkStart w:id="22" w:name="_Toc242031496"/>
+      <w:bookmarkEnd w:id="20"/>
+      <w:r>
+        <w:t>Objetivos</w:t>
+      </w:r>
+      <w:bookmarkEnd w:id="21"/>
+      <w:bookmarkEnd w:id="22"/>
+    </w:p>
+    <w:p>
+      <w:pPr>
+        <w:pStyle w:val="T3-TituloTerciario"/>
+        <w:ind w:left="0"/>
+      </w:pPr>
+      <w:bookmarkStart w:id="23" w:name="__RefHeading___Toc1056_1503872338"/>
+      <w:bookmarkStart w:id="24" w:name="_Toc238404365"/>
+      <w:bookmarkStart w:id="25" w:name="_Toc242031497"/>
+      <w:bookmarkEnd w:id="23"/>
+      <w:r>
+        <w:t>Objetivo geral</w:t>
+      </w:r>
+      <w:bookmarkEnd w:id="24"/>
+      <w:bookmarkEnd w:id="25"/>
+    </w:p>
+    <w:p>
+      <w:pPr>
+        <w:pStyle w:val="TE-Normal"/>
+      </w:pPr>
+      <w:r>
+        <w:t>Desenvolver e implementar, em um protótipo de software, um método para identificação de correspondências motívicas entre diferentes versões simbólicas de uma mesma composição musical, tolerante a transformações como transposição, inversão, retrogradação e variação rítmica, por meio de uma heurística de alinhamento de sequências inspirada no BLAST (</w:t>
       </w:r>
       <w:r>
         <w:rPr>
@@ -3988,7 +3707,456 @@
         <w:t>seed-and-extend</w:t>
       </w:r>
       <w:r>
-        <w:t xml:space="preserve"> ao problema de correspondência motívica entre versões. O Capítulo 6 detalha os procedimentos metodológicos, incluindo o corpus, os conjuntos de teste, os parâmetros e os critérios de avaliação, e o Capítulo 7 apresenta o cronograma do TCC I e do TCC II.</w:t>
+        <w:t>), tendo como corpus de estudo os corais a quatro vozes de J. S. Bach, com aplicação voltada à preparação de edições críticas e à curadoria de acervos digitais de partituras simbólicas.</w:t>
+      </w:r>
+    </w:p>
+    <w:p>
+      <w:pPr>
+        <w:pStyle w:val="T3-TituloTerciario"/>
+        <w:ind w:left="0"/>
+      </w:pPr>
+      <w:bookmarkStart w:id="26" w:name="__RefHeading___Toc1054_1503872338"/>
+      <w:bookmarkStart w:id="27" w:name="_Toc238404366"/>
+      <w:bookmarkStart w:id="28" w:name="_Toc242031498"/>
+      <w:bookmarkEnd w:id="26"/>
+      <w:commentRangeStart w:id="29"/>
+      <w:commentRangeStart w:id="30"/>
+      <w:r>
+        <w:t>Objetivos específicos</w:t>
+      </w:r>
+      <w:bookmarkEnd w:id="27"/>
+      <w:commentRangeEnd w:id="29"/>
+      <w:commentRangeEnd w:id="30"/>
+      <w:r>
+        <w:commentReference w:id="29"/>
+        <w:commentReference w:id="30"/>
+      </w:r>
+      <w:bookmarkEnd w:id="28"/>
+    </w:p>
+    <w:p>
+      <w:pPr>
+        <w:pStyle w:val="TE-Alnea"/>
+        <w:tabs>
+          <w:tab w:val="left" w:pos="1369"/>
+        </w:tabs>
+        <w:ind w:left="1369"/>
+      </w:pPr>
+      <w:r>
+        <w:t>revisar a fundamentação teórico-musical sobre transformação motívica (</w:t>
+      </w:r>
+      <w:r>
+        <w:rPr>
+          <w:i/>
+          <w:iCs/>
+        </w:rPr>
+        <w:t>Grundgestalt</w:t>
+      </w:r>
+      <w:r>
+        <w:t xml:space="preserve">, </w:t>
+      </w:r>
+      <w:r>
+        <w:rPr>
+          <w:i/>
+          <w:iCs/>
+        </w:rPr>
+        <w:t>developing variation</w:t>
+      </w:r>
+      <w:r>
+        <w:t>) e os métodos computacionais de alinhamento de sequências e de descoberta de padrões musicais, situando o método proposto em relação aos trabalhos existentes;</w:t>
+      </w:r>
+    </w:p>
+    <w:p>
+      <w:pPr>
+        <w:pStyle w:val="TE-Alnea"/>
+        <w:tabs>
+          <w:tab w:val="left" w:pos="1369"/>
+        </w:tabs>
+        <w:ind w:left="1369"/>
+      </w:pPr>
+      <w:r>
+        <w:t>especificar uma representação simbólica dos motivos musicais adequada à aplicação das transformações consideradas (transposição, inversão, retrogradação, variação rítmica) e à comparação entre versões;</w:t>
+      </w:r>
+    </w:p>
+    <w:p>
+      <w:pPr>
+        <w:pStyle w:val="TE-Alnea"/>
+        <w:tabs>
+          <w:tab w:val="left" w:pos="1369"/>
+        </w:tabs>
+        <w:ind w:left="1369"/>
+      </w:pPr>
+      <w:r>
+        <w:t xml:space="preserve">adaptar a heurística </w:t>
+      </w:r>
+      <w:r>
+        <w:rPr>
+          <w:i/>
+          <w:iCs/>
+        </w:rPr>
+        <w:t>seed-and-extend</w:t>
+      </w:r>
+      <w:r>
+        <w:t>, originária da bioinformática, ao domínio simbólico musical, definindo os critérios de pontuação e de extensão do alinhamento;</w:t>
+      </w:r>
+    </w:p>
+    <w:p>
+      <w:pPr>
+        <w:pStyle w:val="TE-Alnea"/>
+        <w:tabs>
+          <w:tab w:val="left" w:pos="1369"/>
+        </w:tabs>
+        <w:ind w:left="1369"/>
+      </w:pPr>
+      <w:r>
+        <w:t>modelar um protótipo de software que implemente o método — requisitos, casos de uso, componentes e parâmetros;</w:t>
+      </w:r>
+    </w:p>
+    <w:p>
+      <w:pPr>
+        <w:pStyle w:val="TE-Alnea"/>
+        <w:tabs>
+          <w:tab w:val="left" w:pos="1369"/>
+        </w:tabs>
+        <w:ind w:left="1369"/>
+      </w:pPr>
+      <w:r>
+        <w:lastRenderedPageBreak/>
+        <w:t>propor critérios objetivos para avaliação das correspondências motívicas identificadas pelo método;</w:t>
+      </w:r>
+    </w:p>
+    <w:p>
+      <w:pPr>
+        <w:pStyle w:val="TE-Alnea"/>
+        <w:tabs>
+          <w:tab w:val="left" w:pos="1369"/>
+        </w:tabs>
+        <w:ind w:left="1369"/>
+      </w:pPr>
+      <w:r>
+        <w:t>implementar o protótipo modelado, em linguagem Python, com a biblioteca music21 (CUTHBERT; ARIZA, 2010);</w:t>
+      </w:r>
+    </w:p>
+    <w:p>
+      <w:pPr>
+        <w:pStyle w:val="TE-Alnea"/>
+        <w:tabs>
+          <w:tab w:val="left" w:pos="1369"/>
+        </w:tabs>
+        <w:ind w:left="1369"/>
+      </w:pPr>
+      <w:r>
+        <w:t>aplicar preliminarmente os critérios de avaliação aos dois conjuntos de teste descritos na Seção 5.6.2, comparando o método com a referência de alinhamento exato de Smith-Waterman.</w:t>
+      </w:r>
+    </w:p>
+    <w:p>
+      <w:pPr>
+        <w:pStyle w:val="TE-Normal"/>
+      </w:pPr>
+      <w:r>
+        <w:t xml:space="preserve">Os objetivos específicos de </w:t>
+      </w:r>
+      <w:r>
+        <w:rPr>
+          <w:i/>
+          <w:iCs/>
+        </w:rPr>
+        <w:t>a</w:t>
+      </w:r>
+      <w:r>
+        <w:t xml:space="preserve"> a </w:t>
+      </w:r>
+      <w:r>
+        <w:rPr>
+          <w:i/>
+          <w:iCs/>
+        </w:rPr>
+        <w:t>e</w:t>
+      </w:r>
+      <w:r>
+        <w:t xml:space="preserve"> são desenvolvidos no TCC I, objeto deste documento; os objetivos </w:t>
+      </w:r>
+      <w:r>
+        <w:rPr>
+          <w:i/>
+          <w:iCs/>
+        </w:rPr>
+        <w:t>f</w:t>
+      </w:r>
+      <w:r>
+        <w:t xml:space="preserve"> e </w:t>
+      </w:r>
+      <w:r>
+        <w:rPr>
+          <w:i/>
+          <w:iCs/>
+        </w:rPr>
+        <w:t>g</w:t>
+      </w:r>
+      <w:r>
+        <w:t>, no TCC II, conforme o cronograma apresentado no Capítulo 6.</w:t>
+      </w:r>
+    </w:p>
+    <w:p>
+      <w:pPr>
+        <w:pStyle w:val="TE-Normal"/>
+        <w:ind w:firstLine="0"/>
+      </w:pPr>
+    </w:p>
+    <w:p>
+      <w:pPr>
+        <w:pStyle w:val="T2-TituloSecundario"/>
+      </w:pPr>
+      <w:bookmarkStart w:id="31" w:name="__RefHeading___Toc1048_1503872338"/>
+      <w:bookmarkStart w:id="32" w:name="_Toc238404367"/>
+      <w:bookmarkStart w:id="33" w:name="_Toc242031499"/>
+      <w:bookmarkEnd w:id="31"/>
+      <w:r>
+        <w:t>Justificativa</w:t>
+      </w:r>
+      <w:bookmarkEnd w:id="32"/>
+      <w:bookmarkEnd w:id="33"/>
+    </w:p>
+    <w:p>
+      <w:pPr>
+        <w:pStyle w:val="TE-Normal"/>
+      </w:pPr>
+      <w:r>
+        <w:t>Reconhecer quando um motivo reaparece, transformado, em outra versão de uma composição musical tem relevância tanto para a pesquisa em ciência da computação aplicada à música quanto para a prática da análise musical assistida por computador.</w:t>
+      </w:r>
+    </w:p>
+    <w:p>
+      <w:pPr>
+        <w:pStyle w:val="TE-Normal"/>
+      </w:pPr>
+      <w:r>
+        <w:t xml:space="preserve">Do ponto de vista da musicologia, comparar versões de uma mesma obra (diferentes edições, arranjos ou revisões autorais) é uma tarefa recorrente na crítica textual musical (a comparação sistemática de fontes de uma obra para reconstituir ou documentar sua transmissão), mas que, no nível da identidade motívica, ainda depende em grande parte do julgamento e da disponibilidade de tempo do analista, já que as ferramentas computacionais disponíveis operam sobretudo no nível notacional, como se discute no Capítulo 4. O próprio corpus utilizado neste trabalho ilustra essa relevância prática. Os corais a quatro vozes de Bach chegaram até nós por duas vias distintas — parte transmitida dentro de obras maiores, como cantatas e paixões, muitas vezes em autógrafos do compositor, e parte preservada apenas em coletâneas organizadas postumamente. Entre essas fontes, há casos documentados de uma mesma harmonização registrada em tonalidades diferentes: o coral que encerra a cantata BWV 30, por exemplo, está em lá maior na partitura da cantata e em sol maior na coleção organizada por C. P. E. Bach e publicada pela Breitkopf (DAHN, 2017). Sem apoio computacional, esse tipo de transposição entre fontes só se estabelece pela comparação manual de uma fonte com a outra</w:t>
+      </w:r>
+      <w:r>
+        <w:rPr>
+          <w:highlight w:val="yellow"/>
+        </w:rPr>
+        <w:t xml:space="preserve"> [PREFERIR FONTE ACADÊMICA: o levantamento de Dahn remete ao relatório crítico da Neue Bach-Ausgabe, NBA III/2.2 — perguntar ao coorientador]</w:t>
+      </w:r>
+      <w:r>
+        <w:t>. Um método automatizado de alinhamento tolerante a esse tipo de transformação teria aplicação direta para pesquisadores e editores envolvidos na preparação de edições críticas dos corais de Bach, bem como para curadores de acervos digitais que reúnem diferentes edições e fontes de uma mesma obra.</w:t>
+      </w:r>
+    </w:p>
+    <w:p>
+      <w:pPr>
+        <w:pStyle w:val="TE-Normal"/>
+      </w:pPr>
+      <w:r>
+        <w:t>Do ponto de vista computacional, o problema é relevante porque leva heurísticas de alinhamento consolidadas na bioinformática a uma tarefa não tratada nos trabalhos consultados. A analogia entre sequências biológicas e musicais não é nova: o BLAST (ALTSCHUL et al., 1990) já foi adaptado à busca de padrões e à classificação de melodias (KILIAN; HOOS, 2004; BOUNTOURIDIS et al., 2017). Essas adaptações, porém, respondem a perguntas de recuperação e classificação. Aplicar a mesma lógica, de busca por âncoras seguida de extensão tolerante a diferenças, à correspondência motívica entre versões de uma mesma obra, com as transformações explicitamente modeladas e avaliadas, estende essa analogia a um problema diferente e contribui especificamente para a musicologia computacional.</w:t>
+      </w:r>
+    </w:p>
+    <w:p>
+      <w:pPr>
+        <w:pStyle w:val="TE-Normal"/>
+      </w:pPr>
+      <w:r>
+        <w:t>Por fim, a tolerância a transformações aproxima o método da forma como a correspondência motívica é reconhecida na prática, embora com uma distinção importante entre o ouvinte e o analista. A percepção melódica opera sobre relações entre notas, e não sobre a identidade exata de cada nota (NARMOUR, 1990), e por isso um trecho transposto, que preserva essas relações, tende a ser reconhecido como o mesmo trecho. Para as demais transformações, a evidência é mais restrita. Em experimentos com melodias curtas, Dowling (1972) observou que ouvintes reconhecem inversões, retrógrados e retrógrados da inversão acima do acaso, mas com dificuldade crescente nessa ordem. O método proposto não pretende, portanto, modelar o que um ouvinte percebe. Pretende apoiar o analista, que reconhece essas relações pela leitura da partitura, tornando explícitas e verificáveis correspondências que um método restrito a repetições literais deixaria de fora.</w:t>
+      </w:r>
+    </w:p>
+    <w:p>
+      <w:pPr>
+        <w:pStyle w:val="T2-TituloSecundario"/>
+      </w:pPr>
+      <w:r>
+        <w:t>Procedimentos Metodológicos</w:t>
+      </w:r>
+    </w:p>
+    <w:p>
+      <w:pPr>
+        <w:pStyle w:val="TE-Normal"/>
+      </w:pPr>
+      <w:r>
+        <w:t xml:space="preserve">Esta pesquisa é caracterizada segundo as quatro classificações propostas por Prodanov e Freitas (2013): quanto à natureza, aos objetivos, aos procedimentos técnicos e à forma de abordagem do problema. Quanto à natureza, é aplicada: propõe um método com aplicação direta à preparação de edições críticas e à curadoria de acervos digitais de partituras simbólicas, conforme a Seção 1.4. Quanto aos objetivos, é exploratória (GIL, 2002): investiga um problema ainda pouco explorado na literatura consultada, a correspondência motívica entre versões simbólicas de uma composição, sem hipóteses prévias a testar estatisticamente, buscando antes formular e especificar um método viável. Quanto aos procedimentos técnicos, combina pesquisa bibliográfica (Capítulos 2 a 4) com o desenvolvimento de um protótipo de software (Capítulo 5). Quanto à forma de abordagem, combina elementos quantitativos e qualitativos: as correspondências identificadas pelo método são avaliadas por métricas calculadas contra um gabarito, como precisão e cobertura, enquanto as correspondências encontradas nas vozes internas das harmonizações, que não têm gabarito, são examinadas qualitativamente (Seção 5.6).</w:t>
+      </w:r>
+    </w:p>
+    <w:p>
+      <w:pPr>
+        <w:pStyle w:val="TE-Normal"/>
+      </w:pPr>
+      <w:r>
+        <w:t xml:space="preserve">O corpus é formado pelos corais a quatro vozes de J. S. Bach distribuídos com a biblioteca music21 (CUTHBERT; ARIZA, 2010), de domínio público e fixado antes do início deste trabalho. A caracterização do corpus, os conjuntos de teste construídos a partir dele, os parâmetros do método e os critérios objetivos de avaliação são detalhados na Seção 5.6, depois da apresentação do método, do qual dependem.</w:t>
+      </w:r>
+    </w:p>
+    <w:p>
+      <w:pPr>
+        <w:pStyle w:val="TE-Normal"/>
+      </w:pPr>
+      <w:r>
+        <w:t xml:space="preserve">O trabalho é executado em oito etapas, que desdobram os sete objetivos específicos (Seção 1.3.2). As etapas 1 a 4 compõem o TCC I, objeto deste documento; as etapas 5 a 8, o TCC II. O cronograma correspondente é apresentado no Capítulo 6.</w:t>
+      </w:r>
+    </w:p>
+    <w:p>
+      <w:pPr>
+        <w:pStyle w:val="TE-Normal"/>
+      </w:pPr>
+      <w:r>
+        <w:rPr>
+          <w:b/>
+          <w:bCs/>
+        </w:rPr>
+        <w:t>Etapa 1 – Revisão bibliográfica (objetivo a; TCC I).</w:t>
+      </w:r>
+      <w:r>
+        <w:t xml:space="preserve"> Levantamento e análise da fundamentação teórico-musical sobre transformação motívica (Capítulo 2), dos algoritmos de alinhamento de sequências (Capítulo 3) e dos trabalhos computacionais relacionados em música simbólica (Capítulo 4), para situar o método proposto e delimitar sua contribuição.</w:t>
+      </w:r>
+    </w:p>
+    <w:p>
+      <w:pPr>
+        <w:pStyle w:val="TE-Normal"/>
+      </w:pPr>
+      <w:r>
+        <w:rPr>
+          <w:b/>
+          <w:bCs/>
+        </w:rPr>
+        <w:t>Etapa 2 – Especificação da representação (objetivo b; TCC I).</w:t>
+      </w:r>
+      <w:r>
+        <w:t xml:space="preserve"> Definição da representação de cada voz por intervalos diatônicos, intervalos cromáticos e proporções rítmicas, com as alturas absolutas guardadas à parte, e das operações que derivam dessa representação as formas sob inversão, retrogradação e retrógrado da inversão (Seção 5.1.1).</w:t>
+      </w:r>
+    </w:p>
+    <w:p>
+      <w:pPr>
+        <w:pStyle w:val="TE-Normal"/>
+      </w:pPr>
+      <w:r>
+        <w:rPr>
+          <w:b/>
+          <w:bCs/>
+        </w:rPr>
+        <w:t>Etapa 3 – Adaptação da heurística e modelagem do protótipo (objetivos c e d; TCC I).</w:t>
+      </w:r>
+      <w:r>
+        <w:t xml:space="preserve"> Adaptação da estratégia </w:t>
+      </w:r>
+      <w:r>
+        <w:rPr>
+          <w:i/>
+          <w:iCs/>
+        </w:rPr>
+        <w:t>seed-and-extend</w:t>
+      </w:r>
+      <w:r>
+        <w:t xml:space="preserve"> ao domínio musical — sementes com filtro de baixa complexidade, indexação de variantes, extensão com </w:t>
+      </w:r>
+      <w:r>
+        <w:rPr>
+          <w:i/>
+          <w:iCs/>
+        </w:rPr>
+        <w:t>gaps</w:t>
+      </w:r>
+      <w:r>
+        <w:t xml:space="preserve"> e X-drop e filtragem por significância empírica (Seções 5.1.2 a 5.1.5) — e sua tradução em requisitos, casos de uso, componentes e classes (Seções 5.2 a 5.5).</w:t>
+      </w:r>
+    </w:p>
+    <w:p>
+      <w:pPr>
+        <w:pStyle w:val="TE-Normal"/>
+      </w:pPr>
+      <w:r>
+        <w:rPr>
+          <w:b/>
+          <w:bCs/>
+        </w:rPr>
+        <w:t>Etapa 4 – Definição dos critérios de avaliação (objetivo e; TCC I).</w:t>
+      </w:r>
+      <w:r>
+        <w:t xml:space="preserve"> Definição dos dois conjuntos de teste (Seção 5.6.2), dos parâmetros a calibrar (Seção 5.6.3) e dos critérios de avaliação, com a referência de Smith-Waterman (Seção 5.6.4).</w:t>
+      </w:r>
+    </w:p>
+    <w:p>
+      <w:pPr>
+        <w:pStyle w:val="TE-Normal"/>
+      </w:pPr>
+      <w:r>
+        <w:rPr>
+          <w:b/>
+          <w:bCs/>
+        </w:rPr>
+        <w:t>Etapa 5 – Implementação do protótipo (objetivo f; TCC II).</w:t>
+      </w:r>
+      <w:r>
+        <w:t xml:space="preserve"> Implementação dos seis componentes em Python, com o music21, na ordem do fluxo de dados da Figura 4, e da referência de Smith-Waterman iterativo. Cada componente é verificado isoladamente antes da integração, com casos cujo resultado é conhecido de antemão — por exemplo, uma voz comparada com sua própria transposição deve produzir uma correspondência que cubra a voz inteira, rotulada como transposição com o intervalo correto.</w:t>
+      </w:r>
+    </w:p>
+    <w:p>
+      <w:pPr>
+        <w:pStyle w:val="TE-Normal"/>
+      </w:pPr>
+      <w:r>
+        <w:rPr>
+          <w:b/>
+          <w:bCs/>
+        </w:rPr>
+        <w:t>Etapa 6 – Construção dos conjuntos de teste (objetivo g; TCC II).</w:t>
+      </w:r>
+      <w:r>
+        <w:t xml:space="preserve"> Divisão do corpus em subconjuntos de calibração e de avaliação (Seção 5.6.3), geração </w:t>
+        <w:lastRenderedPageBreak/>
+        <w:t>dos pares sintéticos com seu gabarito e seleção das harmonizações diferentes de uma mesma melodia (Seção 5.6.2).</w:t>
+      </w:r>
+    </w:p>
+    <w:p>
+      <w:pPr>
+        <w:pStyle w:val="TE-Normal"/>
+      </w:pPr>
+      <w:r>
+        <w:rPr>
+          <w:b/>
+          <w:bCs/>
+        </w:rPr>
+        <w:t>Etapa 7 – Calibração dos parâmetros (objetivo g; TCC II).</w:t>
+      </w:r>
+      <w:r>
+        <w:t xml:space="preserve"> Execuções piloto sobre o subconjunto de calibração para fixar os sete grupos de parâmetros do método (Seção 5.6.3).</w:t>
+      </w:r>
+    </w:p>
+    <w:p>
+      <w:pPr>
+        <w:pStyle w:val="TE-Normal"/>
+      </w:pPr>
+      <w:r>
+        <w:rPr>
+          <w:b/>
+          <w:bCs/>
+        </w:rPr>
+        <w:t>Etapa 8 – Avaliação preliminar e análise (objetivo g; TCC II).</w:t>
+      </w:r>
+      <w:r>
+        <w:t xml:space="preserve"> Execução do método e da referência de Smith-Waterman sobre o subconjunto de avaliação, cálculo dos critérios da Seção 5.6.4 — no conjunto e por tipo de transformação — e análise dos erros, com atenção às correspondências não encontradas e às espúrias, para identificar limitações do método.</w:t>
+      </w:r>
+    </w:p>
+    <w:p>
+      <w:pPr>
+        <w:pStyle w:val="T2-TituloSecundario"/>
+      </w:pPr>
+      <w:bookmarkStart w:id="38" w:name="_Toc242031501"/>
+      <w:r>
+        <w:t>Estrutura do Trabalho</w:t>
+      </w:r>
+      <w:bookmarkEnd w:id="38"/>
+    </w:p>
+    <w:p>
+      <w:pPr>
+        <w:pStyle w:val="TE-Normal"/>
+      </w:pPr>
+      <w:r>
+        <w:t xml:space="preserve">Além desta introdução, o trabalho está organizado em seis capítulos. O Capítulo 2 revisa a fundamentação teórico-musical da transformação motívica, de Schoenberg a Narmour. O Capítulo 3 apresenta os fundamentos computacionais do alinhamento de sequências, do algoritmo de Needleman-Wunsch à heurística do BLAST. O Capítulo 4 examina os trabalhos relacionados em música simbólica e posiciona a contribuição deste trabalho em relação a eles. O Capítulo 5 descreve a modelagem do protótipo que adapta a heurística </w:t>
+      </w:r>
+      <w:r>
+        <w:rPr>
+          <w:i/>
+          <w:iCs/>
+        </w:rPr>
+        <w:t xml:space="preserve">seed-and-extend</w:t>
+      </w:r>
+      <w:r>
+        <w:t xml:space="preserve"> ao problema de correspondência motívica entre versões e o planejamento de sua avaliação: o corpus, os conjuntos de teste, os parâmetros e os critérios de avaliação. O Capítulo 6 apresenta o cronograma do TCC I e do TCC II, e o Capítulo 7, o orçamento.</w:t>
       </w:r>
     </w:p>
     <w:p>
@@ -6361,7 +6529,7 @@
         <w:pStyle w:val="TE-Normal"/>
       </w:pPr>
       <w:r>
-        <w:t>Este capítulo apresenta a modelagem do protótipo que implementa o método de alinhamento motívico descrito nos capítulos anteriores. Descreve-se a solução proposta em termos de arquitetura geral, os requisitos funcionais e não funcionais que orientam o desenvolvimento, o caso de uso que caracteriza a interação com a ferramenta e o projeto interno de seus componentes. Por se tratar de uma ferramenta de análise, sem interface gráfica voltada a um usuário final, algumas seções do modelo institucional de TCC foram adaptadas ao formato do protótipo — a adaptação é explicitada em cada seção correspondente. A implementação do protótipo aqui modelado e a aplicação preliminar dos critérios de avaliação estão previstas para o TCC II; este capítulo estabelece o desenho que orienta essa implementação.</w:t>
+        <w:t xml:space="preserve">Este capítulo apresenta a modelagem do protótipo que implementa o método de alinhamento motívico descrito nos capítulos anteriores. Descreve-se a solução proposta em termos de arquitetura geral, os requisitos funcionais e não funcionais que orientam o desenvolvimento, o caso de uso que caracteriza a interação com a ferramenta, o projeto interno de seus componentes e, por fim, o planejamento da avaliação do método. A implementação do protótipo aqui modelado e a aplicação preliminar dos critérios de avaliação estão previstas para o TCC II; este capítulo estabelece o desenho que orienta essa implementação.</w:t>
       </w:r>
     </w:p>
     <w:p>
@@ -6654,7 +6822,7 @@
         <w:pStyle w:val="TE-Normal"/>
       </w:pPr>
       <w:r>
-        <w:t xml:space="preserve">Antes da indexação, as sementes passam por um filtro de baixa complexidade. Nos corais, a condução de vozes é predominantemente por graus conjuntos. Sementes formadas apenas por passos na mesma direção, isto é, fragmentos de escala, ocorrem em praticamente qualquer trecho de qualquer voz e geram coincidências sem valor motívico. O problema tem um análogo direto na bioinformática: ali, regiões de baixa complexidade composicional das sequências são identificadas e mascaradas antes da busca (WOOTTON; FEDERHEN, 1993), justamente porque produzem alinhamentos espúrios. O protótipo adota a mesma estratégia. Sementes de baixa complexidade são descartadas da indexação ou têm seu peso reduzido, e o critério exato é definido na calibração (Seção 6.4). Como critério </w:t>
+        <w:t xml:space="preserve">Antes da indexação, as sementes passam por um filtro de baixa complexidade. Nos corais, a condução de vozes é predominantemente por graus conjuntos. Sementes formadas apenas por passos na mesma direção, isto é, fragmentos de escala, ocorrem em praticamente qualquer trecho de qualquer voz e geram coincidências sem valor motívico. O problema tem um análogo direto na bioinformática: ali, regiões de baixa complexidade composicional das sequências são identificadas e mascaradas antes da busca (WOOTTON; FEDERHEN, 1993), justamente porque produzem alinhamentos espúrios. O protótipo adota a mesma estratégia. Sementes de baixa complexidade são descartadas da indexação ou têm seu peso reduzido, e o critério exato é definido na calibração (Seção 5.6.3). Como critério </w:t>
         <w:lastRenderedPageBreak/>
         <w:t>inicial, é mascarada toda semente cujos passos são todos iguais e de no máximo um grau (|δ| ≤ 1), isto é, notas repetidas ou fragmentos de escala em uma única direção.</w:t>
       </w:r>
@@ -6760,15 +6928,15 @@
         <w:t>gaps</w:t>
       </w:r>
       <w:r>
-        <w:t xml:space="preserve"> segundo um custo a ser calibrado (Seção 6.4).</w:t>
-      </w:r>
-    </w:p>
-    <w:p>
-      <w:pPr>
-        <w:pStyle w:val="TE-Normal"/>
-      </w:pPr>
-      <w:r>
-        <w:t>Sendo xᵢ = (δᵢ, cᵢ, rᵢ) um elemento de S e yⱼ = (δ′ⱼ, c′ⱼ, r′ⱼ) um elemento de S′, a pontuação do par é dada pela Equação 7, em que [·] vale 1 se a condição é verdadeira e 0 caso contrário. O logaritmo torna simétricas as penalidades de dobrar e de dividir pela metade uma duração. A extensão aplica a recorrência de Smith-Waterman (Equação 2) com essa pontuação e penalidade linear g por espaço, mas apenas nas células cujo escore não viola o critério de X-drop (Equação 3). Os pesos α, β, γ e ρ, a penalidade g e o limiar X são parâmetros do método, calibrados conforme a Seção 6.4.</w:t>
+        <w:t xml:space="preserve"> segundo um custo a ser calibrado (Seção 5.6.3).</w:t>
+      </w:r>
+    </w:p>
+    <w:p>
+      <w:pPr>
+        <w:pStyle w:val="TE-Normal"/>
+      </w:pPr>
+      <w:r>
+        <w:t>Sendo xᵢ = (δᵢ, cᵢ, rᵢ) um elemento de S e yⱼ = (δ′ⱼ, c′ⱼ, r′ⱼ) um elemento de S′, a pontuação do par é dada pela Equação 7, em que [·] vale 1 se a condição é verdadeira e 0 caso contrário. O logaritmo torna simétricas as penalidades de dobrar e de dividir pela metade uma duração. A extensão aplica a recorrência de Smith-Waterman (Equação 2) com essa pontuação e penalidade linear g por espaço, mas apenas nas células cujo escore não viola o critério de X-drop (Equação 3). Os pesos α, β, γ e ρ, a penalidade g e o limiar X são parâmetros do método, calibrados conforme a Seção 5.6.3.</w:t>
       </w:r>
     </w:p>
     <w:tbl>
@@ -6873,7 +7041,7 @@
         <w:pStyle w:val="TE-Normal"/>
       </w:pPr>
       <w:r>
-        <w:t>O Quadro 2 ilustra as etapas sobre um par real do segundo conjunto de teste (Seção 6.3): os sopranos das harmonizações BWV 244.15 e BWV 244.62 do coral da Paixão. Os pesos foram escolhidos apenas para fins ilustrativos (α = 2, β = 1, γ = 1, ρ = 1, g = 2, X = 5 e k = 4) e não correspondem a valores calibrados.</w:t>
+        <w:t>O Quadro 2 ilustra as etapas sobre um par real do segundo conjunto de teste (Seção 5.6.2): os sopranos das harmonizações BWV 244.15 e BWV 244.62 do coral da Paixão. Os pesos foram escolhidos apenas para fins ilustrativos (α = 2, β = 1, γ = 1, ρ = 1, g = 2, X = 5 e k = 4) e não correspondem a valores calibrados.</w:t>
       </w:r>
     </w:p>
     <w:p>
@@ -7212,7 +7380,7 @@
         <w:pStyle w:val="TE-Normal"/>
       </w:pPr>
       <w:r>
-        <w:t xml:space="preserve">A quarta etapa, de filtragem e geração do relatório, decide quais correspondências são reportadas. Essa decisão não pode depender de gabarito, que só existe nos pares de teste, e por isso é distinta das métricas de avaliação propostas no Capítulo 6. No BLAST, esse papel cabe ao E-value, o número esperado de </w:t>
+        <w:t xml:space="preserve">A quarta etapa, de filtragem e geração do relatório, decide quais correspondências são reportadas. Essa decisão não pode depender de gabarito, que só existe nos pares de teste, e por isso é distinta das métricas de avaliação propostas na Seção 5.6.4. No BLAST, esse papel cabe ao E-value, o número esperado de </w:t>
         <w:lastRenderedPageBreak/>
         <w:t>alinhamentos com escore igual ou superior ao observado que surgiriam por acaso. Seu cálculo, porém, pressupõe um modelo estatístico calibrado para sequências biológicas e para o esquema de pontuação original, que não se transfere diretamente para a representação e a pontuação adotadas aqui. O protótipo estima, por isso, a significância de forma empírica. Para cada par de vozes, a busca completa é repetida P vezes sobre permutações aleatórias π da sequência comparada, e registra-se o escore máximo M(π) obtido em cada repetição. Esses máximos formam a distribuição de referência. O valor-p empírico de uma correspondência com escore S é estimado pela Equação 8, que soma uma unidade ao numerador e ao denominador para que o valor-p nunca seja nulo (PHIPSON; SMYTH, 2010). Usar o escore máximo, e não o escore de cada alinhamento isolado, controla a ocorrência de falsos positivos quando um mesmo par de vozes produz muitas correspondências.</w:t>
       </w:r>
@@ -7279,7 +7447,7 @@
         <w:pStyle w:val="TE-Normal"/>
       </w:pPr>
       <w:r>
-        <w:t>Uma correspondência só é reportada se seu valor-p não exceder um limiar de significância p* e se tiver um comprimento mínimo ℓmin, ambos definidos na calibração (Seção 6.4).</w:t>
+        <w:t>Uma correspondência só é reportada se seu valor-p não exceder um limiar de significância p* e se tiver um comprimento mínimo ℓmin, ambos definidos na calibração (Seção 5.6.3).</w:t>
       </w:r>
     </w:p>
     <w:p>
@@ -7349,7 +7517,7 @@
         <w:t xml:space="preserve">hit</w:t>
       </w:r>
       <w:r>
-        <w:t xml:space="preserve"> e carrega, desde a origem, a forma T sob a qual foi encontrada, o que torna direta a rotulagem da transformação e dispensa decidir a ordem das rodadas de mascaramento entre as diferentes formas. Segundo, o mesmo desenho permite, sem mudança estrutural, buscar um motivo contra o corpus inteiro, cenário fora do escopo deste trabalho, mas em que o argumento de escala volta a valer, como mostram Bountouridis et al. (2017). Em contrapartida, a heurística pode deixar de encontrar correspondências que o alinhamento exato encontraria. Medir essa perda é justamente o papel do Smith-Waterman iterativo como referência de comparação na avaliação (Seção 6.5): se ela se mostrar grande, a heurística não se justifica para o problema aqui tratado.</w:t>
+        <w:t xml:space="preserve"> e carrega, desde a origem, a forma T sob a qual foi encontrada, o que torna direta a rotulagem da transformação e dispensa decidir a ordem das rodadas de mascaramento entre as diferentes formas. Segundo, o mesmo desenho permite, sem mudança estrutural, buscar um motivo contra o corpus inteiro, cenário fora do escopo deste trabalho, mas em que o argumento de escala volta a valer, como mostram Bountouridis et al. (2017). Em contrapartida, a heurística pode deixar de encontrar correspondências que o alinhamento exato encontraria. Medir essa perda é justamente o papel do Smith-Waterman iterativo como referência de comparação na avaliação (Seção 5.6.4): se ela se mostrar grande, a heurística não se justifica para o problema aqui tratado.</w:t>
       </w:r>
     </w:p>
     <w:p>
@@ -7954,7 +8122,7 @@
         <w:t xml:space="preserve">RF09. </w:t>
       </w:r>
       <w:r>
-        <w:t>O sistema deve permitir a configuração dos parâmetros do método descritos na Seção 6.4, adotando valores padrão para os parâmetros não informados e registrando no relatório os valores utilizados.</w:t>
+        <w:t>O sistema deve permitir a configuração dos parâmetros do método descritos na Seção 5.6.3, adotando valores padrão para os parâmetros não informados e registrando no relatório os valores utilizados.</w:t>
       </w:r>
     </w:p>
     <w:p>
@@ -7984,7 +8152,7 @@
         <w:t xml:space="preserve">RF11. </w:t>
       </w:r>
       <w:r>
-        <w:t>O sistema deve calcular, quando fornecido o gabarito de um par de versões, os critérios de avaliação definidos na Seção 6.5.</w:t>
+        <w:t>O sistema deve calcular, quando fornecido o gabarito de um par de versões, os critérios de avaliação definidos na Seção 5.6.4.</w:t>
       </w:r>
     </w:p>
     <w:p>
@@ -7999,7 +8167,7 @@
         <w:t xml:space="preserve">RF12. </w:t>
       </w:r>
       <w:r>
-        <w:t>O sistema deve executar, sobre os mesmos pares de vozes, a referência de alinhamento exato por Smith-Waterman iterativo descrita na Seção 6.5, para comparação com o método.</w:t>
+        <w:t>O sistema deve executar, sobre os mesmos pares de vozes, a referência de alinhamento exato por Smith-Waterman iterativo descrita na Seção 5.6.4, para comparação com o método.</w:t>
       </w:r>
     </w:p>
     <w:p>
@@ -8122,7 +8290,7 @@
         <w:rPr>
           <w:highlight w:val="yellow"/>
         </w:rPr>
-        <w:t>, critério de baixa complexidade, limiar de significância e comprimento mínimo) ainda não fixados — decisão adiada para a calibração no TCC II (Seção 6.4)</w:t>
+        <w:t>, critério de baixa complexidade, limiar de significância e comprimento mínimo) ainda não fixados — decisão adiada para a calibração no TCC II (Seção 5.6.3)</w:t>
       </w:r>
     </w:p>
     <w:p>
@@ -8142,17 +8310,6 @@
         <w:pStyle w:val="TE-Normal"/>
       </w:pPr>
       <w:r>
-        <w:rPr>
-          <w:highlight w:val="yellow"/>
-        </w:rPr>
-        <w:t>ADAPTAÇÃO: como o protótipo não possui interface gráfica voltada a um usuário final, o diagrama de caso de uso abaixo é reduzido a um único ator interagindo com o sistema por linha de comando, e não a um conjunto de telas</w:t>
-      </w:r>
-    </w:p>
-    <w:p>
-      <w:pPr>
-        <w:pStyle w:val="TE-Normal"/>
-      </w:pPr>
-      <w:r>
         <w:t xml:space="preserve">O protótipo possui um único ator, o </w:t>
       </w:r>
       <w:r>
@@ -8223,7 +8380,7 @@
         <w:t>Avaliar resultados com gabarito</w:t>
       </w:r>
       <w:r>
-        <w:t xml:space="preserve"> é usado apenas sobre os pares de teste descritos no Capítulo 6.</w:t>
+        <w:t xml:space="preserve"> é usado apenas sobre os pares de teste descritos na Seção 5.6.2.</w:t>
       </w:r>
     </w:p>
     <w:p>
@@ -8456,7 +8613,7 @@
               <w:jc w:val="left"/>
             </w:pPr>
             <w:r>
-              <w:t>Opcional. O ator define os parâmetros θ da Seção 6.4. Parâmetros não informados assumem valores padrão, registrados no relatório.</w:t>
+              <w:t>Opcional. O ator define os parâmetros θ da Seção 5.6.3. Parâmetros não informados assumem valores padrão, registrados no relatório.</w:t>
             </w:r>
           </w:p>
         </w:tc>
@@ -8843,7 +9000,7 @@
               <w:jc w:val="left"/>
             </w:pPr>
             <w:r>
-              <w:t>O ator fornece o gabarito de um par de teste (Seção 6.3); o sistema calcula os critérios da Seção 6.5 para o método e para a referência de Smith-Waterman.</w:t>
+              <w:t>O ator fornece o gabarito de um par de teste (Seção 5.6.2); o sistema calcula os critérios da Seção 5.6.4 para o método e para a referência de Smith-Waterman.</w:t>
             </w:r>
           </w:p>
         </w:tc>
@@ -9581,17 +9738,6 @@
         <w:pStyle w:val="TE-Normal"/>
       </w:pPr>
       <w:r>
-        <w:rPr>
-          <w:highlight w:val="yellow"/>
-        </w:rPr>
-        <w:t>ADAPTAÇÃO: a seção "Wireframes" do modelo institucional pressupõe telas de interface gráfica; como o protótipo não possui UI, esta seção foi redirecionada para descrever o artefato que o usuário efetivamente consulta — o relatório de correspondências</w:t>
-      </w:r>
-    </w:p>
-    <w:p>
-      <w:pPr>
-        <w:pStyle w:val="TE-Normal"/>
-      </w:pPr>
-      <w:r>
         <w:t>O relatório produzido pelo protótipo organiza cada correspondência motívica identificada em uma ou mais linhas, uma por segmento rotulado (Seção 5.1.4), com as colunas descritas no Quadro 6.</w:t>
       </w:r>
     </w:p>
@@ -9821,6 +9967,351 @@
       <w:pPr>
         <w:pStyle w:val="T2-TituloSecundario"/>
       </w:pPr>
+      <w:r>
+        <w:t>Planejamento da Avaliação</w:t>
+      </w:r>
+    </w:p>
+    <w:p>
+      <w:pPr>
+        <w:pStyle w:val="TE-Normal"/>
+      </w:pPr>
+      <w:r>
+        <w:t xml:space="preserve">Esta seção reúne o planejamento da avaliação do método, que será executada no TCC II: o corpus (Seção 5.6.1), a construção dos pares de versões usados nos testes (Seção 5.6.2), os parâmetros a calibrar (Seção 5.6.3) e os critérios objetivos de avaliação (Seção 5.6.4). O planejamento é apresentado depois da modelagem porque cada um desses elementos depende do método descrito nas seções anteriores.</w:t>
+      </w:r>
+    </w:p>
+    <w:p>
+      <w:pPr>
+        <w:pStyle w:val="T3-TituloTerciario"/>
+      </w:pPr>
+      <w:bookmarkStart w:id="128" w:name="__RefHeading___Toc9103_1503872338"/>
+      <w:bookmarkStart w:id="129" w:name="_Toc242031537"/>
+      <w:bookmarkEnd w:id="128"/>
+      <w:r>
+        <w:lastRenderedPageBreak/>
+        <w:t>Corpus</w:t>
+      </w:r>
+      <w:bookmarkEnd w:id="129"/>
+    </w:p>
+    <w:p>
+      <w:pPr>
+        <w:pStyle w:val="TE-Normal"/>
+      </w:pPr>
+      <w:r>
+        <w:t>O corpus deste trabalho é composto pelos corais a quatro vozes de J. S. Bach distribuídos com o music21 (CUTHBERT; ARIZA, 2010). A coleção de referência desses corais, na numeração de Riemenschneider, reúne 371 peças, mas nem todas estão disponíveis na biblioteca. Um levantamento preliminar feito pelo autor sobre a versão 10.5 do music21 identificou 433 arquivos atribuídos a Bach, dos quais 365, em MusicXML, correspondem a corais a quatro vozes.</w:t>
+      </w:r>
+      <w:r>
+        <w:rPr>
+          <w:rStyle w:val="Refdenotaderodap"/>
+        </w:rPr>
+        <w:footnoteReference w:id="3"/>
+      </w:r>
+      <w:r>
+        <w:t xml:space="preserve"> Esse é o conjunto efetivamente utilizado. O corpus é de domínio público e distribuído nativamente em MusicXML pela ferramenta, o que dispensa etapas de conversão de formato para o protótipo descrito nas seções anteriores. Arquivos que codificam o mesmo coral em formatos diferentes são tratados como duplicatas e excluídos.</w:t>
+      </w:r>
+    </w:p>
+    <w:p>
+      <w:pPr>
+        <w:pStyle w:val="T3-TituloTerciario"/>
+      </w:pPr>
+      <w:bookmarkStart w:id="130" w:name="__RefHeading___Toc9104_1503872338"/>
+      <w:bookmarkStart w:id="131" w:name="_Toc242031538"/>
+      <w:bookmarkEnd w:id="130"/>
+      <w:r>
+        <w:t>Construção dos Pares de Versões para Teste</w:t>
+      </w:r>
+      <w:bookmarkEnd w:id="131"/>
+    </w:p>
+    <w:p>
+      <w:pPr>
+        <w:pStyle w:val="TE-Normal"/>
+      </w:pPr>
+      <w:r>
+        <w:t>Conforme indicado na Delimitação do problema (Seção 1.2), os pares de versões usados para testar o protótipo podem ser constituídos a partir de variantes documentadas na tradição de fontes dos corais, de transformações geradas programaticamente sobre o corpus, de harmonizações diferentes de uma mesma melodia, ou de uma combinação dessas fontes. Este trabalho adota dois conjuntos de teste complementares. O primeiro, e principal, é construído programaticamente: a partir de um coral do corpus (Versão A), gera-se uma Versão B aplicando, a um ou mais trechos motívicos selecionados, uma ou mais das transformações consideradas (transposição, inversão, retrogradação, variação rítmica e inserção ou remoção de notas), mantendo o restante da voz estruturalmente inalterado. A localização exata e o tipo de transformação aplicada em cada par gerado são registrados como gabarito (</w:t>
+      </w:r>
+      <w:r>
+        <w:rPr>
+          <w:i/>
+          <w:iCs/>
+        </w:rPr>
+        <w:t>ground truth</w:t>
+      </w:r>
+      <w:r>
+        <w:t xml:space="preserve">) — informação indisponível quando se depende exclusivamente de variantes históricas reais, mas indispensável para o cálculo dos critérios objetivos de </w:t>
+        <w:lastRenderedPageBreak/>
+        <w:t>avaliação propostos na Seção 5.6.4. No caso da transposição, o gabarito registra também se ela é real ou tonal (Seção 5.1.4). Os trechos não transformados também integram o gabarito, como segmentos idênticos entre as duas versões.</w:t>
+      </w:r>
+    </w:p>
+    <w:p>
+      <w:pPr>
+        <w:pStyle w:val="TE-Normal"/>
+      </w:pPr>
+      <w:r>
+        <w:t>Essa estratégia tem uma limitação metodológica que vale reconhecer: os mesmos mecanismos que o protótipo usa para tolerar as quatro transformações consideradas — invariância por construção da representação, no caso da transposição; indexação de variantes, no caso de inversão e retrogradação; tolerância na etapa de pontuação, no caso da variação rítmica; e extensão com gaps, no caso da inserção ou remoção de notas (Seção 5.1) — são também os mecanismos usados para gerar os pares de teste sintéticos. Por isso, o desempenho do protótipo sobre esses pares valida principalmente a correção da implementação de cada mecanismo, não necessariamente sua capacidade de generalizar para variantes reais e não documentadas, que podem envolver combinações de transformações mais complexas ou irregularidades que esses mecanismos não antecipam. Essa limitação é inerente à etapa de design deste trabalho. O segundo conjunto de teste, descrito a seguir, a mitiga parcialmente; a inclusão de transformações não triviais nos pares sintéticos fica como direção para trabalhos futuros.</w:t>
+      </w:r>
+    </w:p>
+    <w:p>
+      <w:pPr>
+        <w:pStyle w:val="TE-Normal"/>
+      </w:pPr>
+      <w:r>
+        <w:t>O segundo conjunto de teste é formado por pares reais extraídos do próprio corpus. Bach harmonizou muitas melodias de coral mais de uma vez, em obras e tonalidades diferentes. A melodia conhecida como coral da Paixão, por exemplo, aparece harmonizada cinco vezes na Paixão segundo São Mateus (BWV 244.15, 244.17, 244.44, 244.54 e 244.62), além de outras harmonizações no mesmo corpus. Um levantamento preliminar feito pelo autor agrupou os corais cujo soprano começa pela mesma sequência de dez intervalos diatônicos e identificou 63 melodias com duas ou mais harmonizações, somando 175 arquivos. A contagem é conservadora, porque o critério não agrupa harmonizações cujo início difere por uma nota de passagem. É o caso do próprio BWV 244.62, cujo soprano se afasta das demais harmonizações já no nono intervalo: ele não entra na contagem, mas é incluído no conjunto de teste por identificação direta. Conforme a definição apresentada na Delimitação do problema (Seção 1.2), harmonizações diferentes de uma mesma melodia são tratadas como versões dessa melodia.</w:t>
+      </w:r>
+    </w:p>
+    <w:p>
+      <w:pPr>
+        <w:pStyle w:val="TE-Normal"/>
+      </w:pPr>
+      <w:r>
+        <w:t xml:space="preserve">Esses pares não têm gabarito completo, mas têm um gabarito parcial conhecido de antemão: o soprano de uma harmonização deve corresponder, do início ao fim, ao soprano da outra, com um intervalo de transposição dado pela diferença de </w:t>
+        <w:lastRenderedPageBreak/>
+        <w:t>tonalidade. Contêm também variantes reais que o método precisa absorver. Entre as harmonizações do coral da Paixão, o soprano varia de 42 a 56 notas na codificação do corpus, o que indica notas de passagem e alterações rítmicas acrescentadas, e o BWV 244.62, como já observado, diverge das demais a partir do nono intervalo. As vozes internas, por outro lado, são reescritas a cada harmonização e não têm gabarito; as correspondências encontradas nelas são examinadas qualitativamente. Esse conjunto não substitui os pares sintéticos, mas testa o método sobre variações que ele próprio não gerou.</w:t>
+      </w:r>
+    </w:p>
+    <w:p>
+      <w:pPr>
+        <w:pStyle w:val="TE-Normal"/>
+      </w:pPr>
+      <w:r>
+        <w:t xml:space="preserve">Variantes documentadas na tradição de fontes dos corais, como a mudança de tonalidade entre fontes mencionada na Justificativa (Seção 1.4), entram como complemento ilustrativo, e não como base principal de avaliação. O corpus contém ao menos um caso desse tipo: o coral BWV 18.5, quinto movimento da cantata BWV 18, codificado em dois arquivos que correspondem às versões de Weimar e de Leipzig da cantata. Para a apresentação em Leipzig, a cantata foi transposta para lá menor (DAHN, 2019), e os dois arquivos registram a mesma harmonização a um tom de distância. Um levantamento feito pelo autor com o music21 sobre os dois arquivos mostra que soprano e baixo são idênticos em intervalos e ritmo; no contralto e no tenor, três notas da versão de Leipzig aparecem divididas em duas notas repetidas na versão de Weimar. O par tem, portanto, gabarito completo conhecido de antemão (transposição real de dois semitons em todas as vozes e três divisões rítmicas pontuais) e testa em particular o tratamento aproximado da fragmentação por meio de </w:t>
+      </w:r>
+      <w:r>
+        <w:rPr>
+          <w:i/>
+          <w:iCs/>
+        </w:rPr>
+        <w:t>gaps</w:t>
+      </w:r>
+      <w:r>
+        <w:t xml:space="preserve"> (Seção 5.1.3).</w:t>
+      </w:r>
+    </w:p>
+    <w:p>
+      <w:pPr>
+        <w:pStyle w:val="T3-TituloTerciario"/>
+      </w:pPr>
+      <w:bookmarkStart w:id="132" w:name="__RefHeading___Toc9105_1503872338"/>
+      <w:bookmarkStart w:id="133" w:name="_Toc242031539"/>
+      <w:bookmarkEnd w:id="132"/>
+      <w:r>
+        <w:t>Parâmetros do Método de Alinhamento</w:t>
+      </w:r>
+      <w:bookmarkEnd w:id="133"/>
+    </w:p>
+    <w:p>
+      <w:pPr>
+        <w:pStyle w:val="TE-Normal"/>
+      </w:pPr>
+      <w:r>
+        <w:t xml:space="preserve">O método descrito nas seções anteriores depende de sete grupos de parâmetros: o tamanho da semente; o critério de baixa complexidade aplicado às sementes; os pesos de pontuação atribuídos a coincidências e divergências diatônicas, cromáticas e rítmicas; o custo de </w:t>
+      </w:r>
+      <w:r>
+        <w:rPr>
+          <w:i/>
+          <w:iCs/>
+        </w:rPr>
+        <w:t>gap</w:t>
+      </w:r>
+      <w:r>
+        <w:t xml:space="preserve">; o limiar de </w:t>
+      </w:r>
+      <w:r>
+        <w:rPr>
+          <w:i/>
+          <w:iCs/>
+        </w:rPr>
+        <w:t>X-drop</w:t>
+      </w:r>
+      <w:r>
+        <w:t>; o limiar de significância empírica p*, com o número de permutações P usado para estimá-lo; e o comprimento mínimo de uma correspondência reportada. Nenhum deles é fixado a priori neste trabalho. Todos serão calibrados empiricamente no TCC II, por meio de execuções piloto.</w:t>
+      </w:r>
+    </w:p>
+    <w:p>
+      <w:pPr>
+        <w:pStyle w:val="TE-Normal"/>
+      </w:pPr>
+      <w:r>
+        <w:t xml:space="preserve">Para que a calibração não contamine a avaliação, o corpus é dividido em dois subconjuntos disjuntos: um de calibração, sobre o qual os parâmetros são ajustados, e outro de avaliação, sobre o qual os critérios da Seção 5.6.4 são calculados. Sem essa </w:t>
+        <w:lastRenderedPageBreak/>
+        <w:t>separação, o desempenho medido refletiria em parte o próprio ajuste dos parâmetros aos pares avaliados.</w:t>
+      </w:r>
+    </w:p>
+    <w:p>
+      <w:pPr>
+        <w:pStyle w:val="TE-Normal"/>
+      </w:pPr>
+      <w:r>
+        <w:t xml:space="preserve">Alguns pontos de partida orientam a calibração. Para o tamanho da semente, adota-se como hipótese de trabalho que motivos relevantes nos corais têm poucos eventos, da ordem de três a cinco intervalos; a hipótese será verificada na própria calibração. Como a semente é definida apenas sobre intervalos diatônicos (Seção 5.1.2), seu tamanho pesa mais na seletividade da busca. Uma semente curta demais, somada à condução predominantemente conjunta das vozes, tende a gerar muitos </w:t>
+      </w:r>
+      <w:r>
+        <w:rPr>
+          <w:i/>
+          <w:iCs/>
+        </w:rPr>
+        <w:t>hits</w:t>
+      </w:r>
+      <w:r>
+        <w:t xml:space="preserve"> espúrios, efeito que o filtro de baixa complexidade atenua, mas não elimina. Para a significância, um ponto de partida é adotar p* = 0,01, o que equivale a exigir que o escore de uma correspondência supere o percentil 99 da distribuição de máximos obtida com as sequências permutadas (Seção 5.1.4), com P = 999 permutações, número que permite resolver valores-p de até 0,001.</w:t>
+      </w:r>
+    </w:p>
+    <w:p>
+      <w:pPr>
+        <w:pStyle w:val="TE-Normal"/>
+      </w:pPr>
+      <w:r>
+        <w:rPr>
+          <w:highlight w:val="yellow"/>
+        </w:rPr>
+        <w:t>DEFINIR NO TCC II: valores definitivos dos sete grupos de parâmetros e critério de divisão do corpus entre calibração e avaliação, conforme descrito acima</w:t>
+      </w:r>
+    </w:p>
+    <w:p>
+      <w:pPr>
+        <w:pStyle w:val="T3-TituloTerciario"/>
+      </w:pPr>
+      <w:bookmarkStart w:id="134" w:name="__RefHeading___Toc9106_1503872338"/>
+      <w:bookmarkStart w:id="135" w:name="_Toc242031540"/>
+      <w:bookmarkEnd w:id="134"/>
+      <w:r>
+        <w:t>Critérios Objetivos de Avaliação</w:t>
+      </w:r>
+      <w:bookmarkEnd w:id="135"/>
+    </w:p>
+    <w:p>
+      <w:pPr>
+        <w:pStyle w:val="TE-Normal"/>
+      </w:pPr>
+      <w:r>
+        <w:t>Em atendimento ao quinto objetivo específico deste trabalho, propõem-se os seguintes critérios objetivos para avaliação das correspondências motívicas identificadas pelo protótipo, calculáveis a partir do gabarito descrito na Seção 5.6.2:</w:t>
+      </w:r>
+    </w:p>
+    <w:p>
+      <w:pPr>
+        <w:pStyle w:val="TE-Normal"/>
+      </w:pPr>
+      <w:r>
+        <w:t xml:space="preserve">– </w:t>
+      </w:r>
+      <w:r>
+        <w:rPr>
+          <w:b/>
+        </w:rPr>
+        <w:t>Precisão</w:t>
+      </w:r>
+      <w:r>
+        <w:t>: proporção dos segmentos reportados pelo protótipo que efetivamente correspondem a um segmento do gabarito.</w:t>
+      </w:r>
+    </w:p>
+    <w:p>
+      <w:pPr>
+        <w:pStyle w:val="TE-Normal"/>
+      </w:pPr>
+      <w:r>
+        <w:t xml:space="preserve">– </w:t>
+      </w:r>
+      <w:r>
+        <w:rPr>
+          <w:b/>
+        </w:rPr>
+        <w:t>Cobertura (</w:t>
+      </w:r>
+      <w:r>
+        <w:rPr>
+          <w:b/>
+          <w:i/>
+          <w:iCs/>
+        </w:rPr>
+        <w:t>recall</w:t>
+      </w:r>
+      <w:r>
+        <w:rPr>
+          <w:b/>
+        </w:rPr>
+        <w:t>)</w:t>
+      </w:r>
+      <w:r>
+        <w:t>: proporção dos segmentos do gabarito que foram efetivamente identificados pelo protótipo.</w:t>
+      </w:r>
+    </w:p>
+    <w:p>
+      <w:pPr>
+        <w:pStyle w:val="TE-Normal"/>
+      </w:pPr>
+      <w:r>
+        <w:t xml:space="preserve">– </w:t>
+      </w:r>
+      <w:r>
+        <w:rPr>
+          <w:b/>
+        </w:rPr>
+        <w:t>Medida-F</w:t>
+      </w:r>
+      <w:r>
+        <w:t>: média harmônica entre precisão e cobertura, combinando os dois critérios anteriores em uma única medida.</w:t>
+      </w:r>
+    </w:p>
+    <w:p>
+      <w:pPr>
+        <w:pStyle w:val="TE-Normal"/>
+      </w:pPr>
+      <w:r>
+        <w:t xml:space="preserve">– </w:t>
+      </w:r>
+      <w:r>
+        <w:rPr>
+          <w:b/>
+        </w:rPr>
+        <w:t>Acurácia de classificação da transformação</w:t>
+      </w:r>
+      <w:r>
+        <w:t xml:space="preserve">: entre os segmentos corretamente identificados, a proporção em que o tipo de transformação relatado pelo protótipo (transposição, inversão, retrogradação, variação rítmica ou combinação) </w:t>
+        <w:lastRenderedPageBreak/>
+        <w:t>corresponde ao tipo efetivamente injetado.</w:t>
+      </w:r>
+    </w:p>
+    <w:p>
+      <w:pPr>
+        <w:pStyle w:val="TE-Normal"/>
+      </w:pPr>
+      <w:r>
+        <w:t>Além dessas métricas, o método é comparado a uma referência de alinhamento exato. O algoritmo de Smith-Waterman (1981) é aplicado aos mesmos pares de vozes, com o mesmo esquema de pontuação e também contra as formas Inv, Ret e RetInv da versão de consulta, de forma iterativa: a cada rodada, o trecho já alinhado é mascarado, de modo a produzir múltiplas correspondências. Seus resultados passam pelos mesmos critérios. A comparação responde à pergunta levantada na Seção 5.1.5: quanto a heurística perde em cobertura em troca das vantagens que a justificam. Para isso, mede-se a proporção das correspondências encontradas pela referência exata que também são encontradas pela heurística, ao lado do tempo de execução de cada abordagem.</w:t>
+      </w:r>
+    </w:p>
+    <w:p>
+      <w:pPr>
+        <w:pStyle w:val="TE-Normal"/>
+      </w:pPr>
+      <w:r>
+        <w:t>No segundo conjunto de teste, em que o gabarito é parcial, as métricas são calculadas apenas sobre o soprano. A cobertura mede a proporção da melodia de uma harmonização alinhada à melodia da outra, e a acurácia de classificação verifica se o intervalo de transposição relatado corresponde à diferença de tonalidade entre as duas harmonizações.</w:t>
+      </w:r>
+    </w:p>
+    <w:p>
+      <w:pPr>
+        <w:pStyle w:val="TE-Normal"/>
+      </w:pPr>
+      <w:r>
+        <w:t>Os critérios de precisão e cobertura dependem de uma definição operacional de correspondência correta: um segmento reportado pelo protótipo é considerado correto quando sua sobreposição com um segmento do gabarito — a proporção de posições em comum entre o trecho relatado e o trecho do gabarito — atinge um limiar mínimo. O valor exato desse limiar será calibrado empiricamente junto aos demais parâmetros do método (Seção 5.6.3); um ponto de partida razoável, a ajustar conforme os resultados piloto, é exigir sobreposição de ao menos metade das posições do trecho do gabarito.</w:t>
+      </w:r>
+    </w:p>
+    <w:p>
+      <w:pPr>
+        <w:pStyle w:val="TE-Normal"/>
+      </w:pPr>
+      <w:r>
+        <w:t xml:space="preserve">A unidade de avaliação é, portanto, o segmento rotulado (Seção 5.1.4), e não a correspondência inteira. Como o gabarito inclui os trechos não transformados, um segmento idêntico reportado sobre um trecho inalterado conta como acerto, e não como falso positivo. Para que esses segmentos, que formam a maior parte de cada voz, não inflem os resultados, as métricas são calculadas também separadamente sobre os segmentos transformados e por tipo de transformação, que são o objeto principal da avaliação.</w:t>
+      </w:r>
+    </w:p>
+    <w:p>
+      <w:pPr>
+        <w:pStyle w:val="TE-Normal"/>
+      </w:pPr>
+      <w:r>
+        <w:t>Consistente com a Delimitação do problema (Seção 1.2) e com o quinto objetivo específico, este trabalho propõe esses critérios, a serem aplicados preliminarmente aos resultados obtidos após a implementação do protótipo, no TCC II; mesmo então, esses critérios não constituirão uma validação experimental extensiva sobre a totalidade do corpus.</w:t>
+      </w:r>
+    </w:p>
+    <w:p>
+      <w:pPr>
+        <w:pStyle w:val="T2-TituloSecundario"/>
+      </w:pPr>
       <w:bookmarkStart w:id="120" w:name="__RefHeading___Toc9009_1503872338"/>
       <w:bookmarkStart w:id="121" w:name="_Toc242031534"/>
       <w:bookmarkEnd w:id="120"/>
@@ -9841,609 +10332,10 @@
           <w:i/>
           <w:iCs/>
         </w:rPr>
-        <w:t>seed-and-extend</w:t>
-      </w:r>
-      <w:r>
-        <w:t xml:space="preserve"> do BLAST (Capítulo 3) ao domínio simbólico musical. A modelagem aqui apresentada situa-se no nível arquitetural; os parâmetros concretos do algoritmo — tamanho da semente, limiar de </w:t>
-      </w:r>
-      <w:r>
-        <w:rPr>
-          <w:i/>
-          <w:iCs/>
-        </w:rPr>
-        <w:t>X-drop</w:t>
-      </w:r>
-      <w:r>
-        <w:t xml:space="preserve">, pesos de pontuação, custo de </w:t>
-      </w:r>
-      <w:r>
-        <w:rPr>
-          <w:i/>
-          <w:iCs/>
-        </w:rPr>
-        <w:t>gap</w:t>
-      </w:r>
-      <w:r>
-        <w:t>, critério de baixa complexidade, limiar de significância e comprimento mínimo — e os critérios objetivos de avaliação das correspondências encontradas são detalhados no capítulo seguinte, de Procedimentos Metodológicos, que também especifica como os pares de versões usados nos testes serão constituídos.</w:t>
-      </w:r>
-    </w:p>
-    <w:p>
-      <w:pPr>
-        <w:rPr>
-          <w:sz w:val="26"/>
-        </w:rPr>
-      </w:pPr>
-      <w:r>
-        <w:br w:type="page"/>
-      </w:r>
-    </w:p>
-    <w:p>
-      <w:pPr>
-        <w:pStyle w:val="T1-TituloPrimario"/>
-      </w:pPr>
-      <w:bookmarkStart w:id="122" w:name="__RefHeading___Toc9101_1503872338"/>
-      <w:bookmarkStart w:id="123" w:name="_Toc242031535"/>
-      <w:bookmarkEnd w:id="122"/>
-      <w:r>
-        <w:lastRenderedPageBreak/>
-        <w:t>PROCEDIMENTOS METODOLÓGICOS</w:t>
-      </w:r>
-      <w:bookmarkEnd w:id="123"/>
-    </w:p>
-    <w:p>
-      <w:pPr>
-        <w:pStyle w:val="TE-Normal"/>
-      </w:pPr>
-      <w:r>
-        <w:t>Este capítulo detalha os procedimentos metodológicos que orientam o desenvolvimento deste trabalho: a classificação da pesquisa, a caracterização do corpus, a estratégia de construção dos pares de versões usados nos testes, os parâmetros do método de alinhamento, os critérios objetivos propostos para avaliação dos resultados e a sequência de etapas que conecta esses elementos aos objetivos específicos definidos no Capítulo 1.</w:t>
-      </w:r>
-    </w:p>
-    <w:p>
-      <w:pPr>
-        <w:pStyle w:val="T2-TituloSecundario"/>
-      </w:pPr>
-      <w:bookmarkStart w:id="124" w:name="__RefHeading___Toc9102_1503872338"/>
-      <w:bookmarkStart w:id="125" w:name="_Toc242031536"/>
-      <w:bookmarkEnd w:id="124"/>
-      <w:r>
-        <w:t>Classificação da Pesquisa</w:t>
-      </w:r>
-      <w:bookmarkEnd w:id="125"/>
-    </w:p>
-    <w:p>
-      <w:pPr>
-        <w:pStyle w:val="TE-Normal"/>
-      </w:pPr>
-      <w:commentRangeStart w:id="126"/>
-      <w:commentRangeStart w:id="127"/>
-      <w:r>
-        <w:t>Quanto aos objetivos, esta pesquisa classifica-se como exploratória (GIL, 2002): investiga um problema — a correspondência motívica entre versões simbólicas de uma composição — ainda pouco explorado na literatura consultada, sem hipóteses prévias a testar estatisticamente, buscando antes formular e especificar um método viável. Quanto à natureza, é aplicada: propõe um método com aplicação direta à preparação de edições críticas e à curadoria de acervos digitais de partituras simbólicas, conforme justificado no Capítulo 1. Quanto aos procedimentos técnicos, combina pesquisa bibliográfica (Capítulos 2 a 4) com o desenvolvimento de um protótipo de software (Capítulo 5).</w:t>
-      </w:r>
-      <w:commentRangeEnd w:id="126"/>
-      <w:commentRangeEnd w:id="127"/>
-      <w:r>
-        <w:commentReference w:id="126"/>
-        <w:commentReference w:id="127"/>
-      </w:r>
-    </w:p>
-    <w:p>
-      <w:pPr>
-        <w:pStyle w:val="TE-Normal"/>
-      </w:pPr>
-      <w:r>
-        <w:t>As seções seguintes descrevem como o trabalho é executado, com detalhe suficiente para que outro pesquisador possa reproduzi-lo: o corpus utilizado (Seção 6.2), a construção dos pares de versões para teste (Seção 6.3), os parâmetros do método (Seção 6.4), os critérios de avaliação (Seção 6.5) e a sequência de etapas que conecta esses elementos aos objetivos específicos (Seção 6.6).</w:t>
-      </w:r>
-    </w:p>
-    <w:p>
-      <w:pPr>
-        <w:pStyle w:val="T2-TituloSecundario"/>
-      </w:pPr>
-      <w:bookmarkStart w:id="128" w:name="__RefHeading___Toc9103_1503872338"/>
-      <w:bookmarkStart w:id="129" w:name="_Toc242031537"/>
-      <w:bookmarkEnd w:id="128"/>
-      <w:r>
-        <w:lastRenderedPageBreak/>
-        <w:t>Corpus</w:t>
-      </w:r>
-      <w:bookmarkEnd w:id="129"/>
-    </w:p>
-    <w:p>
-      <w:pPr>
-        <w:pStyle w:val="TE-Normal"/>
-      </w:pPr>
-      <w:r>
-        <w:t>O corpus deste trabalho é composto pelos corais a quatro vozes de J. S. Bach distribuídos com o music21 (CUTHBERT; ARIZA, 2010). A coleção de referência desses corais, na numeração de Riemenschneider, reúne 371 peças, mas nem todas estão disponíveis na biblioteca. Um levantamento preliminar feito pelo autor sobre a versão 10.5 do music21 identificou 433 arquivos atribuídos a Bach, dos quais 365, em MusicXML, correspondem a corais a quatro vozes.</w:t>
-      </w:r>
-      <w:r>
-        <w:rPr>
-          <w:rStyle w:val="Refdenotaderodap"/>
-        </w:rPr>
-        <w:footnoteReference w:id="3"/>
-      </w:r>
-      <w:r>
-        <w:t xml:space="preserve"> Esse é o conjunto efetivamente utilizado. O corpus é de domínio público e distribuído nativamente em MusicXML pela ferramenta, o que dispensa etapas de conversão de formato para o protótipo descrito no Capítulo 5. Arquivos que codificam o mesmo coral em formatos diferentes são tratados como duplicatas e excluídos.</w:t>
-      </w:r>
-    </w:p>
-    <w:p>
-      <w:pPr>
-        <w:pStyle w:val="T2-TituloSecundario"/>
-      </w:pPr>
-      <w:bookmarkStart w:id="130" w:name="__RefHeading___Toc9104_1503872338"/>
-      <w:bookmarkStart w:id="131" w:name="_Toc242031538"/>
-      <w:bookmarkEnd w:id="130"/>
-      <w:r>
-        <w:t>Construção dos Pares de Versões para Teste</w:t>
-      </w:r>
-      <w:bookmarkEnd w:id="131"/>
-    </w:p>
-    <w:p>
-      <w:pPr>
-        <w:pStyle w:val="TE-Normal"/>
-      </w:pPr>
-      <w:r>
-        <w:t>Conforme indicado na Delimitação do Escopo (Capítulo 1), os pares de versões usados para testar o protótipo podem ser constituídos a partir de variantes documentadas na tradição de fontes dos corais, de transformações geradas programaticamente sobre o corpus, de harmonizações diferentes de uma mesma melodia, ou de uma combinação dessas fontes. Este trabalho adota dois conjuntos de teste complementares. O primeiro, e principal, é construído programaticamente: a partir de um coral do corpus (Versão A), gera-se uma Versão B aplicando, a um ou mais trechos motívicos selecionados, uma ou mais das transformações consideradas (transposição, inversão, retrogradação, variação rítmica e inserção ou remoção de notas), mantendo o restante da voz estruturalmente inalterado. A localização exata e o tipo de transformação aplicada em cada par gerado são registrados como gabarito (</w:t>
-      </w:r>
-      <w:r>
-        <w:rPr>
-          <w:i/>
-          <w:iCs/>
-        </w:rPr>
-        <w:t>ground truth</w:t>
-      </w:r>
-      <w:r>
-        <w:t xml:space="preserve">) — informação indisponível quando se depende exclusivamente de variantes históricas reais, mas indispensável para o cálculo dos critérios objetivos de </w:t>
-        <w:lastRenderedPageBreak/>
-        <w:t>avaliação propostos na Seção 6.5. No caso da transposição, o gabarito registra também se ela é real ou tonal (Seção 5.1.4). Os trechos não transformados também integram o gabarito, como segmentos idênticos entre as duas versões.</w:t>
-      </w:r>
-    </w:p>
-    <w:p>
-      <w:pPr>
-        <w:pStyle w:val="TE-Normal"/>
-      </w:pPr>
-      <w:r>
-        <w:t>Essa estratégia tem uma limitação metodológica que vale reconhecer: os mesmos mecanismos que o protótipo usa para tolerar as quatro transformações consideradas — invariância por construção da representação, no caso da transposição; indexação de variantes, no caso de inversão e retrogradação; tolerância na etapa de pontuação, no caso da variação rítmica; e extensão com gaps, no caso da inserção ou remoção de notas (Seção 5.1) — são também os mecanismos usados para gerar os pares de teste sintéticos. Por isso, o desempenho do protótipo sobre esses pares valida principalmente a correção da implementação de cada mecanismo, não necessariamente sua capacidade de generalizar para variantes reais e não documentadas, que podem envolver combinações de transformações mais complexas ou irregularidades que esses mecanismos não antecipam. Essa limitação é inerente à etapa de design deste trabalho. O segundo conjunto de teste, descrito a seguir, a mitiga parcialmente; a inclusão de transformações não triviais nos pares sintéticos fica como direção para trabalhos futuros.</w:t>
-      </w:r>
-    </w:p>
-    <w:p>
-      <w:pPr>
-        <w:pStyle w:val="TE-Normal"/>
-      </w:pPr>
-      <w:r>
-        <w:t>O segundo conjunto de teste é formado por pares reais extraídos do próprio corpus. Bach harmonizou muitas melodias de coral mais de uma vez, em obras e tonalidades diferentes. A melodia conhecida como coral da Paixão, por exemplo, aparece harmonizada cinco vezes na Paixão segundo São Mateus (BWV 244.15, 244.17, 244.44, 244.54 e 244.62), além de outras harmonizações no mesmo corpus. Um levantamento preliminar feito pelo autor agrupou os corais cujo soprano começa pela mesma sequência de dez intervalos diatônicos e identificou 63 melodias com duas ou mais harmonizações, somando 175 arquivos. A contagem é conservadora, porque o critério não agrupa harmonizações cujo início difere por uma nota de passagem. É o caso do próprio BWV 244.62, cujo soprano se afasta das demais harmonizações já no nono intervalo: ele não entra na contagem, mas é incluído no conjunto de teste por identificação direta. Conforme a definição apresentada na Delimitação do Escopo (Capítulo 1), harmonizações diferentes de uma mesma melodia são tratadas como versões dessa melodia.</w:t>
-      </w:r>
-    </w:p>
-    <w:p>
-      <w:pPr>
-        <w:pStyle w:val="TE-Normal"/>
-      </w:pPr>
-      <w:r>
-        <w:t xml:space="preserve">Esses pares não têm gabarito completo, mas têm um gabarito parcial conhecido de antemão: o soprano de uma harmonização deve corresponder, do início ao fim, ao soprano da outra, com um intervalo de transposição dado pela diferença de </w:t>
-        <w:lastRenderedPageBreak/>
-        <w:t>tonalidade. Contêm também variantes reais que o método precisa absorver. Entre as harmonizações do coral da Paixão, o soprano varia de 42 a 56 notas na codificação do corpus, o que indica notas de passagem e alterações rítmicas acrescentadas, e o BWV 244.62, como já observado, diverge das demais a partir do nono intervalo. As vozes internas, por outro lado, são reescritas a cada harmonização e não têm gabarito; as correspondências encontradas nelas são examinadas qualitativamente. Esse conjunto não substitui os pares sintéticos, mas testa o método sobre variações que ele próprio não gerou.</w:t>
-      </w:r>
-    </w:p>
-    <w:p>
-      <w:pPr>
-        <w:pStyle w:val="TE-Normal"/>
-      </w:pPr>
-      <w:r>
-        <w:t xml:space="preserve">Variantes documentadas na tradição de fontes dos corais, como a mudança de tonalidade entre fontes mencionada na Justificativa (Capítulo 1), entram como complemento ilustrativo, e não como base principal de avaliação. O corpus contém ao menos um caso desse tipo: o coral BWV 18.5, quinto movimento da cantata BWV 18, codificado em dois arquivos que correspondem às versões de Weimar e de Leipzig da cantata. Para a apresentação em Leipzig, a cantata foi transposta para lá menor (DAHN, 2019), e os dois arquivos registram a mesma harmonização a um tom de distância. Um levantamento feito pelo autor com o music21 sobre os dois arquivos mostra que soprano e baixo são idênticos em intervalos e ritmo; no contralto e no tenor, três notas da versão de Leipzig aparecem divididas em duas notas repetidas na versão de Weimar. O par tem, portanto, gabarito completo conhecido de antemão (transposição real de dois semitons em todas as vozes e três divisões rítmicas pontuais) e testa em particular o tratamento aproximado da fragmentação por meio de </w:t>
-      </w:r>
-      <w:r>
-        <w:rPr>
-          <w:i/>
-          <w:iCs/>
-        </w:rPr>
-        <w:t>gaps</w:t>
-      </w:r>
-      <w:r>
-        <w:t xml:space="preserve"> (Seção 5.1.3).</w:t>
-      </w:r>
-    </w:p>
-    <w:p>
-      <w:pPr>
-        <w:pStyle w:val="T2-TituloSecundario"/>
-      </w:pPr>
-      <w:bookmarkStart w:id="132" w:name="__RefHeading___Toc9105_1503872338"/>
-      <w:bookmarkStart w:id="133" w:name="_Toc242031539"/>
-      <w:bookmarkEnd w:id="132"/>
-      <w:r>
-        <w:t>Parâmetros do Método de Alinhamento</w:t>
-      </w:r>
-      <w:bookmarkEnd w:id="133"/>
-    </w:p>
-    <w:p>
-      <w:pPr>
-        <w:pStyle w:val="TE-Normal"/>
-      </w:pPr>
-      <w:r>
-        <w:t xml:space="preserve">O método descrito no Capítulo 5 depende de sete grupos de parâmetros: o tamanho da semente; o critério de baixa complexidade aplicado às sementes; os pesos de pontuação atribuídos a coincidências e divergências diatônicas, cromáticas e rítmicas; o custo de </w:t>
-      </w:r>
-      <w:r>
-        <w:rPr>
-          <w:i/>
-          <w:iCs/>
-        </w:rPr>
-        <w:t>gap</w:t>
-      </w:r>
-      <w:r>
-        <w:t xml:space="preserve">; o limiar de </w:t>
-      </w:r>
-      <w:r>
-        <w:rPr>
-          <w:i/>
-          <w:iCs/>
-        </w:rPr>
-        <w:t>X-drop</w:t>
-      </w:r>
-      <w:r>
-        <w:t>; o limiar de significância empírica p*, com o número de permutações P usado para estimá-lo; e o comprimento mínimo de uma correspondência reportada. Nenhum deles é fixado a priori neste trabalho. Todos serão calibrados empiricamente no TCC II, por meio de execuções piloto.</w:t>
-      </w:r>
-    </w:p>
-    <w:p>
-      <w:pPr>
-        <w:pStyle w:val="TE-Normal"/>
-      </w:pPr>
-      <w:r>
-        <w:t xml:space="preserve">Para que a calibração não contamine a avaliação, o corpus é dividido em dois subconjuntos disjuntos: um de calibração, sobre o qual os parâmetros são ajustados, e outro de avaliação, sobre o qual os critérios da Seção 6.5 são calculados. Sem essa </w:t>
-        <w:lastRenderedPageBreak/>
-        <w:t>separação, o desempenho medido refletiria em parte o próprio ajuste dos parâmetros aos pares avaliados.</w:t>
-      </w:r>
-    </w:p>
-    <w:p>
-      <w:pPr>
-        <w:pStyle w:val="TE-Normal"/>
-      </w:pPr>
-      <w:r>
-        <w:t xml:space="preserve">Alguns pontos de partida orientam a calibração. Para o tamanho da semente, adota-se como hipótese de trabalho que motivos relevantes nos corais têm poucos eventos, da ordem de três a cinco intervalos; a hipótese será verificada na própria calibração. Como a semente é definida apenas sobre intervalos diatônicos (Seção 5.1.2), seu tamanho pesa mais na seletividade da busca. Uma semente curta demais, somada à condução predominantemente conjunta das vozes, tende a gerar muitos </w:t>
-      </w:r>
-      <w:r>
-        <w:rPr>
-          <w:i/>
-          <w:iCs/>
-        </w:rPr>
-        <w:t>hits</w:t>
-      </w:r>
-      <w:r>
-        <w:t xml:space="preserve"> espúrios, efeito que o filtro de baixa complexidade atenua, mas não elimina. Para a significância, um ponto de partida é adotar p* = 0,01, o que equivale a exigir que o escore de uma correspondência supere o percentil 99 da distribuição de máximos obtida com as sequências permutadas (Seção 5.1.4), com P = 999 permutações, número que permite resolver valores-p de até 0,001.</w:t>
-      </w:r>
-    </w:p>
-    <w:p>
-      <w:pPr>
-        <w:pStyle w:val="TE-Normal"/>
-      </w:pPr>
-      <w:r>
-        <w:rPr>
-          <w:highlight w:val="yellow"/>
-        </w:rPr>
-        <w:t>DEFINIR NO TCC II: valores definitivos dos sete grupos de parâmetros e critério de divisão do corpus entre calibração e avaliação, conforme descrito acima</w:t>
-      </w:r>
-    </w:p>
-    <w:p>
-      <w:pPr>
-        <w:pStyle w:val="T2-TituloSecundario"/>
-      </w:pPr>
-      <w:bookmarkStart w:id="134" w:name="__RefHeading___Toc9106_1503872338"/>
-      <w:bookmarkStart w:id="135" w:name="_Toc242031540"/>
-      <w:bookmarkEnd w:id="134"/>
-      <w:r>
-        <w:t>Critérios Objetivos de Avaliação</w:t>
-      </w:r>
-      <w:bookmarkEnd w:id="135"/>
-    </w:p>
-    <w:p>
-      <w:pPr>
-        <w:pStyle w:val="TE-Normal"/>
-      </w:pPr>
-      <w:r>
-        <w:t>Em atendimento ao quinto objetivo específico deste trabalho, propõem-se os seguintes critérios objetivos para avaliação das correspondências motívicas identificadas pelo protótipo, calculáveis a partir do gabarito descrito na Seção 6.3:</w:t>
-      </w:r>
-    </w:p>
-    <w:p>
-      <w:pPr>
-        <w:pStyle w:val="TE-Normal"/>
-      </w:pPr>
-      <w:r>
-        <w:t xml:space="preserve">– </w:t>
-      </w:r>
-      <w:r>
-        <w:rPr>
-          <w:b/>
-        </w:rPr>
-        <w:t>Precisão</w:t>
-      </w:r>
-      <w:r>
-        <w:t>: proporção dos segmentos reportados pelo protótipo que efetivamente correspondem a um segmento do gabarito.</w:t>
-      </w:r>
-    </w:p>
-    <w:p>
-      <w:pPr>
-        <w:pStyle w:val="TE-Normal"/>
-      </w:pPr>
-      <w:r>
-        <w:t xml:space="preserve">– </w:t>
-      </w:r>
-      <w:r>
-        <w:rPr>
-          <w:b/>
-        </w:rPr>
-        <w:t>Cobertura (</w:t>
-      </w:r>
-      <w:r>
-        <w:rPr>
-          <w:b/>
-          <w:i/>
-          <w:iCs/>
-        </w:rPr>
-        <w:t>recall</w:t>
-      </w:r>
-      <w:r>
-        <w:rPr>
-          <w:b/>
-        </w:rPr>
-        <w:t>)</w:t>
-      </w:r>
-      <w:r>
-        <w:t>: proporção dos segmentos do gabarito que foram efetivamente identificados pelo protótipo.</w:t>
-      </w:r>
-    </w:p>
-    <w:p>
-      <w:pPr>
-        <w:pStyle w:val="TE-Normal"/>
-      </w:pPr>
-      <w:r>
-        <w:t xml:space="preserve">– </w:t>
-      </w:r>
-      <w:r>
-        <w:rPr>
-          <w:b/>
-        </w:rPr>
-        <w:t>Medida-F</w:t>
-      </w:r>
-      <w:r>
-        <w:t>: média harmônica entre precisão e cobertura, combinando os dois critérios anteriores em uma única medida.</w:t>
-      </w:r>
-    </w:p>
-    <w:p>
-      <w:pPr>
-        <w:pStyle w:val="TE-Normal"/>
-      </w:pPr>
-      <w:r>
-        <w:t xml:space="preserve">– </w:t>
-      </w:r>
-      <w:r>
-        <w:rPr>
-          <w:b/>
-        </w:rPr>
-        <w:t>Acurácia de classificação da transformação</w:t>
-      </w:r>
-      <w:r>
-        <w:t xml:space="preserve">: entre os segmentos corretamente identificados, a proporção em que o tipo de transformação relatado pelo protótipo (transposição, inversão, retrogradação, variação rítmica ou combinação) </w:t>
-        <w:lastRenderedPageBreak/>
-        <w:t>corresponde ao tipo efetivamente injetado.</w:t>
-      </w:r>
-    </w:p>
-    <w:p>
-      <w:pPr>
-        <w:pStyle w:val="TE-Normal"/>
-      </w:pPr>
-      <w:r>
-        <w:t>Além dessas métricas, o método é comparado a uma referência de alinhamento exato. O algoritmo de Smith-Waterman (1981) é aplicado aos mesmos pares de vozes, com o mesmo esquema de pontuação e também contra as formas Inv, Ret e RetInv da versão de consulta, de forma iterativa: a cada rodada, o trecho já alinhado é mascarado, de modo a produzir múltiplas correspondências. Seus resultados passam pelos mesmos critérios. A comparação responde à pergunta levantada na Seção 5.1.5: quanto a heurística perde em cobertura em troca das vantagens que a justificam. Para isso, mede-se a proporção das correspondências encontradas pela referência exata que também são encontradas pela heurística, ao lado do tempo de execução de cada abordagem.</w:t>
-      </w:r>
-    </w:p>
-    <w:p>
-      <w:pPr>
-        <w:pStyle w:val="TE-Normal"/>
-      </w:pPr>
-      <w:r>
-        <w:t>No segundo conjunto de teste, em que o gabarito é parcial, as métricas são calculadas apenas sobre o soprano. A cobertura mede a proporção da melodia de uma harmonização alinhada à melodia da outra, e a acurácia de classificação verifica se o intervalo de transposição relatado corresponde à diferença de tonalidade entre as duas harmonizações.</w:t>
-      </w:r>
-    </w:p>
-    <w:p>
-      <w:pPr>
-        <w:pStyle w:val="TE-Normal"/>
-      </w:pPr>
-      <w:r>
-        <w:t>Os critérios de precisão e cobertura dependem de uma definição operacional de correspondência correta: um segmento reportado pelo protótipo é considerado correto quando sua sobreposição com um segmento do gabarito — a proporção de posições em comum entre o trecho relatado e o trecho do gabarito — atinge um limiar mínimo. O valor exato desse limiar será calibrado empiricamente junto aos demais parâmetros do método (Seção 6.4); um ponto de partida razoável, a ajustar conforme os resultados piloto, é exigir sobreposição de ao menos metade das posições do trecho do gabarito.</w:t>
-      </w:r>
-    </w:p>
-    <w:p>
-      <w:pPr>
-        <w:pStyle w:val="TE-Normal"/>
-      </w:pPr>
-      <w:r>
-        <w:t xml:space="preserve">A unidade de avaliação é, portanto, o segmento rotulado (Seção 5.1.4), e não a correspondência inteira. Como o gabarito inclui os trechos não transformados, um segmento idêntico reportado sobre um trecho inalterado conta como acerto, e não como falso positivo. Para que esses segmentos, que formam a maior parte de cada voz, não inflem os resultados, as métricas são calculadas também separadamente sobre os segmentos transformados e por tipo de transformação, que são o objeto principal da avaliação.</w:t>
-      </w:r>
-    </w:p>
-    <w:p>
-      <w:pPr>
-        <w:pStyle w:val="TE-Normal"/>
-      </w:pPr>
-      <w:r>
-        <w:t>Consistente com a Delimitação do Escopo (Capítulo 1) e com o quinto objetivo específico, este trabalho propõe esses critérios, a serem aplicados preliminarmente aos resultados obtidos após a implementação do protótipo, no TCC II; mesmo então, esses critérios não constituirão uma validação experimental extensiva sobre a totalidade do corpus.</w:t>
-      </w:r>
-    </w:p>
-    <w:p>
-      <w:pPr>
-        <w:pStyle w:val="T2-TituloSecundario"/>
-      </w:pPr>
-      <w:bookmarkStart w:id="136" w:name="__RefHeading___Toc9107_1503872338"/>
-      <w:bookmarkStart w:id="137" w:name="_Toc242031541"/>
-      <w:bookmarkEnd w:id="136"/>
-      <w:r>
-        <w:t>Etapas de Desenvolvimento</w:t>
-      </w:r>
-      <w:bookmarkEnd w:id="137"/>
-    </w:p>
-    <w:p>
-      <w:pPr>
-        <w:pStyle w:val="TE-Normal"/>
-      </w:pPr>
-      <w:r>
-        <w:lastRenderedPageBreak/>
-        <w:t>O trabalho é executado em oito etapas, que desdobram os sete objetivos específicos definidos no Capítulo 1. As etapas 1 a 4 compõem o TCC I, objeto deste documento; as etapas 5 a 8, o TCC II. O cronograma correspondente é apresentado no Capítulo 7.</w:t>
-      </w:r>
-    </w:p>
-    <w:p>
-      <w:pPr>
-        <w:pStyle w:val="TE-Normal"/>
-      </w:pPr>
-      <w:r>
-        <w:rPr>
-          <w:b/>
-          <w:bCs/>
-        </w:rPr>
-        <w:t>Etapa 1 – Revisão bibliográfica (objetivo a; TCC I).</w:t>
-      </w:r>
-      <w:r>
-        <w:t xml:space="preserve"> Levantamento e análise da fundamentação teórico-musical sobre transformação motívica (Capítulo 2), dos algoritmos de alinhamento de sequências (Capítulo 3) e dos trabalhos computacionais relacionados em música simbólica (Capítulo 4), para situar o método proposto e delimitar sua contribuição.</w:t>
-      </w:r>
-    </w:p>
-    <w:p>
-      <w:pPr>
-        <w:pStyle w:val="TE-Normal"/>
-      </w:pPr>
-      <w:r>
-        <w:rPr>
-          <w:b/>
-          <w:bCs/>
-        </w:rPr>
-        <w:t>Etapa 2 – Especificação da representação (objetivo b; TCC I).</w:t>
-      </w:r>
-      <w:r>
-        <w:t xml:space="preserve"> Definição da representação de cada voz por intervalos diatônicos, intervalos cromáticos e proporções rítmicas, com as alturas absolutas guardadas à parte, e das operações que derivam dessa representação as formas sob inversão, retrogradação e retrógrado da inversão (Seção 5.1.1).</w:t>
-      </w:r>
-    </w:p>
-    <w:p>
-      <w:pPr>
-        <w:pStyle w:val="TE-Normal"/>
-      </w:pPr>
-      <w:r>
-        <w:rPr>
-          <w:b/>
-          <w:bCs/>
-        </w:rPr>
-        <w:t>Etapa 3 – Adaptação da heurística e modelagem do protótipo (objetivos c e d; TCC I).</w:t>
-      </w:r>
-      <w:r>
-        <w:t xml:space="preserve"> Adaptação da estratégia </w:t>
-      </w:r>
-      <w:r>
-        <w:rPr>
-          <w:i/>
-          <w:iCs/>
-        </w:rPr>
-        <w:t>seed-and-extend</w:t>
-      </w:r>
-      <w:r>
-        <w:t xml:space="preserve"> ao domínio musical — sementes com filtro de baixa complexidade, indexação de variantes, extensão com </w:t>
-      </w:r>
-      <w:r>
-        <w:rPr>
-          <w:i/>
-          <w:iCs/>
-        </w:rPr>
-        <w:t>gaps</w:t>
-      </w:r>
-      <w:r>
-        <w:t xml:space="preserve"> e X-drop e filtragem por significância empírica (Seções 5.1.2 a 5.1.5) — e sua tradução em requisitos, casos de uso, componentes e classes (Seções 5.2 a 5.5).</w:t>
-      </w:r>
-    </w:p>
-    <w:p>
-      <w:pPr>
-        <w:pStyle w:val="TE-Normal"/>
-      </w:pPr>
-      <w:r>
-        <w:rPr>
-          <w:b/>
-          <w:bCs/>
-        </w:rPr>
-        <w:t>Etapa 4 – Definição dos critérios de avaliação (objetivo e; TCC I).</w:t>
-      </w:r>
-      <w:r>
-        <w:t xml:space="preserve"> Definição dos dois conjuntos de teste (Seção 6.3), dos parâmetros a calibrar (Seção 6.4) e dos critérios de avaliação, com a referência de Smith-Waterman (Seção 6.5).</w:t>
-      </w:r>
-    </w:p>
-    <w:p>
-      <w:pPr>
-        <w:pStyle w:val="TE-Normal"/>
-      </w:pPr>
-      <w:r>
-        <w:rPr>
-          <w:b/>
-          <w:bCs/>
-        </w:rPr>
-        <w:t>Etapa 5 – Implementação do protótipo (objetivo f; TCC II).</w:t>
-      </w:r>
-      <w:r>
-        <w:t xml:space="preserve"> Implementação dos seis componentes em Python, com o music21, na ordem do fluxo de dados da Figura 4, e da referência de Smith-Waterman iterativo. Cada componente é verificado isoladamente antes da integração, com casos cujo resultado é conhecido de antemão — por exemplo, uma voz comparada com sua própria transposição deve produzir uma correspondência que cubra a voz inteira, rotulada como transposição com o intervalo correto.</w:t>
-      </w:r>
-    </w:p>
-    <w:p>
-      <w:pPr>
-        <w:pStyle w:val="TE-Normal"/>
-      </w:pPr>
-      <w:r>
-        <w:rPr>
-          <w:b/>
-          <w:bCs/>
-        </w:rPr>
-        <w:t>Etapa 6 – Construção dos conjuntos de teste (objetivo g; TCC II).</w:t>
-      </w:r>
-      <w:r>
-        <w:t xml:space="preserve"> Divisão do corpus em subconjuntos de calibração e de avaliação (Seção 6.4), geração </w:t>
-        <w:lastRenderedPageBreak/>
-        <w:t>dos pares sintéticos com seu gabarito e seleção das harmonizações diferentes de uma mesma melodia (Seção 6.3).</w:t>
-      </w:r>
-    </w:p>
-    <w:p>
-      <w:pPr>
-        <w:pStyle w:val="TE-Normal"/>
-      </w:pPr>
-      <w:r>
-        <w:rPr>
-          <w:b/>
-          <w:bCs/>
-        </w:rPr>
-        <w:t>Etapa 7 – Calibração dos parâmetros (objetivo g; TCC II).</w:t>
-      </w:r>
-      <w:r>
-        <w:t xml:space="preserve"> Execuções piloto sobre o subconjunto de calibração para fixar os sete grupos de parâmetros do método (Seção 6.4).</w:t>
-      </w:r>
-    </w:p>
-    <w:p>
-      <w:pPr>
-        <w:pStyle w:val="TE-Normal"/>
-      </w:pPr>
-      <w:r>
-        <w:rPr>
-          <w:b/>
-          <w:bCs/>
-        </w:rPr>
-        <w:t>Etapa 8 – Avaliação preliminar e análise (objetivo g; TCC II).</w:t>
-      </w:r>
-      <w:r>
-        <w:t xml:space="preserve"> Execução do método e da referência de Smith-Waterman sobre o subconjunto de avaliação, cálculo dos critérios da Seção 6.5 — no conjunto e por tipo de transformação — e análise dos erros, com atenção às correspondências não encontradas e às espúrias, para identificar limitações do método.</w:t>
-      </w:r>
-    </w:p>
-    <w:p>
-      <w:pPr>
-        <w:pStyle w:val="T2-TituloSecundario"/>
-      </w:pPr>
-      <w:bookmarkStart w:id="138" w:name="__RefHeading___Toc9108_1503872338"/>
-      <w:bookmarkStart w:id="139" w:name="_Toc242031542"/>
-      <w:bookmarkEnd w:id="138"/>
-      <w:r>
-        <w:t>Considerações do Capítulo</w:t>
-      </w:r>
-      <w:bookmarkEnd w:id="139"/>
-    </w:p>
-    <w:p>
-      <w:pPr>
-        <w:pStyle w:val="TE-Normal"/>
-      </w:pPr>
-      <w:r>
-        <w:t>Os procedimentos metodológicos que orientam a execução deste trabalho foram estabelecidos neste capítulo: a classificação da pesquisa como exploratória e aplicada; a caracterização do corpus de corais de Bach disponível no music21; dois conjuntos de teste complementares, um de pares sintéticos com gabarito completo e outro de harmonizações diferentes de uma mesma melodia, com gabarito parcial; os sete grupos de parâmetros do método, a serem calibrados no TCC II sobre um subconjunto do corpus separado do usado na avaliação; os critérios objetivos de avaliação — precisão, cobertura, medida-F e acurácia de classificação —, acompanhados da comparação com o Smith-Waterman como referência exata, que respondem diretamente ao quinto objetivo específico deste trabalho; e as oito etapas de execução, divididas entre o TCC I e o TCC II. O capítulo seguinte detalha o cronograma que organiza essas etapas.</w:t>
+        <w:t xml:space="preserve">seed-and-extend</w:t>
+      </w:r>
+      <w:r>
+        <w:t xml:space="preserve"> do BLAST (Capítulo 3) ao domínio simbólico musical. O capítulo planejou também a avaliação do método: dois conjuntos de teste complementares, um de pares sintéticos com gabarito completo e outro de harmonizações diferentes de uma mesma melodia, com gabarito parcial; os sete grupos de parâmetros, a calibrar no TCC II sobre um subconjunto do corpus separado do usado na avaliação; e os critérios objetivos de avaliação, acompanhados da comparação com o Smith-Waterman como referência exata. O capítulo seguinte apresenta o cronograma que organiza essas etapas.</w:t>
       </w:r>
     </w:p>
     <w:p>
@@ -10790,7 +10682,7 @@
               <w:pStyle w:val="TE-CorpoTabela"/>
             </w:pPr>
             <w:r>
-              <w:t>Procedimentos metodológicos (Capítulo 6)</w:t>
+              <w:t>Procedimentos metodológicos (Seções 1.5 e 5.6)</w:t>
             </w:r>
           </w:p>
         </w:tc>
@@ -10857,7 +10749,7 @@
               <w:pStyle w:val="TE-CorpoTabela"/>
             </w:pPr>
             <w:r>
-              <w:t>Cronograma (Capítulo 7)</w:t>
+              <w:t>Cronograma e orçamento (Capítulos 6 e 7)</w:t>
             </w:r>
           </w:p>
         </w:tc>
@@ -11036,7 +10928,7 @@
       </w:pPr>
       <w:r>
         <w:lastRenderedPageBreak/>
-        <w:t>O TCC II abrange a implementação do protótipo, a construção dos conjuntos de teste e a aplicação preliminar dos critérios de avaliação — etapas já delimitadas nos Capítulos 5 e 6, mas cujo calendário depende do cronograma institucional da disciplina, ainda não divulgado. O Quadro 8 apresenta essas etapas em ordem sequencial de dependência, sem semanas fixas.</w:t>
+        <w:t>O TCC II abrange a implementação do protótipo, a construção dos conjuntos de teste e a aplicação preliminar dos critérios de avaliação — etapas já delimitadas no Capítulo 5 e na Seção 1.5, mas cujo calendário depende do cronograma institucional da disciplina, ainda não divulgado. O Quadro 8 apresenta essas etapas em ordem sequencial de dependência, sem semanas fixas.</w:t>
       </w:r>
     </w:p>
     <w:p>
@@ -11190,7 +11082,7 @@
               <w:pStyle w:val="TE-CorpoTabela"/>
             </w:pPr>
             <w:r>
-              <w:t>Corpus (Seção 6.2)</w:t>
+              <w:t>Corpus (Seção 5.6.1)</w:t>
             </w:r>
           </w:p>
         </w:tc>
@@ -11325,6 +11217,32 @@
       </w:pPr>
       <w:r>
         <w:t>Fonte: elaborado pelo autor (2026).</w:t>
+      </w:r>
+    </w:p>
+    <w:p>
+      <w:pPr>
+        <w:rPr>
+          <w:sz w:val="26"/>
+        </w:rPr>
+      </w:pPr>
+      <w:r>
+        <w:br w:type="page"/>
+      </w:r>
+    </w:p>
+    <w:p>
+      <w:pPr>
+        <w:pStyle w:val="T1-TituloPrimario"/>
+      </w:pPr>
+      <w:r>
+        <w:t>ORÇAMENTO</w:t>
+      </w:r>
+    </w:p>
+    <w:p>
+      <w:pPr>
+        <w:pStyle w:val="TE-Normal"/>
+      </w:pPr>
+      <w:r>
+        <w:t xml:space="preserve">Este trabalho não prevê custos com aquisição de equipamentos, licenças ou assinaturas de software. O protótipo será desenvolvido em Python com bibliotecas de código aberto, tendo o music21 (CUTHBERT; ARIZA, 2010) como dependência central; o corpus de corais de Bach é de domínio público e distribuído com essa mesma biblioteca; e o desenvolvimento usa o computador pessoal do autor. Eventuais despesas não previstas, inclusive com a obtenção de fontes bibliográficas, serão assumidas pelo próprio estudante.</w:t>
       </w:r>
     </w:p>
     <w:p>
@@ -12565,13 +12483,10 @@
       </w:r>
       <w:r>
         <w:tab/>
-        <w:t xml:space="preserve"> Esta contagem e a das melodias harmonizadas mais de uma vez (Seção 6.3) foram obtidas por um script em Python sobre o music21, disponível no repositório do projeto (github.com/pedro-schabarum/motif-align, </w:t>
-      </w:r>
-      <w:r>
-        <w:rPr>
-          <w:highlight w:val="yellow"/>
-        </w:rPr>
-        <w:t>scripts/levantamento_corpus.py — confirmar caminho após o commit</w:t>
+        <w:t xml:space="preserve"> Esta contagem e a das melodias harmonizadas mais de uma vez (Seção 5.6.2) foram obtidas por um script em Python sobre o music21, disponível no repositório do projeto (github.com/pedro-schabarum/motif-align, </w:t>
+      </w:r>
+      <w:r>
+        <w:t>scripts/levantamento_corpus.py</w:t>
       </w:r>
       <w:r>
         <w:t>).</w:t>

</xml_diff>

<commit_message>
TCC I: referência PRODANOV; FREITAS (2013) na versão 26
Co-Authored-By: Claude Opus 5.5 <noreply@anthropic.com>
Claude-Session: https://claude.ai/code/session_01Kohu9wzEiwkMfwNCWvySGw
</commit_message>
<xml_diff>
--- a/docs/tcc/TCC-I.docx
+++ b/docs/tcc/TCC-I.docx
@@ -11882,6 +11882,24 @@
           <w:lang w:val="en-US"/>
         </w:rPr>
         <w:t>, v. 9, n. 1, art. 39, 2010.</w:t>
+      </w:r>
+    </w:p>
+    <w:p>
+      <w:pPr>
+        <w:pStyle w:val="PT-Referencias"/>
+      </w:pPr>
+      <w:r>
+        <w:t xml:space="preserve">PRODANOV, C. C.; FREITAS, E. C. de. </w:t>
+      </w:r>
+      <w:r>
+        <w:rPr>
+          <w:b/>
+          <w:bCs/>
+        </w:rPr>
+        <w:t>Metodologia do trabalho científico</w:t>
+      </w:r>
+      <w:r>
+        <w:t xml:space="preserve">: métodos e técnicas da pesquisa e do trabalho acadêmico. 2. ed. Novo Hamburgo: Feevale, 2013.</w:t>
       </w:r>
     </w:p>
     <w:p>

</xml_diff>

<commit_message>
TCC I: versão 26 — restaura dois trechos perdidos na fusão
- 5.6: reprodutibilidade do planejamento da avaliação (vinha do 6.1)
- 5.7: modelagem no nível arquitetural, parâmetros em aberto

Co-Authored-By: Claude Opus 5.5 <noreply@anthropic.com>
Claude-Session: https://claude.ai/code/session_01Kohu9wzEiwkMfwNCWvySGw
</commit_message>
<xml_diff>
--- a/docs/tcc/TCC-I.docx
+++ b/docs/tcc/TCC-I.docx
@@ -9976,7 +9976,7 @@
         <w:pStyle w:val="TE-Normal"/>
       </w:pPr>
       <w:r>
-        <w:t xml:space="preserve">Esta seção reúne o planejamento da avaliação do método, que será executada no TCC II: o corpus (Seção 5.6.1), a construção dos pares de versões usados nos testes (Seção 5.6.2), os parâmetros a calibrar (Seção 5.6.3) e os critérios objetivos de avaliação (Seção 5.6.4). O planejamento é apresentado depois da modelagem porque cada um desses elementos depende do método descrito nas seções anteriores.</w:t>
+        <w:t xml:space="preserve">Esta seção reúne o planejamento da avaliação do método, que será executada no TCC II: o corpus (Seção 5.6.1), a construção dos pares de versões usados nos testes (Seção 5.6.2), os parâmetros a calibrar (Seção 5.6.3) e os critérios objetivos de avaliação (Seção 5.6.4). O planejamento é apresentado depois da modelagem porque cada um desses elementos depende do método descrito nas seções anteriores, e é descrito com detalhe suficiente para que outro pesquisador possa reproduzir a avaliação.</w:t>
       </w:r>
     </w:p>
     <w:p>
@@ -10335,7 +10335,7 @@
         <w:t xml:space="preserve">seed-and-extend</w:t>
       </w:r>
       <w:r>
-        <w:t xml:space="preserve"> do BLAST (Capítulo 3) ao domínio simbólico musical. O capítulo planejou também a avaliação do método: dois conjuntos de teste complementares, um de pares sintéticos com gabarito completo e outro de harmonizações diferentes de uma mesma melodia, com gabarito parcial; os sete grupos de parâmetros, a calibrar no TCC II sobre um subconjunto do corpus separado do usado na avaliação; e os critérios objetivos de avaliação, acompanhados da comparação com o Smith-Waterman como referência exata. O capítulo seguinte apresenta o cronograma que organiza essas etapas.</w:t>
+        <w:t xml:space="preserve"> do BLAST (Capítulo 3) ao domínio simbólico musical. A modelagem situa-se no nível arquitetural e deixa em aberto os parâmetros concretos do algoritmo, como o tamanho da semente, o limiar de X-drop e os pesos de pontuação. O capítulo planejou também a avaliação do método: dois conjuntos de teste complementares, um de pares sintéticos com gabarito completo e outro de harmonizações diferentes de uma mesma melodia, com gabarito parcial; os sete grupos de parâmetros, a calibrar no TCC II sobre um subconjunto do corpus separado do usado na avaliação; e os critérios objetivos de avaliação, acompanhados da comparação com o Smith-Waterman como referência exata. O capítulo seguinte apresenta o cronograma que organiza essas etapas.</w:t>
       </w:r>
     </w:p>
     <w:p>

</xml_diff>

<commit_message>
TCC I: versão 27 — Cap. 2 reorganizado a partir do coorientador
- Cap. 2 passa a "Fundamentação Teórico-Musical da Variação entre
  Versões": 2.1 identidade motívica sob transformação (Schoenberg, Réti,
  Frisch condensados, com o limite de repertório); 2.2 coral a quatro
  vozes (esqueleto); 2.3 ornamentação e notas melódicas (Gotham et al.,
  2021; Huron, 2007); 2.4 inversão e retrogradação (esqueleto); 2.5
  Narmour e Dowling
- introdução, objetivo (a), 1.6 e Etapa 1 ajustados
- referências: + GOTHAM et al. (2021), + HURON (2007, a conferir);
  - SCHOENBERG (1967), que deixou de ser citado

Co-Authored-By: Claude Opus 5.5 <noreply@anthropic.com>
Claude-Session: https://claude.ai/code/session_01Kohu9wzEiwkMfwNCWvySGw
</commit_message>
<xml_diff>
--- a/docs/tcc/TCC-I.docx
+++ b/docs/tcc/TCC-I.docx
@@ -3377,27 +3377,17 @@
         <w:pStyle w:val="TE-Normal"/>
       </w:pPr>
       <w:r>
-        <w:t xml:space="preserve">Comparar duas versões de uma obra musical, no entanto, exige mais do que identificar diferenças pontuais entre símbolos notacionais. Um motivo, padrão melódico-rítmico reconhecível que funciona como unidade básica de construção temática, pode ser transposto, invertido, retrogradado ou alterado ritmicamente e ainda assim ser reconhecido como o mesmo motivo por um analista e, no caso da transposição, também por um ouvinte. Esse fenômeno é descrito na teoria musical pelo conceito de </w:t>
+        <w:t xml:space="preserve">Comparar duas versões de uma obra musical, no entanto, exige mais do que identificar diferenças pontuais entre símbolos notacionais. Um motivo, padrão melódico-rítmico reconhecível que funciona como unidade básica de construção temática, pode ser transposto, ornamentado, alterado ritmicamente ou mesmo invertido e retrogradado e ainda assim ser reconhecido como o mesmo motivo por um analista e, no caso da transposição, também por um ouvinte. A teoria musical descreve esse fenômeno de mais de uma forma. No desenvolvimento temático de obras extensas, ele corresponde à ideia schoenberguiana de </w:t>
       </w:r>
       <w:r>
         <w:rPr>
           <w:i/>
           <w:iCs/>
         </w:rPr>
-        <w:t>Grundgestalt</w:t>
-      </w:r>
-      <w:r>
-        <w:t xml:space="preserve"> e pela ideia de </w:t>
-      </w:r>
-      <w:r>
-        <w:rPr>
-          <w:i/>
-          <w:iCs/>
-        </w:rPr>
-        <w:t>developing variation</w:t>
-      </w:r>
-      <w:r>
-        <w:t xml:space="preserve"> (SCHOENBERG, 1967), segundo a qual uma célula temática básica se desdobra e se transforma ao longo da obra sem perder sua identidade — processo que Réti (1951 apud PEYERL; BARROS, 2017) já caracterizava como subjacente à construção temática de obras do repertório tonal, e que Frisch (1984) examinou de forma sistemática em dezoito obras de Brahms.</w:t>
+        <w:t xml:space="preserve">developing variation</w:t>
+      </w:r>
+      <w:r>
+        <w:t xml:space="preserve">, a transformação contínua de uma ideia inicial ao longo da obra (ALMADA, 2008), analisada sistematicamente por Réti (1951 apud PEYERL; BARROS, 2017) e por Frisch (1984) em obras de Brahms. Entre versões de uma mesma peça, como as harmonizações de uma melodia de coral, as diferenças mais comuns são de outra natureza: transposição, notas de ornamentação acrescentadas ou suprimidas e alterações rítmicas, descritas pela teoria da harmonia e do contraponto (GOTHAM et al., 2021).</w:t>
       </w:r>
     </w:p>
     <w:p>
@@ -3742,27 +3732,7 @@
         <w:ind w:left="1369"/>
       </w:pPr>
       <w:r>
-        <w:t>revisar a fundamentação teórico-musical sobre transformação motívica (</w:t>
-      </w:r>
-      <w:r>
-        <w:rPr>
-          <w:i/>
-          <w:iCs/>
-        </w:rPr>
-        <w:t>Grundgestalt</w:t>
-      </w:r>
-      <w:r>
-        <w:t xml:space="preserve">, </w:t>
-      </w:r>
-      <w:r>
-        <w:rPr>
-          <w:i/>
-          <w:iCs/>
-        </w:rPr>
-        <w:t>developing variation</w:t>
-      </w:r>
-      <w:r>
-        <w:t>) e os métodos computacionais de alinhamento de sequências e de descoberta de padrões musicais, situando o método proposto em relação aos trabalhos existentes;</w:t>
+        <w:t xml:space="preserve">revisar a fundamentação teórico-musical sobre identidade e variação melódica entre versões (identidade motívica sob transformação, ornamentação e contraponto) e os métodos computacionais de alinhamento de sequências e de descoberta de padrões musicais, situando o método proposto em relação aos trabalhos existentes;</w:t>
       </w:r>
     </w:p>
     <w:p>
@@ -4001,7 +3971,7 @@
         <w:t>Etapa 1 – Revisão bibliográfica (objetivo a; TCC I).</w:t>
       </w:r>
       <w:r>
-        <w:t xml:space="preserve"> Levantamento e análise da fundamentação teórico-musical sobre transformação motívica (Capítulo 2), dos algoritmos de alinhamento de sequências (Capítulo 3) e dos trabalhos computacionais relacionados em música simbólica (Capítulo 4), para situar o método proposto e delimitar sua contribuição.</w:t>
+        <w:t xml:space="preserve"> Levantamento e análise da fundamentação teórico-musical sobre identidade e variação melódica entre versões (Capítulo 2), dos algoritmos de alinhamento de sequências (Capítulo 3) e dos trabalhos computacionais relacionados em música simbólica (Capítulo 4), para situar o método proposto e delimitar sua contribuição.</w:t>
       </w:r>
     </w:p>
     <w:p>
@@ -4146,7 +4116,7 @@
         <w:pStyle w:val="TE-Normal"/>
       </w:pPr>
       <w:r>
-        <w:t xml:space="preserve">Além desta introdução, o trabalho está organizado em seis capítulos. O Capítulo 2 revisa a fundamentação teórico-musical da transformação motívica, de Schoenberg a Narmour. O Capítulo 3 apresenta os fundamentos computacionais do alinhamento de sequências, do algoritmo de Needleman-Wunsch à heurística do BLAST. O Capítulo 4 examina os trabalhos relacionados em música simbólica e posiciona a contribuição deste trabalho em relação a eles. O Capítulo 5 descreve a modelagem do protótipo que adapta a heurística </w:t>
+        <w:t xml:space="preserve">Além desta introdução, o trabalho está organizado em seis capítulos. O Capítulo 2 revisa a fundamentação teórico-musical da variação entre versões, da noção schoenberguiana de identidade motívica à ornamentação melódica e à percepção. O Capítulo 3 apresenta os fundamentos computacionais do alinhamento de sequências, do algoritmo de Needleman-Wunsch à heurística do BLAST. O Capítulo 4 examina os trabalhos relacionados em música simbólica e posiciona a contribuição deste trabalho em relação a eles. O Capítulo 5 descreve a modelagem do protótipo que adapta a heurística </w:t>
       </w:r>
       <w:r>
         <w:rPr>
@@ -4183,102 +4153,118 @@
       <w:bookmarkStart w:id="39" w:name="__RefHeading___Toc1002_1503872338"/>
       <w:bookmarkStart w:id="40" w:name="_Toc242031502"/>
       <w:bookmarkEnd w:id="39"/>
-      <w:r>
-        <w:lastRenderedPageBreak/>
-        <w:t>Fundamentação Teórico-Musical da Transformação Motívica</w:t>
-      </w:r>
       <w:bookmarkEnd w:id="40"/>
-    </w:p>
-    <w:p>
-      <w:pPr>
-        <w:pStyle w:val="TE-Normal"/>
-      </w:pPr>
-      <w:r>
-        <w:t xml:space="preserve">Este capítulo revisa a fundamentação teórico-musical sobre identidade e transformação motívica que sustenta a premissa central deste trabalho: a de que um motivo pode ser transposto, invertido, retrogradado ou ritmicamente alterado e, ainda assim, ser reconhecido como o mesmo motivo. Parte-se do conceito de Schoenberg de </w:t>
+      <w:r>
+        <w:t xml:space="preserve">Fundamentação Teórico-Musical da Variação entre Versões</w:t>
+      </w:r>
+    </w:p>
+    <w:p>
+      <w:pPr>
+        <w:pStyle w:val="TE-Normal"/>
+      </w:pPr>
+      <w:r>
+        <w:t xml:space="preserve">Este capítulo revisa a fundamentação teórico-musical que sustenta a premissa central deste trabalho: a de que um trecho melódico pode ser transposto, ornamentado, ritmicamente alterado ou, como generalidade, invertido e retrogradado, e ainda assim ser reconhecido como correspondente a um trecho de outra versão da mesma obra. Parte-se da noção de identidade motívica sob transformação, formulada por Schoenberg e desenvolvida por Réti e Frisch, e de seus limites para o repertório deste trabalho (Seção 2.1). Em seguida, caracteriza-se o coral a quatro vozes (Seção 2.2) e examinam-se as diferenças que de fato aparecem entre versões de um coral: a ornamentação melódica (Seção 2.3) e, como recursos do contraponto, a inversão e a retrogradação (Seção 2.4). Por fim, o modelo de implicação-realização de Narmour e os experimentos de Dowling deslocam a discussão para o plano perceptivo (Seção 2.5).</w:t>
+      </w:r>
+    </w:p>
+    <w:p>
+      <w:pPr>
+        <w:pStyle w:val="TE-Normal"/>
+      </w:pPr>
+      <w:r>
+        <w:t xml:space="preserve">Das transformações consideradas, a transposição é a menos contestada: entre as fontes dos corais de Bach, uma mesma harmonização aparece registrada em tonalidades diferentes sem deixar de ser a mesma harmonização (Seção 1.4). Já a variação rítmica não recebe, dos autores revisados, um critério que permita medir quanto de alteração um trecho tolera sem perder sua correspondência com o de outra versão; essa medida é tratada, neste trabalho, no plano computacional, na etapa de pontuação da heurística descrita no Capítulo 5.</w:t>
+      </w:r>
+    </w:p>
+    <w:p>
+      <w:pPr>
+        <w:pStyle w:val="TE-Normal"/>
+      </w:pPr>
+      <w:r>
+        <w:rPr>
+          <w:highlight w:val="yellow"/>
+        </w:rPr>
+        <w:t xml:space="preserve">[REVISAR COM COORIENTADOR: capítulo reorganizado em 27/10/2026 a partir do apontamento do coorientador sobre a inadequação da Grundgestalt e da developing variation ao repertório dos corais de Bach. As Seções 2.2 e 2.4 dependem das referências de harmonia e contraponto indicadas por ele]</w:t>
+      </w:r>
+    </w:p>
+    <w:p>
+      <w:pPr>
+        <w:pStyle w:val="T2-TituloSecundario"/>
+      </w:pPr>
+      <w:r>
+        <w:t xml:space="preserve">Identidade motívica sob transformação</w:t>
+      </w:r>
+    </w:p>
+    <w:p>
+      <w:pPr>
+        <w:pStyle w:val="TE-Normal"/>
+      </w:pPr>
+      <w:r>
+        <w:t xml:space="preserve">A ideia de que um motivo preserva sua identidade através de transformações sucessivas tem formulação clássica em Schoenberg. Com o termo </w:t>
       </w:r>
       <w:r>
         <w:rPr>
           <w:i/>
           <w:iCs/>
         </w:rPr>
-        <w:t>Grundgestalt</w:t>
-      </w:r>
-      <w:r>
-        <w:t xml:space="preserve"> e </w:t>
+        <w:t xml:space="preserve">developing variation</w:t>
+      </w:r>
+      <w:r>
+        <w:t xml:space="preserve">, ele descreve a transformação contínua de uma ideia inicial, que gera novos temas e fragmentos ao longo da obra; a célula de que esse processo parte é o que chama de </w:t>
       </w:r>
       <w:r>
         <w:rPr>
           <w:i/>
           <w:iCs/>
         </w:rPr>
-        <w:t>developing variation</w:t>
-      </w:r>
-      <w:r>
-        <w:t>, passa-se pelo método analítico de Réti — e pela crítica que Frisch lhe dirige — e chega-se ao modelo de implicação-realização de Narmour, que desloca a discussão do plano estrutural para o plano perceptivo: em que medida, para um ouvinte, um motivo transformado ainda soa como o mesmo motivo.</w:t>
-      </w:r>
-    </w:p>
-    <w:p>
-      <w:pPr>
-        <w:pStyle w:val="TE-Normal"/>
-      </w:pPr>
-      <w:r>
-        <w:t>Das quatro transformações consideradas neste trabalho, a transposição é a menos contestada teoricamente: nenhum dos autores revisados a trata como uma ruptura de identidade — Réti e Frisch analisam sistematicamente temas que mudam de tonalidade ao longo de uma obra sem que isso comprometa sua leitura como o mesmo tema. Já a variação rítmica, embora admitida por Schoenberg entre as modificações possíveis de um motivo (Seção 2.1), não recebe desses autores um critério que permita medir quanto de alteração rítmica um motivo tolera sem perder sua identidade; essa medida é tratada, neste trabalho, no plano computacional, na etapa de pontuação da heurística descrita no Capítulo 5.</w:t>
-      </w:r>
-    </w:p>
-    <w:p>
-      <w:pPr>
-        <w:pStyle w:val="TE-Normal"/>
-      </w:pPr>
-      <w:r>
-        <w:rPr>
-          <w:highlight w:val="yellow"/>
-        </w:rPr>
-        <w:t xml:space="preserve">[CONFERIR NO FUNDAMENTALS OF MUSICAL COMPOSITION, capítulo sobre o motivo: localizar a página em que Schoenberg admite modificações rítmicas do motivo, para citá-la na frase acima — ver também se o termo </w:t>
+        <w:t xml:space="preserve">Grundgestalt</w:t>
+      </w:r>
+      <w:r>
+        <w:t xml:space="preserve">, ou forma básica. Schoenberg, porém, foi pouco sistemático ao definir esses termos (ALMADA, 2008) e os formulou a partir sobretudo da obra de Brahms, a quem dedicou o ensaio </w:t>
       </w:r>
       <w:r>
         <w:rPr>
           <w:i/>
           <w:iCs/>
-          <w:highlight w:val="yellow"/>
-        </w:rPr>
-        <w:t>Grundgestalt</w:t>
-      </w:r>
-      <w:r>
-        <w:rPr>
-          <w:highlight w:val="yellow"/>
-        </w:rPr>
-        <w:t xml:space="preserve"> aparece no livro ou apenas em outros escritos de Schoenberg]</w:t>
-      </w:r>
-    </w:p>
-    <w:p>
-      <w:pPr>
-        <w:pStyle w:val="TE-Normal"/>
-      </w:pPr>
-      <w:r>
-        <w:rPr>
-          <w:highlight w:val="yellow"/>
-        </w:rPr>
-        <w:t xml:space="preserve">[REVISAR COM COORIENTADOR: este capítulo é uma primeira proposta </w:t>
-        <w:lastRenderedPageBreak/>
-        <w:t>de fundamentação teórico-musical, redigida antes do retorno do coorientador de música sobre quais referências e ênfases ele considera adequadas — sujeito a revisão]</w:t>
-      </w:r>
-    </w:p>
-    <w:p>
-      <w:pPr>
-        <w:pStyle w:val="T2-TituloSecundario"/>
-      </w:pPr>
-      <w:bookmarkStart w:id="41" w:name="__RefHeading___Toc1044_1503872338"/>
-      <w:bookmarkStart w:id="42" w:name="_Toc242031503"/>
-      <w:bookmarkEnd w:id="41"/>
+        </w:rPr>
+        <w:t xml:space="preserve">Brahms the Progressive</w:t>
+      </w:r>
+      <w:r>
+        <w:t xml:space="preserve"> (SCHOENBERG, 1984 apud ALMADA, 2008).</w:t>
+      </w:r>
+    </w:p>
+    <w:p>
+      <w:pPr>
+        <w:pStyle w:val="TE-Normal"/>
+      </w:pPr>
+      <w:r>
+        <w:t xml:space="preserve">Rudolph Réti, em </w:t>
+      </w:r>
       <w:r>
         <w:rPr>
           <w:i/>
           <w:iCs/>
         </w:rPr>
-        <w:t>Grundgestalt</w:t>
-      </w:r>
-      <w:r>
-        <w:t xml:space="preserve"> e </w:t>
+        <w:t>The Thematic Process in Music</w:t>
+      </w:r>
+      <w:r>
+        <w:t xml:space="preserve"> (1951), leva intuição semelhante a um método analítico sistemático. Para Réti, a diversidade temática na superfície de uma obra — os diferentes temas de uma sinfonia, por exemplo — </w:t>
+        <w:lastRenderedPageBreak/>
+        <w:t>esconde uma unidade motívica subjacente: os vários movimentos de uma obra derivariam, em sua leitura, de uma mesma ideia germinal, com o compositor preservando a substância dessa ideia por trás de uma aparência sempre renovada (RÉTI, 1951 apud ALMADA, 2008; PEYERL; BARROS, 2017). O repertório de transformações que Réti reconhece entre essas formas já inclui inversão e retrogradação, além de uma operação própria que chama de interversão: o reagrupamento das notas de uma célula em outra ordem (RÉTI, 1951, p. 68, 72 apud PEYERL; BARROS, 2017) — transformação que este trabalho não se propõe a tratar.</w:t>
+      </w:r>
+    </w:p>
+    <w:p>
+      <w:pPr>
+        <w:pStyle w:val="TE-Normal"/>
+      </w:pPr>
+      <w:r>
+        <w:t>O método de Réti para demonstrar essa unidade, porém, foi alvo de críticas. Frisch (1984, p. 22-23 apud ALMADA, 2008) considera superficiais parte de suas análises, por levarem em conta apenas as alturas e os contornos intervalares dos temas, desvinculados de seu contexto rítmico e harmônico. Essa fragilidade se liga a outra, que é a que mais interessa a este trabalho: a decisão sobre quais notas de um tema pertencem à célula motívica básica e quais são ornamentação cabe ao próprio analista, sem um critério declarado que permita reproduzi-la.</w:t>
+      </w:r>
+    </w:p>
+    <w:p>
+      <w:pPr>
+        <w:pStyle w:val="TE-Normal"/>
+      </w:pPr>
+      <w:r>
+        <w:t xml:space="preserve">Frisch (1984), por sua vez, aplica o conceito schoenberguiano de </w:t>
       </w:r>
       <w:r>
         <w:rPr>
@@ -4287,138 +4273,123 @@
         </w:rPr>
         <w:t>developing variation</w:t>
       </w:r>
-      <w:bookmarkEnd w:id="42"/>
-    </w:p>
-    <w:p>
-      <w:pPr>
-        <w:pStyle w:val="TE-Normal"/>
-      </w:pPr>
-      <w:r>
-        <w:t xml:space="preserve">Arnold Schoenberg (1967), em </w:t>
+      <w:r>
+        <w:t xml:space="preserve"> a dezoito obras de Brahms, com a atenção ao contexto harmônico e rítmico que ele próprio cobra de Réti. De Réti a Frisch, portanto, uma análise intuitiva dá lugar a uma análise mais disciplinada da transformação motívica — caminho que este trabalho continua, no sentido de que os critérios de pontuação e extensão da heurística proposta (Capítulo 5) substituem o julgamento subjetivo do analista por regras explícitas e reprodutíveis.</w:t>
+      </w:r>
+    </w:p>
+    <w:p>
+      <w:pPr>
+        <w:pStyle w:val="TE-Normal"/>
+      </w:pPr>
+      <w:r>
+        <w:t xml:space="preserve">Os exemplos dessa tradição analítica, Brahms em Schoenberg e em Frisch, Mozart e Beethoven em Réti e em Almada (ALMADA, 2008), evidenciam seu limite para este trabalho. Ela descreve como uma ideia se desdobra dentro de uma obra extensa, ao longo de seções e movimentos. Os corais de Bach são peças curtas (o soprano de uma harmonização do coral da Paixão tem entre 42 e 56 notas na codificação do corpus; Seção 5.6.2), e o problema aqui investigado não é o desenvolvimento de uma ideia dentro de uma obra, mas a correspondência entre duas versões dela. Dessa tradição, este trabalho retém apenas a noção geral de identidade preservada sob transformação e o repertório de transformações que ela reconhece, incluindo a inversão e a retrogradação. A caracterização das diferenças que de fato ocorrem entre versões de um coral cabe às seções seguintes.</w:t>
+      </w:r>
+    </w:p>
+    <w:p>
+      <w:pPr>
+        <w:pStyle w:val="TE-Normal"/>
+      </w:pPr>
+      <w:r>
+        <w:rPr>
+          <w:highlight w:val="yellow"/>
+        </w:rPr>
+        <w:t>[CONFIRMAR COM COORIENTADOR: a decisão de excluir explicitamente a interversão do escopo ainda não foi validada com a orientação. LER ANTES DA ENTREGA: Peyerl e Barros (2017, Seção 4) e Almada (2008, nota 7), que sustentam os apud desta seção; se houver acesso ao Frisch (1984, p. 22-23), trocar o apud por citação direta]</w:t>
+      </w:r>
+    </w:p>
+    <w:p>
+      <w:pPr>
+        <w:pStyle w:val="T2-TituloSecundario"/>
+      </w:pPr>
+      <w:r>
+        <w:t xml:space="preserve">O coral a quatro vozes</w:t>
+      </w:r>
+    </w:p>
+    <w:p>
+      <w:pPr>
+        <w:pStyle w:val="TE-Normal"/>
+      </w:pPr>
+      <w:r>
+        <w:t xml:space="preserve">Nos corais a quatro vozes, quatro linhas melódicas (soprano, contralto, tenor e baixo) soam simultaneamente, e a melodia do coral é conduzida pelo soprano. Bach harmonizou muitas dessas melodias mais de uma vez, em obras e tonalidades diferentes, como mostra o levantamento do corpus (Seção 5.6.2). Entre duas harmonizações de uma mesma melodia, o soprano se mantém, com pequenas variantes, enquanto as vozes internas são reescritas.</w:t>
+      </w:r>
+    </w:p>
+    <w:p>
+      <w:pPr>
+        <w:pStyle w:val="TE-Normal"/>
+      </w:pPr>
+      <w:r>
+        <w:rPr>
+          <w:highlight w:val="yellow"/>
+        </w:rPr>
+        <w:t xml:space="preserve">[A DESENVOLVER COM A REFERÊNCIA DE HARMONIA INDICADA PELO COORIENTADOR: textura do coral (melodia no soprano, papel das vozes internas e do baixo); fundamentar por que harmonizações da mesma melodia podem ser tratadas como versões dessa melodia (Seção 1.2)]</w:t>
+      </w:r>
+    </w:p>
+    <w:p>
+      <w:pPr>
+        <w:pStyle w:val="T2-TituloSecundario"/>
+      </w:pPr>
+      <w:r>
+        <w:t xml:space="preserve">Ornamentação e notas melódicas</w:t>
+      </w:r>
+    </w:p>
+    <w:p>
+      <w:pPr>
+        <w:pStyle w:val="TE-Normal"/>
+      </w:pPr>
+      <w:r>
+        <w:t xml:space="preserve">Grande parte das diferenças entre versões de um coral está nas notas que ornamentam a linha melódica. Na terminologia de Gotham et al. (2021), notas de ornamentação são notas que não pertencem ao acorde que soa e que decoram notas que pertencem a ele; em geral, ocupam o meio de um gesto de três notas cujas notas externas são consonantes com o baixo. Os autores as agrupam pelo modo como se ligam às notas vizinhas: por grau conjunto, como a nota de passagem e a bordadura; por salto, como a apojatura e a escapada; e por permanência, como a suspensão, o retardo, o pedal e a antecipação.</w:t>
+      </w:r>
+    </w:p>
+    <w:p>
+      <w:pPr>
+        <w:pStyle w:val="TE-Normal"/>
+      </w:pPr>
+      <w:r>
+        <w:t xml:space="preserve">Nos corais de Bach, essas notas não são um enfeite indiferente à textura. Huron (2007), ao analisar 50 harmonizações de corais, observa que o emprego das notas de ornamentação favorece a segregação perceptiva das vozes, isto é, ajuda o ouvinte a acompanhar cada linha como independente, e que Bach tende a distribuí-las alternadamente entre as vozes.</w:t>
+      </w:r>
+    </w:p>
+    <w:p>
+      <w:pPr>
+        <w:pStyle w:val="TE-Normal"/>
+      </w:pPr>
+      <w:r>
+        <w:t xml:space="preserve">Para o problema deste trabalho, a consequência é direta. Duas versões de um coral podem diferir por notas de passagem ou bordaduras acrescentadas ou suprimidas, por uma suspensão que desloca a resolução de uma voz ou por uma nota longa dividida em notas mais curtas, sem que a linha deixe de corresponder à da outra versão. As duas versões da BWV 18.5 no corpus, que diferem nas vozes internas justamente por notas longas divididas em notas repetidas (Seção 5.6.2), são um exemplo do último caso. Cada uma dessas diferenças tem correspondente no método: a inserção ou remoção de notas é absorvida pela extensão com </w:t>
       </w:r>
       <w:r>
         <w:rPr>
           <w:i/>
           <w:iCs/>
         </w:rPr>
-        <w:t>Fundamentals of Musical Composition</w:t>
-      </w:r>
-      <w:r>
-        <w:t xml:space="preserve"> — coletânea de suas anotações de ensino organizada postumamente por Gerald Strang e Leonard Stein —, descreve a </w:t>
-      </w:r>
-      <w:r>
-        <w:rPr>
-          <w:i/>
-          <w:iCs/>
-        </w:rPr>
-        <w:t>Grundgestalt</w:t>
-      </w:r>
-      <w:r>
-        <w:t xml:space="preserve"> (forma básica) como a célula temática elementar da qual uma composição inteira deriva. Para Schoenberg, praticamente todo elemento de uma peça bem construída — motivos, frases, seções inteiras — pode ser rastreado até essa ideia germinal, apresentada logo no início da obra.</w:t>
-      </w:r>
-    </w:p>
-    <w:p>
-      <w:pPr>
-        <w:pStyle w:val="TE-Normal"/>
-      </w:pPr>
-      <w:r>
-        <w:t xml:space="preserve">O mecanismo pelo qual a </w:t>
-      </w:r>
-      <w:r>
-        <w:rPr>
-          <w:i/>
-          <w:iCs/>
-        </w:rPr>
-        <w:t>Grundgestalt</w:t>
-      </w:r>
-      <w:r>
-        <w:t xml:space="preserve"> se desdobra ao longo da peça é o que Schoenberg chama de </w:t>
-      </w:r>
-      <w:r>
-        <w:rPr>
-          <w:i/>
-          <w:iCs/>
-        </w:rPr>
-        <w:t>developing variation</w:t>
-      </w:r>
-      <w:r>
-        <w:t xml:space="preserve">: a ideia básica não é simplesmente repetida, mas continuamente variada, gerando novo material sem que a variação rompa o vínculo de identidade com a forma original. Uma variação pode alterar intervalos, ritmo, direção ou contorno do material original; o que a mantém reconhecível como desenvolvimento da mesma ideia, e não como material inteiramente novo, é a preservação de alguma relação estrutural com a </w:t>
-      </w:r>
-      <w:r>
-        <w:rPr>
-          <w:i/>
-          <w:iCs/>
-        </w:rPr>
-        <w:t>Grundgestalt</w:t>
-      </w:r>
-      <w:r>
-        <w:t>.</w:t>
-      </w:r>
-    </w:p>
-    <w:p>
-      <w:pPr>
-        <w:pStyle w:val="TE-Normal"/>
-      </w:pPr>
-      <w:r>
-        <w:t>É esse mecanismo — identidade preservada através de transformações sucessivas — que fundamenta teoricamente a premissa central deste trabalho. Onde Schoenberg descreve a transformação motívica como processo composicional interno a uma única obra, este trabalho a trata como problema computacional: dadas duas versões simbólicas de uma composição, identificar os pontos em que a mesma ideia básica, mesmo transformada, reaparece.</w:t>
+        <w:t xml:space="preserve">gaps</w:t>
+      </w:r>
+      <w:r>
+        <w:t xml:space="preserve"> (Seção 5.1.3), a alteração rítmica pela tolerância na pontuação (Equação 7), e o predomínio do movimento por grau conjunto, que torna fragmentos de escala pouco distintivos, motiva o filtro de baixa complexidade das sementes (Seção 5.1.2).</w:t>
+      </w:r>
+    </w:p>
+    <w:p>
+      <w:pPr>
+        <w:pStyle w:val="TE-Normal"/>
+      </w:pPr>
+      <w:r>
+        <w:rPr>
+          <w:highlight w:val="yellow"/>
+        </w:rPr>
+        <w:t xml:space="preserve">[CONFERIR: volume, número e páginas de Huron (2007). LER: Gotham et al. (2021), capítulo sobre notas de ornamentação, e Huron (2007). Acrescentar Fux (na tradução de Mann) e Carvalho após a leitura]</w:t>
       </w:r>
     </w:p>
     <w:p>
       <w:pPr>
         <w:pStyle w:val="T2-TituloSecundario"/>
       </w:pPr>
-      <w:bookmarkStart w:id="43" w:name="__RefHeading___Toc1042_1503872338"/>
-      <w:bookmarkStart w:id="44" w:name="_Toc242031504"/>
-      <w:bookmarkEnd w:id="43"/>
-      <w:r>
-        <w:t>O processo temático em Réti e sua extensão crítica por Frisch</w:t>
-      </w:r>
-      <w:bookmarkEnd w:id="44"/>
-    </w:p>
-    <w:p>
-      <w:pPr>
-        <w:pStyle w:val="TE-Normal"/>
-      </w:pPr>
-      <w:r>
-        <w:t xml:space="preserve">Rudolph Réti, em </w:t>
-      </w:r>
-      <w:r>
-        <w:rPr>
-          <w:i/>
-          <w:iCs/>
-        </w:rPr>
-        <w:t>The Thematic Process in Music</w:t>
-      </w:r>
-      <w:r>
-        <w:t xml:space="preserve"> (1951), leva a intuição de Schoenberg a um método analítico sistemático. Para Réti, a diversidade temática na superfície de uma obra — os diferentes temas de uma sinfonia, por exemplo — </w:t>
-        <w:lastRenderedPageBreak/>
-        <w:t>esconde uma unidade motívica subjacente: os vários movimentos de uma obra derivariam, em sua leitura, de uma mesma ideia germinal, com o compositor preservando a substância dessa ideia por trás de uma aparência sempre renovada (RÉTI, 1951 apud ALMADA, 2008; PEYERL; BARROS, 2017). O repertório de transformações que Réti reconhece entre essas formas já inclui inversão e retrogradação, além de uma operação própria que chama de interversão: o reagrupamento das notas de uma célula em outra ordem (RÉTI, 1951, p. 68, 72 apud PEYERL; BARROS, 2017) — transformação que este trabalho não se propõe a tratar.</w:t>
-      </w:r>
-    </w:p>
-    <w:p>
-      <w:pPr>
-        <w:pStyle w:val="TE-Normal"/>
-      </w:pPr>
-      <w:r>
-        <w:t>O método de Réti para demonstrar essa unidade, porém, foi alvo de críticas. Frisch (1984, p. 22-23 apud ALMADA, 2008) considera superficiais parte de suas análises, por levarem em conta apenas as alturas e os contornos intervalares dos temas, desvinculados de seu contexto rítmico e harmônico. Essa fragilidade se liga a outra, que é a que mais interessa a este trabalho: a decisão sobre quais notas de um tema pertencem à célula motívica básica e quais são ornamentação cabe ao próprio analista, sem um critério declarado que permita reproduzi-la.</w:t>
-      </w:r>
-    </w:p>
-    <w:p>
-      <w:pPr>
-        <w:pStyle w:val="TE-Normal"/>
-      </w:pPr>
-      <w:r>
-        <w:t xml:space="preserve">Frisch (1984), por sua vez, aplica o conceito schoenberguiano de </w:t>
-      </w:r>
-      <w:r>
-        <w:rPr>
-          <w:i/>
-          <w:iCs/>
-        </w:rPr>
-        <w:t>developing variation</w:t>
-      </w:r>
-      <w:r>
-        <w:t xml:space="preserve"> a dezoito obras de Brahms, com a atenção ao contexto harmônico e rítmico que ele próprio cobra de Réti. De Réti a Frisch, portanto, uma análise intuitiva dá lugar a uma análise mais disciplinada da transformação motívica — caminho que este trabalho continua, no sentido de que os critérios de pontuação e extensão da heurística proposta (Capítulo 5) substituem o julgamento subjetivo do analista por regras explícitas e reprodutíveis.</w:t>
+      <w:r>
+        <w:t xml:space="preserve">Inversão e retrogradação no contraponto</w:t>
+      </w:r>
+    </w:p>
+    <w:p>
+      <w:pPr>
+        <w:pStyle w:val="TE-Normal"/>
+      </w:pPr>
+      <w:r>
+        <w:t xml:space="preserve">A inversão e a retrogradação entram neste trabalho como generalidade do método, e não como diferenças típicas entre versões de um coral (Seção 5.1.2). Sua inclusão apoia-se, por ora, no repertório de transformações reconhecido por Réti (Seção 2.1).</w:t>
       </w:r>
     </w:p>
     <w:p>
@@ -4429,7 +4400,7 @@
         <w:rPr>
           <w:highlight w:val="yellow"/>
         </w:rPr>
-        <w:t>[CONFIRMAR COM COORIENTADOR: a decisão de excluir explicitamente a interversão do escopo ainda não foi validada com a orientação. LER ANTES DA ENTREGA: Peyerl e Barros (2017, Seção 4) e Almada (2008, nota 7), que sustentam os apud desta seção; se houver acesso ao Frisch (1984, p. 22-23), trocar o apud por citação direta]</w:t>
+        <w:t xml:space="preserve">[A DESENVOLVER COM CARVALHO (CONTRAPONTO TONAL) E FUX (NA TRADUÇÃO DE MANN): inversão como recurso do contraponto imitativo na obra de Bach; retrogradação como recurso raro, mantido apenas como generalidade]</w:t>
       </w:r>
     </w:p>
     <w:p>
@@ -4439,10 +4410,10 @@
       <w:bookmarkStart w:id="45" w:name="__RefHeading___Toc1040_1503872338"/>
       <w:bookmarkStart w:id="46" w:name="_Toc242031505"/>
       <w:bookmarkEnd w:id="45"/>
-      <w:r>
-        <w:t>Percepção melódica: o modelo de implicação-realização de Narmour</w:t>
-      </w:r>
       <w:bookmarkEnd w:id="46"/>
+      <w:r>
+        <w:t xml:space="preserve">Percepção melódica: Narmour e Dowling</w:t>
+      </w:r>
     </w:p>
     <w:p>
       <w:pPr>
@@ -4506,7 +4477,7 @@
       <w:r>
         <w:t xml:space="preserve">O mesmo não vale, sem ressalvas, para inversão e retrogradação. Dowling (1972) testou diretamente o reconhecimento dessas transformações em melodias curtas. Os ouvintes as identificaram acima do acaso, mas com dificuldade crescente da inversão para o retrógrado e deste para o retrógrado da inversão, e sem distinguir as transformações que preservam os intervalos exatos daquelas que preservam apenas o contorno. Esse resultado delimita o alcance da fundamentação perceptiva: ela sustenta a tolerância à transposição, mas não autoriza afirmar que inversões e retrogradações </w:t>
         <w:lastRenderedPageBreak/>
-        <w:t>soam como o mesmo motivo. Neste trabalho, a tolerância a essas duas transformações apoia-se, por isso, no plano analítico, o de Schoenberg, Réti e Frisch, e não no perceptivo, em coerência com seu reposicionamento como generalidade do método (Capítulo 5).</w:t>
+        <w:t>soam como o mesmo motivo. Neste trabalho, a tolerância a essas duas transformações apoia-se, por isso, no plano analítico (Seções 2.1 e 2.4), e não no perceptivo, em coerência com seu reposicionamento como generalidade do método (Capítulo 5).</w:t>
       </w:r>
     </w:p>
     <w:p>
@@ -4537,7 +4508,7 @@
         </w:sectPr>
       </w:pPr>
       <w:r>
-        <w:t>Este capítulo revisou três perspectivas sobre a transformação motívica: a composicional, em Schoenberg; a analítica, em Réti e na resposta crítica de Frisch; e a perceptiva, em Narmour, delimitada pelos experimentos de Dowling (1972). As duas primeiras convergem para a conclusão de que a identidade de um motivo sobrevive a transformações estruturais, do ponto de vista de quem compõe e de quem analisa. Do ponto de vista de quem ouve, essa conclusão está bem sustentada no caso da transposição, mas não no da inversão e da retrogradação. Nenhuma das três perspectivas, além disso, oferece um critério objetivo e computável para decidir quando essa identidade se mantém. É essa lacuna, situada entre a fundamentação teórico-musical deste capítulo e a fundamentação computacional do Capítulo 3, que a heurística proposta neste trabalho tenta preencher.</w:t>
+        <w:t xml:space="preserve">Este capítulo partiu da noção de identidade motívica sob transformação, formulada por Schoenberg e desenvolvida por Réti e Frisch, e mostrou seu limite para o problema deste trabalho: ela descreve o desenvolvimento de uma ideia dentro de obras extensas, e não a correspondência entre versões de peças curtas como os corais de Bach. As diferenças que de fato aparecem entre versões de um coral (transposição, ornamentação melódica, alterações rítmicas e reescrita das vozes internas) são descritas pela teoria da harmonia e do contraponto, e cada uma delas tem correspondente nos mecanismos do método. A perspectiva perceptiva, em Narmour e Dowling, sustenta bem a tolerância à transposição, mas não à inversão e à retrogradação, que permanecem como generalidade. Nenhuma dessas perspectivas, além disso, oferece um critério objetivo e computável para decidir quando um trecho de uma versão corresponde a um trecho de outra. É essa lacuna, situada entre a fundamentação teórico-musical deste capítulo e a fundamentação computacional do Capítulo 3, que a heurística proposta neste trabalho tenta preencher.</w:t>
       </w:r>
     </w:p>
     <w:p>
@@ -11587,6 +11558,24 @@
     <w:p>
       <w:pPr>
         <w:pStyle w:val="PT-Referencias"/>
+      </w:pPr>
+      <w:r>
+        <w:t xml:space="preserve">GOTHAM, M. et al. </w:t>
+      </w:r>
+      <w:r>
+        <w:rPr>
+          <w:b/>
+          <w:bCs/>
+        </w:rPr>
+        <w:t xml:space="preserve">Open music theory</w:t>
+      </w:r>
+      <w:r>
+        <w:t xml:space="preserve">: version 2. [S.l.: s.n.], 2021. Disponível em: https://viva.pressbooks.pub/openmusictheory/. Acesso em: 27 out. 2026.</w:t>
+      </w:r>
+    </w:p>
+    <w:p>
+      <w:pPr>
+        <w:pStyle w:val="PT-Referencias"/>
         <w:rPr>
           <w:lang w:val="en-US"/>
         </w:rPr>
@@ -11643,6 +11632,30 @@
     <w:p>
       <w:pPr>
         <w:pStyle w:val="PT-Referencias"/>
+      </w:pPr>
+      <w:r>
+        <w:t xml:space="preserve">HURON, D. On the role of embellishment tones in the perceptual segregation of concurrent musical parts. </w:t>
+      </w:r>
+      <w:r>
+        <w:rPr>
+          <w:b/>
+          <w:bCs/>
+        </w:rPr>
+        <w:t xml:space="preserve">Empirical Musicology Review</w:t>
+      </w:r>
+      <w:r>
+        <w:t xml:space="preserve">, 2007. </w:t>
+      </w:r>
+      <w:r>
+        <w:rPr>
+          <w:highlight w:val="yellow"/>
+        </w:rPr>
+        <w:t xml:space="preserve">[CONFERIR volume, número e páginas]</w:t>
+      </w:r>
+    </w:p>
+    <w:p>
+      <w:pPr>
+        <w:pStyle w:val="PT-Referencias"/>
         <w:rPr>
           <w:lang w:val="en-US"/>
         </w:rPr>
@@ -11928,43 +11941,6 @@
           <w:lang w:val="en-US"/>
         </w:rPr>
         <w:t>. New York: Macmillan, 1951.</w:t>
-      </w:r>
-    </w:p>
-    <w:p>
-      <w:pPr>
-        <w:pStyle w:val="PT-Referencias"/>
-        <w:rPr>
-          <w:lang w:val="en-US"/>
-        </w:rPr>
-      </w:pPr>
-      <w:r>
-        <w:rPr>
-          <w:lang w:val="en-US"/>
-        </w:rPr>
-        <w:t xml:space="preserve">SCHOENBERG, A. </w:t>
-      </w:r>
-      <w:r>
-        <w:rPr>
-          <w:b/>
-          <w:bCs/>
-          <w:lang w:val="en-US"/>
-        </w:rPr>
-        <w:t>Fundamentals of musical composition</w:t>
-      </w:r>
-      <w:r>
-        <w:rPr>
-          <w:lang w:val="en-US"/>
-        </w:rPr>
-        <w:t xml:space="preserve">. </w:t>
-      </w:r>
-      <w:r>
-        <w:t xml:space="preserve">Ed. Gerald Strang, com a colaboração de Leonard Stein. </w:t>
-      </w:r>
-      <w:r>
-        <w:rPr>
-          <w:lang w:val="en-US"/>
-        </w:rPr>
-        <w:t>Londres: Faber and Faber, 1967.</w:t>
       </w:r>
     </w:p>
     <w:p>

</xml_diff>

<commit_message>
TCC I: versão 28 — Seções 2.2 e 2.3 com Hindemith (1998)
- 2.2 O coral a quatro vozes: escrita a quatro vozes e harmonização de
  melodia dada (Hindemith, 1998, p. 1 e 43-47) como base para tratar
  harmonizações da mesma melodia como versões
- 2.3 renomeada para "Ornamentação e notas estranhas ao acorde":
  definições de Hindemith (p. 40-42), com a posição métrica, e a leitura
  de acordes complexos como simples + notas estranhas (p. 43)
- refinamento métrico da pontuação registrado como extensão (TCC II)
- referência HINDEMITH (1998)

Co-Authored-By: Claude Opus 5.5 <noreply@anthropic.com>
Claude-Session: https://claude.ai/code/session_01Kohu9wzEiwkMfwNCWvySGw
</commit_message>
<xml_diff>
--- a/docs/tcc/TCC-I.docx
+++ b/docs/tcc/TCC-I.docx
@@ -3387,7 +3387,7 @@
         <w:t xml:space="preserve">developing variation</w:t>
       </w:r>
       <w:r>
-        <w:t xml:space="preserve">, a transformação contínua de uma ideia inicial ao longo da obra (ALMADA, 2008), analisada sistematicamente por Réti (1951 apud PEYERL; BARROS, 2017) e por Frisch (1984) em obras de Brahms. Entre versões de uma mesma peça, como as harmonizações de uma melodia de coral, as diferenças mais comuns são de outra natureza: transposição, notas de ornamentação acrescentadas ou suprimidas e alterações rítmicas, descritas pela teoria da harmonia e do contraponto (GOTHAM et al., 2021).</w:t>
+        <w:t xml:space="preserve">, a transformação contínua de uma ideia inicial ao longo da obra (ALMADA, 2008), analisada sistematicamente por Réti (1951 apud PEYERL; BARROS, 2017) e por Frisch (1984) em obras de Brahms. Entre versões de uma mesma peça, como as harmonizações de uma melodia de coral, as diferenças mais comuns são de outra natureza: transposição, notas de ornamentação acrescentadas ou suprimidas e alterações rítmicas, descritas pela teoria da harmonia e do contraponto (HINDEMITH, 1998; GOTHAM et al., 2021).</w:t>
       </w:r>
     </w:p>
     <w:p>
@@ -4182,7 +4182,7 @@
         <w:rPr>
           <w:highlight w:val="yellow"/>
         </w:rPr>
-        <w:t xml:space="preserve">[REVISAR COM COORIENTADOR: capítulo reorganizado em 27/10/2026 a partir do apontamento do coorientador sobre a inadequação da Grundgestalt e da developing variation ao repertório dos corais de Bach. As Seções 2.2 e 2.4 dependem das referências de harmonia e contraponto indicadas por ele]</w:t>
+        <w:t xml:space="preserve">[REVISAR COM COORIENTADOR: capítulo reorganizado em 27/10/2026 a partir do apontamento do coorientador sobre a inadequação da Grundgestalt e da developing variation ao repertório dos corais de Bach. As Seções 2.2 e 2.3 usam a referência de harmonia indicada por ele (HINDEMITH, 1998); a Seção 2.4 depende das referências de contraponto]</w:t>
       </w:r>
     </w:p>
     <w:p>
@@ -4309,7 +4309,15 @@
         <w:pStyle w:val="TE-Normal"/>
       </w:pPr>
       <w:r>
-        <w:t xml:space="preserve">Nos corais a quatro vozes, quatro linhas melódicas (soprano, contralto, tenor e baixo) soam simultaneamente, e a melodia do coral é conduzida pelo soprano. Bach harmonizou muitas dessas melodias mais de uma vez, em obras e tonalidades diferentes, como mostra o levantamento do corpus (Seção 5.6.2). Entre duas harmonizações de uma mesma melodia, o soprano se mantém, com pequenas variantes, enquanto as vozes internas são reescritas.</w:t>
+        <w:t xml:space="preserve">Os corais de Bach são escritos para quatro vozes (soprano, contralto, tenor e baixo), a mesma disposição que o ensino tradicional da harmonia adota em seus exercícios (HINDEMITH, 1998, p. 1). Nesse ensino, harmonizar uma melodia dada consiste em escrever as demais vozes sob ela, escolhendo os acordes que a sustentam. Hindemith (1998, p. 43-47) propõe esse exercício tanto com os graus da harmonia indicados quanto sem eles; no segundo caso, a escolha dos acordes fica a cargo de quem harmoniza, com especial atenção à elaboração do baixo. Uma mesma melodia admite, portanto, mais de uma harmonização.</w:t>
+      </w:r>
+    </w:p>
+    <w:p>
+      <w:pPr>
+        <w:pStyle w:val="TE-Normal"/>
+      </w:pPr>
+      <w:r>
+        <w:t xml:space="preserve">É o que se observa no corpus: Bach harmonizou muitas melodias de coral mais de uma vez, em obras e tonalidades diferentes (Seção 5.6.2), e entre duas harmonizações de uma mesma melodia o soprano se mantém, com pequenas variantes, enquanto as vozes internas e o baixo são reescritos. Essa é a base para tratar harmonizações de uma mesma melodia como versões dela (Seção 1.2): a melodia é o elemento dado e compartilhado, e cada harmonização é uma realização diferente sobre ela. Por isso, no segundo conjunto de teste, o gabarito parcial é definido pelo soprano (Seção 5.6.2).</w:t>
       </w:r>
     </w:p>
     <w:p>
@@ -4320,7 +4328,7 @@
         <w:rPr>
           <w:highlight w:val="yellow"/>
         </w:rPr>
-        <w:t xml:space="preserve">[A DESENVOLVER COM A REFERÊNCIA DE HARMONIA INDICADA PELO COORIENTADOR: textura do coral (melodia no soprano, papel das vozes internas e do baixo); fundamentar por que harmonizações da mesma melodia podem ser tratadas como versões dessa melodia (Seção 1.2)]</w:t>
+        <w:t xml:space="preserve">[VALIDAR COM COORIENTADOR: uso de Hindemith (1998) como base para tratar harmonizações de uma mesma melodia como versões dessa melodia]</w:t>
       </w:r>
     </w:p>
     <w:p>
@@ -4328,15 +4336,23 @@
         <w:pStyle w:val="T2-TituloSecundario"/>
       </w:pPr>
       <w:r>
-        <w:t xml:space="preserve">Ornamentação e notas melódicas</w:t>
-      </w:r>
-    </w:p>
-    <w:p>
-      <w:pPr>
-        <w:pStyle w:val="TE-Normal"/>
-      </w:pPr>
-      <w:r>
-        <w:t xml:space="preserve">Grande parte das diferenças entre versões de um coral está nas notas que ornamentam a linha melódica. Na terminologia de Gotham et al. (2021), notas de ornamentação são notas que não pertencem ao acorde que soa e que decoram notas que pertencem a ele; em geral, ocupam o meio de um gesto de três notas cujas notas externas são consonantes com o baixo. Os autores as agrupam pelo modo como se ligam às notas vizinhas: por grau conjunto, como a nota de passagem e a bordadura; por salto, como a apojatura e a escapada; e por permanência, como a suspensão, o retardo, o pedal e a antecipação.</w:t>
+        <w:t xml:space="preserve">Ornamentação e notas estranhas ao acorde</w:t>
+      </w:r>
+    </w:p>
+    <w:p>
+      <w:pPr>
+        <w:pStyle w:val="TE-Normal"/>
+      </w:pPr>
+      <w:r>
+        <w:t xml:space="preserve">Grande parte das diferenças entre versões de um coral está nas notas estranhas ao acorde, isto é, notas que não pertencem à harmonia que soa. Hindemith (1998, p. 40-42) descreve as principais: a bordadura, que aparece entre uma nota do acorde e sua repetição, a uma segunda acima ou abaixo; a nota de passagem, que preenche por grau conjunto o intervalo entre duas notas diferentes de um acorde; o retardo, que prolonga uma nota do acorde anterior e resolve por grau conjunto na nota do acorde correspondente; a antecipação, que apresenta no acorde anterior uma nota do acorde seguinte; a apojatura, um retardo sem preparação; e a escapada. A posição métrica faz parte dessas definições: bordaduras, notas de passagem e antecipações ocorrem em posição métrica mais fraca que as notas do acorde a que se ligam, enquanto o retardo ocorre em posição mais forte que sua preparação e sua resolução. Gotham et al. (2021) agrupam as mesmas notas pelo modo como se ligam às notas vizinhas: por grau conjunto, como a nota de passagem e a bordadura; por salto, como a apojatura e a escapada; e por permanência, como a suspensão, o retardo, o pedal e a antecipação.</w:t>
+      </w:r>
+    </w:p>
+    <w:p>
+      <w:pPr>
+        <w:pStyle w:val="TE-Normal"/>
+      </w:pPr>
+      <w:r>
+        <w:t xml:space="preserve">Hindemith (1998, p. 43) observa ainda que acordes mais complicados podem, com frequência, ser interpretados como acordes mais simples acrescidos de notas estranhas. Por extensão, uma linha ornamentada e sua versão sem esses ornamentos compartilham a mesma estrutura subjacente, e é essa estrutura comum que o alinhamento entre versões procura reconhecer.</w:t>
       </w:r>
     </w:p>
     <w:p>
@@ -4362,7 +4378,7 @@
         <w:t xml:space="preserve">gaps</w:t>
       </w:r>
       <w:r>
-        <w:t xml:space="preserve"> (Seção 5.1.3), a alteração rítmica pela tolerância na pontuação (Equação 7), e o predomínio do movimento por grau conjunto, que torna fragmentos de escala pouco distintivos, motiva o filtro de baixa complexidade das sementes (Seção 5.1.2).</w:t>
+        <w:t xml:space="preserve"> (Seção 5.1.3), a alteração rítmica pela tolerância na pontuação (Equação 7), e o predomínio do movimento por grau conjunto, que torna fragmentos de escala pouco distintivos, motiva o filtro de baixa complexidade das sementes (Seção 5.1.2). O fato de as notas estranhas ocuparem, em geral, posições métricas mais fracas sugere ainda um refinamento possível da pontuação, que penalizaria menos as divergências em tempos fracos; o desenho atual não o incorpora, e ele fica registrado como extensão a avaliar no TCC II.</w:t>
       </w:r>
     </w:p>
     <w:p>
@@ -4373,7 +4389,7 @@
         <w:rPr>
           <w:highlight w:val="yellow"/>
         </w:rPr>
-        <w:t xml:space="preserve">[CONFERIR: volume, número e páginas de Huron (2007). LER: Gotham et al. (2021), capítulo sobre notas de ornamentação, e Huron (2007). Acrescentar Fux (na tradução de Mann) e Carvalho após a leitura]</w:t>
+        <w:t xml:space="preserve">[CONFERIR: volume, número e páginas de Huron (2007). LER: Hindemith (1998, cap. VII), Gotham et al. (2021), capítulo sobre notas de ornamentação, e Huron (2007). Acrescentar Fux (na tradução de Mann) e Carvalho após a leitura]</w:t>
       </w:r>
     </w:p>
     <w:p>
@@ -11627,6 +11643,24 @@
           <w:lang w:val="en-US"/>
         </w:rPr>
         <w:t>: computer science and computational biology. Cambridge: Cambridge University Press, 1997.</w:t>
+      </w:r>
+    </w:p>
+    <w:p>
+      <w:pPr>
+        <w:pStyle w:val="PT-Referencias"/>
+      </w:pPr>
+      <w:r>
+        <w:t xml:space="preserve">HINDEMITH, P. </w:t>
+      </w:r>
+      <w:r>
+        <w:rPr>
+          <w:b/>
+          <w:bCs/>
+        </w:rPr>
+        <w:t xml:space="preserve">Curso condensado de harmonia tradicional</w:t>
+      </w:r>
+      <w:r>
+        <w:t xml:space="preserve">: com predomínio de exercícios e um mínimo de regras. Tradução de Souza Lima. 13. ed. São Paulo: Irmãos Vitale, 1998.</w:t>
       </w:r>
     </w:p>
     <w:p>

</xml_diff>

<commit_message>
TCC I: versão 29 — Seção 2.4 Recursos do contraponto imitativo
- resposta real e tonal na fuga (Gotham et al., 2021; BWV 847) como
  base da distinção entre transposição real e tonal (5.1.4)
- contraponto invertível (troca de vozes) como base das 16 combinações
  de vozes (5.1.3), com a distinção entre os dois sentidos de "inversão"
- inversão melódica e retrogradação seguem como generalidade, à espera
  de Carvalho (Contraponto tonal e fuga, 3. ed., 2022)

Co-Authored-By: Claude Opus 5.5 <noreply@anthropic.com>
Claude-Session: https://claude.ai/code/session_01Kohu9wzEiwkMfwNCWvySGw
</commit_message>
<xml_diff>
--- a/docs/tcc/TCC-I.docx
+++ b/docs/tcc/TCC-I.docx
@@ -4163,7 +4163,7 @@
         <w:pStyle w:val="TE-Normal"/>
       </w:pPr>
       <w:r>
-        <w:t xml:space="preserve">Este capítulo revisa a fundamentação teórico-musical que sustenta a premissa central deste trabalho: a de que um trecho melódico pode ser transposto, ornamentado, ritmicamente alterado ou, como generalidade, invertido e retrogradado, e ainda assim ser reconhecido como correspondente a um trecho de outra versão da mesma obra. Parte-se da noção de identidade motívica sob transformação, formulada por Schoenberg e desenvolvida por Réti e Frisch, e de seus limites para o repertório deste trabalho (Seção 2.1). Em seguida, caracteriza-se o coral a quatro vozes (Seção 2.2) e examinam-se as diferenças que de fato aparecem entre versões de um coral: a ornamentação melódica (Seção 2.3) e, como recursos do contraponto, a inversão e a retrogradação (Seção 2.4). Por fim, o modelo de implicação-realização de Narmour e os experimentos de Dowling deslocam a discussão para o plano perceptivo (Seção 2.5).</w:t>
+        <w:t xml:space="preserve">Este capítulo revisa a fundamentação teórico-musical que sustenta a premissa central deste trabalho: a de que um trecho melódico pode ser transposto, ornamentado, ritmicamente alterado ou, como generalidade, invertido e retrogradado, e ainda assim ser reconhecido como correspondente a um trecho de outra versão da mesma obra. Parte-se da noção de identidade motívica sob transformação, formulada por Schoenberg e desenvolvida por Réti e Frisch, e de seus limites para o repertório deste trabalho (Seção 2.1). Em seguida, caracteriza-se o coral a quatro vozes (Seção 2.2) e examinam-se as diferenças que de fato aparecem entre versões de um coral: a ornamentação melódica (Seção 2.3) e os recursos do contraponto imitativo que encontram correspondência no método (Seção 2.4). Por fim, o modelo de implicação-realização de Narmour e os experimentos de Dowling deslocam a discussão para o plano perceptivo (Seção 2.5).</w:t>
       </w:r>
     </w:p>
     <w:p>
@@ -4182,7 +4182,7 @@
         <w:rPr>
           <w:highlight w:val="yellow"/>
         </w:rPr>
-        <w:t xml:space="preserve">[REVISAR COM COORIENTADOR: capítulo reorganizado em 27/10/2026 a partir do apontamento do coorientador sobre a inadequação da Grundgestalt e da developing variation ao repertório dos corais de Bach. As Seções 2.2 e 2.3 usam a referência de harmonia indicada por ele (HINDEMITH, 1998); a Seção 2.4 depende das referências de contraponto]</w:t>
+        <w:t xml:space="preserve">[REVISAR COM COORIENTADOR: capítulo reorganizado em 27/10/2026 a partir do apontamento do coorientador sobre a inadequação da Grundgestalt e da developing variation ao repertório dos corais de Bach. As Seções 2.2 e 2.3 usam a referência de harmonia indicada por ele (HINDEMITH, 1998); a Seção 2.4 usa Gotham et al. (2021) e depende ainda de Carvalho para a inversão melódica]</w:t>
       </w:r>
     </w:p>
     <w:p>
@@ -4397,15 +4397,41 @@
         <w:pStyle w:val="T2-TituloSecundario"/>
       </w:pPr>
       <w:r>
-        <w:t xml:space="preserve">Inversão e retrogradação no contraponto</w:t>
-      </w:r>
-    </w:p>
-    <w:p>
-      <w:pPr>
-        <w:pStyle w:val="TE-Normal"/>
-      </w:pPr>
-      <w:r>
-        <w:t xml:space="preserve">A inversão e a retrogradação entram neste trabalho como generalidade do método, e não como diferenças típicas entre versões de um coral (Seção 5.1.2). Sua inclusão apoia-se, por ora, no repertório de transformações reconhecido por Réti (Seção 2.1).</w:t>
+        <w:t xml:space="preserve">Recursos do contraponto imitativo</w:t>
+      </w:r>
+    </w:p>
+    <w:p>
+      <w:pPr>
+        <w:pStyle w:val="TE-Normal"/>
+      </w:pPr>
+      <w:r>
+        <w:t xml:space="preserve">O contraponto imitativo, em que uma mesma linha melódica reaparece em vozes diferentes, oferece dois paralelos diretos para os mecanismos do método. O primeiro está na relação entre sujeito e resposta na fuga. Gotham et al. (2021) distinguem a resposta real, transposição exata do sujeito uma quinta acima ou uma quarta abaixo, que preserva seus intervalos, da resposta tonal, em que alguns intervalos são ajustados, com a menor alteração possível, para que a resposta não se afaste da tonalidade. A Fuga em dó menor do primeiro livro do </w:t>
+      </w:r>
+      <w:r>
+        <w:rPr>
+          <w:i/>
+          <w:iCs/>
+        </w:rPr>
+        <w:t xml:space="preserve">Cravo Bem Temperado</w:t>
+      </w:r>
+      <w:r>
+        <w:t xml:space="preserve"> (BWV 847), que os autores tomam como exemplo, tem resposta tonal. A distinção corresponde, no repertório do próprio Bach, à que o método faz entre transposição real e tonal na rotulagem das correspondências (Seção 5.1.4).</w:t>
+      </w:r>
+    </w:p>
+    <w:p>
+      <w:pPr>
+        <w:pStyle w:val="TE-Normal"/>
+      </w:pPr>
+      <w:r>
+        <w:t xml:space="preserve">O segundo paralelo é o contraponto invertível. Um contracanto invertível à oitava continua funcionando quando passa de cima para baixo do sujeito, isto é, quando as duas vozes trocam de posição (GOTHAM et al., 2021). Se uma linha pode trocar de voz dentro de uma obra, a correspondência entre duas versões também pode aparecer em vozes diferentes, o que fundamenta a comparação entre todas as dezesseis combinações de vozes (Seção 5.1.3).</w:t>
+      </w:r>
+    </w:p>
+    <w:p>
+      <w:pPr>
+        <w:pStyle w:val="TE-Normal"/>
+      </w:pPr>
+      <w:r>
+        <w:t xml:space="preserve">O termo inversão exige, porém, uma distinção. No contraponto, o adjetivo invertível designa a troca de posição entre vozes, e não a inversão melódica considerada pelo método, em que cada intervalo de uma linha é espelhado (Seção 5.1.1). A inversão melódica e a retrogradação entram neste trabalho como generalidade do método, e não como diferenças típicas entre versões de um coral (Seção 5.1.2); sua inclusão apoia-se, por ora, no repertório de transformações reconhecido por Réti (Seção 2.1).</w:t>
       </w:r>
     </w:p>
     <w:p>
@@ -4416,7 +4442,7 @@
         <w:rPr>
           <w:highlight w:val="yellow"/>
         </w:rPr>
-        <w:t xml:space="preserve">[A DESENVOLVER COM CARVALHO (CONTRAPONTO TONAL) E FUX (NA TRADUÇÃO DE MANN): inversão como recurso do contraponto imitativo na obra de Bach; retrogradação como recurso raro, mantido apenas como generalidade]</w:t>
+        <w:t xml:space="preserve">[A DESENVOLVER COM CARVALHO (Contraponto tonal e fuga, 3. ed., 2022): inversão melódica do sujeito como recurso da fuga na obra de Bach; retrogradação como recurso raro, mantido apenas como generalidade]</w:t>
       </w:r>
     </w:p>
     <w:p>
@@ -4524,7 +4550,7 @@
         </w:sectPr>
       </w:pPr>
       <w:r>
-        <w:t xml:space="preserve">Este capítulo partiu da noção de identidade motívica sob transformação, formulada por Schoenberg e desenvolvida por Réti e Frisch, e mostrou seu limite para o problema deste trabalho: ela descreve o desenvolvimento de uma ideia dentro de obras extensas, e não a correspondência entre versões de peças curtas como os corais de Bach. As diferenças que de fato aparecem entre versões de um coral (transposição, ornamentação melódica, alterações rítmicas e reescrita das vozes internas) são descritas pela teoria da harmonia e do contraponto, e cada uma delas tem correspondente nos mecanismos do método. A perspectiva perceptiva, em Narmour e Dowling, sustenta bem a tolerância à transposição, mas não à inversão e à retrogradação, que permanecem como generalidade. Nenhuma dessas perspectivas, além disso, oferece um critério objetivo e computável para decidir quando um trecho de uma versão corresponde a um trecho de outra. É essa lacuna, situada entre a fundamentação teórico-musical deste capítulo e a fundamentação computacional do Capítulo 3, que a heurística proposta neste trabalho tenta preencher.</w:t>
+        <w:t xml:space="preserve">Este capítulo partiu da noção de identidade motívica sob transformação, formulada por Schoenberg e desenvolvida por Réti e Frisch, e mostrou seu limite para o problema deste trabalho: ela descreve o desenvolvimento de uma ideia dentro de obras extensas, e não a correspondência entre versões de peças curtas como os corais de Bach. As diferenças que de fato aparecem entre versões de um coral (transposição, ornamentação melódica, alterações rítmicas e reescrita das vozes internas) são descritas pela teoria da harmonia e do contraponto, e cada uma delas tem correspondente nos mecanismos do método, assim como a distinção entre resposta real e tonal e a troca de vozes do contraponto invertível. A perspectiva perceptiva, em Narmour e Dowling, sustenta bem a tolerância à transposição, mas não à inversão e à retrogradação, que permanecem como generalidade. Nenhuma dessas perspectivas, além disso, oferece um critério objetivo e computável para decidir quando um trecho de uma versão corresponde a um trecho de outra. É essa lacuna, situada entre a fundamentação teórico-musical deste capítulo e a fundamentação computacional do Capítulo 3, que a heurística proposta neste trabalho tenta preencher.</w:t>
       </w:r>
     </w:p>
     <w:p>

</xml_diff>

<commit_message>
TCC I: versão 34 — conferência das fontes do Réti
- Seção 2.1: apud separado por edição (Réti 1951 via Peyerl e Barros;
  Réti 1978 via Almada, que cita a reimpressão da Greenwood)
- Referência da edição de 1978 incluída
- Marcação amarela: removido o "LER ANTES DA ENTREGA" (Peyerl e Barros,
  Seção 4, e Almada, nota 7, conferidos); ficam a interversão e o Frisch

Co-Authored-By: Claude Opus 5.5 <noreply@anthropic.com>
Claude-Session: https://claude.ai/code/session_01Kohu9tEnyuREmJ1YUPcZ95
</commit_message>
<xml_diff>
--- a/docs/tcc/TCC-I.docx
+++ b/docs/tcc/TCC-I.docx
@@ -4665,7 +4665,7 @@
       <w:r>
         <w:t xml:space="preserve"> (1951), leva intuição semelhante a um método analítico sistemático. Para Réti, a diversidade temática na superfície de uma obra — os diferentes temas de uma sinfonia, por exemplo — </w:t>
         <w:lastRenderedPageBreak/>
-        <w:t>esconde uma unidade motívica subjacente: os vários movimentos de uma obra derivariam, em sua leitura, de uma mesma ideia germinal, com o compositor preservando a substância dessa ideia por trás de uma aparência sempre renovada (RÉTI, 1951 apud ALMADA, 2008; PEYERL; BARROS, 2017). O repertório de transformações que Réti reconhece entre essas formas já inclui inversão e retrogradação, além de uma operação própria que chama de interversão: o reagrupamento das notas de uma célula em outra ordem (RÉTI, 1951, p. 68, 72 apud PEYERL; BARROS, 2017) — transformação que este trabalho não se propõe a tratar.</w:t>
+        <w:t>esconde uma unidade motívica subjacente: os vários movimentos de uma obra derivariam, em sua leitura, de uma mesma ideia germinal, com o compositor preservando a substância dessa ideia por trás de uma aparência sempre renovada (RÉTI, 1951 apud PEYERL; BARROS, 2017; RÉTI, 1978 apud ALMADA, 2008). O repertório de transformações que Réti reconhece entre essas formas já inclui inversão e retrogradação, além de uma operação própria que chama de interversão: o reagrupamento das notas de uma célula em outra ordem (RÉTI, 1951, p. 68, 72 apud PEYERL; BARROS, 2017) — transformação que este trabalho não se propõe a tratar.</w:t>
       </w:r>
     </w:p>
     <w:p>
@@ -4710,7 +4710,7 @@
         <w:rPr>
           <w:highlight w:val="yellow"/>
         </w:rPr>
-        <w:t>[CONFIRMAR COM COORIENTADOR: a decisão de excluir explicitamente a interversão do escopo ainda não foi validada com a orientação. LER ANTES DA ENTREGA: Peyerl e Barros (2017, Seção 4) e Almada (2008, nota 7), que sustentam os apud desta seção; se houver acesso ao Frisch (1984, p. 22-23), trocar o apud por citação direta]</w:t>
+        <w:t>[CONFIRMAR COM COORIENTADOR: a decisão de excluir explicitamente a interversão do escopo ainda não foi validada com a orientação. Se houver acesso ao Frisch (1984, p. 22-23), trocar o apud por citação direta]</w:t>
       </w:r>
     </w:p>
     <w:p>
@@ -14288,6 +14288,34 @@
           <w:lang w:val="en-US"/>
         </w:rPr>
         <w:t>. New York: Macmillan, 1951.</w:t>
+      </w:r>
+    </w:p>
+    <w:p>
+      <w:pPr>
+        <w:pStyle w:val="PT-Referencias"/>
+        <w:rPr>
+          <w:lang w:val="en-US"/>
+        </w:rPr>
+      </w:pPr>
+      <w:r>
+        <w:rPr>
+          <w:lang w:val="en-US"/>
+        </w:rPr>
+        <w:t xml:space="preserve">RÉTI, R. </w:t>
+      </w:r>
+      <w:r>
+        <w:rPr>
+          <w:b/>
+          <w:bCs/>
+          <w:lang w:val="en-US"/>
+        </w:rPr>
+        <w:t>The thematic process in music</w:t>
+      </w:r>
+      <w:r>
+        <w:rPr>
+          <w:lang w:val="en-US"/>
+        </w:rPr>
+        <w:t>. Westport: Greenwood Press, 1978.</w:t>
       </w:r>
     </w:p>
     <w:p>

</xml_diff>